<commit_message>
Added some mappings and opening passworded Excel file
</commit_message>
<xml_diff>
--- a/krolik_doswiadczalny.docx
+++ b/krolik_doswiadczalny.docx
@@ -387,16 +387,7 @@
                 <w:color w:val="FFFFFF" w:themeColor="background1"/>
                 <w:szCs w:val="20"/>
               </w:rPr>
-              <w:t>Project Developer</w:t>
-            </w:r>
-            <w:r>
-              <w:rPr>
-                <w:b/>
-                <w:bCs/>
-                <w:color w:val="FFFFFF" w:themeColor="background1"/>
-                <w:szCs w:val="20"/>
-              </w:rPr>
-              <w:t>:</w:t>
+              <w:t>Project Developer:</w:t>
             </w:r>
           </w:p>
         </w:tc>
@@ -592,8 +583,19 @@
                 <w:sz w:val="28"/>
                 <w:szCs w:val="28"/>
               </w:rPr>
-              <w:t>Project Quotation</w:t>
-            </w:r>
+              <w:t xml:space="preserve">Project </w:t>
+            </w:r>
+            <w:proofErr w:type="spellStart"/>
+            <w:r>
+              <w:rPr>
+                <w:b/>
+                <w:bCs/>
+                <w:sz w:val="28"/>
+                <w:szCs w:val="28"/>
+              </w:rPr>
+              <w:t>Quotation</w:t>
+            </w:r>
+            <w:proofErr w:type="spellEnd"/>
             <w:r>
               <w:rPr>
                 <w:b/>
@@ -627,6 +629,12 @@
           <w:tcPr>
             <w:tcW w:w="10207" w:type="dxa"/>
             <w:gridSpan w:val="3"/>
+            <w:tcBorders>
+              <w:top w:val="nil"/>
+              <w:left w:val="nil"/>
+              <w:bottom w:val="single" w:sz="4" w:space="0" w:color="auto"/>
+              <w:right w:val="nil"/>
+            </w:tcBorders>
             <w:shd w:val="clear" w:color="auto" w:fill="ADADAD" w:themeFill="background2" w:themeFillShade="BF"/>
           </w:tcPr>
           <w:p>
@@ -655,6 +663,10 @@
         <w:tc>
           <w:tcPr>
             <w:tcW w:w="3366" w:type="dxa"/>
+            <w:tcBorders>
+              <w:top w:val="single" w:sz="4" w:space="0" w:color="auto"/>
+            </w:tcBorders>
+            <w:vAlign w:val="center"/>
           </w:tcPr>
           <w:p>
             <w:pPr>
@@ -662,19 +674,21 @@
                 <w:szCs w:val="20"/>
               </w:rPr>
             </w:pPr>
-            <w:proofErr w:type="spellStart"/>
-            <w:r>
-              <w:rPr>
-                <w:szCs w:val="20"/>
-              </w:rPr>
-              <w:t>sadsadsa</w:t>
-            </w:r>
-            <w:proofErr w:type="spellEnd"/>
+            <w:r>
+              <w:rPr>
+                <w:szCs w:val="20"/>
+              </w:rPr>
+              <w:t>System:</w:t>
+            </w:r>
           </w:p>
         </w:tc>
         <w:tc>
           <w:tcPr>
             <w:tcW w:w="3221" w:type="dxa"/>
+            <w:tcBorders>
+              <w:top w:val="single" w:sz="4" w:space="0" w:color="auto"/>
+            </w:tcBorders>
+            <w:vAlign w:val="center"/>
           </w:tcPr>
           <w:p>
             <w:pPr>
@@ -682,27 +696,70 @@
                 <w:szCs w:val="20"/>
               </w:rPr>
             </w:pPr>
+            <w:proofErr w:type="spellStart"/>
+            <w:r>
+              <w:rPr>
+                <w:szCs w:val="20"/>
+              </w:rPr>
+              <w:t>Optimal</w:t>
+            </w:r>
+            <w:proofErr w:type="spellEnd"/>
+            <w:r>
+              <w:rPr>
+                <w:szCs w:val="20"/>
+              </w:rPr>
+              <w:t xml:space="preserve"> 110</w:t>
+            </w:r>
           </w:p>
         </w:tc>
         <w:tc>
           <w:tcPr>
             <w:tcW w:w="3620" w:type="dxa"/>
             <w:vMerge w:val="restart"/>
+            <w:tcBorders>
+              <w:top w:val="single" w:sz="4" w:space="0" w:color="auto"/>
+            </w:tcBorders>
+            <w:vAlign w:val="center"/>
           </w:tcPr>
           <w:p>
             <w:pPr>
+              <w:jc w:val="center"/>
               <w:rPr>
                 <w:szCs w:val="20"/>
               </w:rPr>
             </w:pPr>
-            <w:proofErr w:type="spellStart"/>
-            <w:r>
-              <w:rPr>
-                <w:szCs w:val="20"/>
-              </w:rPr>
-              <w:t>dsadsa</w:t>
-            </w:r>
-            <w:proofErr w:type="spellEnd"/>
+            <w:sdt>
+              <w:sdtPr>
+                <w:rPr>
+                  <w:rStyle w:val="Styl1"/>
+                </w:rPr>
+                <w:id w:val="1669826174"/>
+                <w:placeholder>
+                  <w:docPart w:val="C55793E1BCB24B79BD09894C7B8BED6A"/>
+                </w:placeholder>
+                <w:showingPlcHdr/>
+              </w:sdtPr>
+              <w:sdtContent>
+                <w:r>
+                  <w:rPr>
+                    <w:rStyle w:val="Tekstzastpczy"/>
+                    <w:b/>
+                    <w:bCs/>
+                  </w:rPr>
+                  <w:t>Cena ściany</w:t>
+                </w:r>
+              </w:sdtContent>
+            </w:sdt>
+            <w:r>
+              <w:t xml:space="preserve"> </w:t>
+            </w:r>
+            <w:r>
+              <w:rPr>
+                <w:b/>
+                <w:bCs/>
+              </w:rPr>
+              <w:t>EUR</w:t>
+            </w:r>
           </w:p>
         </w:tc>
       </w:tr>
@@ -713,7 +770,32 @@
         <w:tc>
           <w:tcPr>
             <w:tcW w:w="3366" w:type="dxa"/>
+            <w:vMerge w:val="restart"/>
+            <w:vAlign w:val="center"/>
           </w:tcPr>
+          <w:p>
+            <w:pPr>
+              <w:rPr>
+                <w:b/>
+                <w:bCs/>
+                <w:szCs w:val="20"/>
+              </w:rPr>
+            </w:pPr>
+            <w:proofErr w:type="spellStart"/>
+            <w:r>
+              <w:rPr>
+                <w:szCs w:val="20"/>
+              </w:rPr>
+              <w:t>Dimensions</w:t>
+            </w:r>
+            <w:proofErr w:type="spellEnd"/>
+            <w:r>
+              <w:rPr>
+                <w:szCs w:val="20"/>
+              </w:rPr>
+              <w:t xml:space="preserve">: </w:t>
+            </w:r>
+          </w:p>
           <w:p>
             <w:pPr>
               <w:rPr>
@@ -725,6 +807,7 @@
         <w:tc>
           <w:tcPr>
             <w:tcW w:w="3221" w:type="dxa"/>
+            <w:vAlign w:val="center"/>
           </w:tcPr>
           <w:p>
             <w:pPr>
@@ -732,6 +815,12 @@
                 <w:szCs w:val="20"/>
               </w:rPr>
             </w:pPr>
+            <w:r>
+              <w:t xml:space="preserve">L = </w:t>
+            </w:r>
+            <w:r>
+              <w:t>Podaj długość mm</w:t>
+            </w:r>
           </w:p>
         </w:tc>
         <w:tc>
@@ -755,6 +844,8 @@
         <w:tc>
           <w:tcPr>
             <w:tcW w:w="3366" w:type="dxa"/>
+            <w:vMerge/>
+            <w:vAlign w:val="center"/>
           </w:tcPr>
           <w:p>
             <w:pPr>
@@ -767,6 +858,7 @@
         <w:tc>
           <w:tcPr>
             <w:tcW w:w="3221" w:type="dxa"/>
+            <w:vAlign w:val="center"/>
           </w:tcPr>
           <w:p>
             <w:pPr>
@@ -774,6 +866,12 @@
                 <w:szCs w:val="20"/>
               </w:rPr>
             </w:pPr>
+            <w:r>
+              <w:t xml:space="preserve">H = </w:t>
+            </w:r>
+            <w:r>
+              <w:t>Podaj wysokość mm</w:t>
+            </w:r>
           </w:p>
         </w:tc>
         <w:tc>
@@ -797,6 +895,7 @@
         <w:tc>
           <w:tcPr>
             <w:tcW w:w="3366" w:type="dxa"/>
+            <w:vAlign w:val="center"/>
           </w:tcPr>
           <w:p>
             <w:pPr>
@@ -804,11 +903,32 @@
                 <w:szCs w:val="20"/>
               </w:rPr>
             </w:pPr>
+            <w:r>
+              <w:rPr>
+                <w:szCs w:val="20"/>
+              </w:rPr>
+              <w:t xml:space="preserve">Parking / Suspension </w:t>
+            </w:r>
+            <w:proofErr w:type="spellStart"/>
+            <w:r>
+              <w:rPr>
+                <w:szCs w:val="20"/>
+              </w:rPr>
+              <w:t>type</w:t>
+            </w:r>
+            <w:proofErr w:type="spellEnd"/>
+            <w:r>
+              <w:rPr>
+                <w:szCs w:val="20"/>
+              </w:rPr>
+              <w:t>:</w:t>
+            </w:r>
           </w:p>
         </w:tc>
         <w:tc>
           <w:tcPr>
             <w:tcW w:w="3221" w:type="dxa"/>
+            <w:vAlign w:val="center"/>
           </w:tcPr>
           <w:p>
             <w:pPr>
@@ -816,6 +936,20 @@
                 <w:szCs w:val="20"/>
               </w:rPr>
             </w:pPr>
+            <w:r>
+              <w:rPr>
+                <w:szCs w:val="20"/>
+              </w:rPr>
+              <w:t xml:space="preserve">Kac </w:t>
+            </w:r>
+            <w:proofErr w:type="spellStart"/>
+            <w:r>
+              <w:rPr>
+                <w:szCs w:val="20"/>
+              </w:rPr>
+              <w:t>bałagane</w:t>
+            </w:r>
+            <w:proofErr w:type="spellEnd"/>
           </w:p>
         </w:tc>
         <w:tc>
@@ -839,6 +973,7 @@
         <w:tc>
           <w:tcPr>
             <w:tcW w:w="3366" w:type="dxa"/>
+            <w:vAlign w:val="center"/>
           </w:tcPr>
           <w:p>
             <w:pPr>
@@ -846,11 +981,54 @@
                 <w:szCs w:val="20"/>
               </w:rPr>
             </w:pPr>
+            <w:proofErr w:type="spellStart"/>
+            <w:r>
+              <w:rPr>
+                <w:szCs w:val="20"/>
+              </w:rPr>
+              <w:t>Sugested</w:t>
+            </w:r>
+            <w:proofErr w:type="spellEnd"/>
+            <w:r>
+              <w:rPr>
+                <w:szCs w:val="20"/>
+              </w:rPr>
+              <w:t xml:space="preserve"> </w:t>
+            </w:r>
+            <w:proofErr w:type="spellStart"/>
+            <w:r>
+              <w:rPr>
+                <w:szCs w:val="20"/>
+              </w:rPr>
+              <w:t>number</w:t>
+            </w:r>
+            <w:proofErr w:type="spellEnd"/>
+            <w:r>
+              <w:rPr>
+                <w:szCs w:val="20"/>
+              </w:rPr>
+              <w:t xml:space="preserve"> of </w:t>
+            </w:r>
+            <w:proofErr w:type="spellStart"/>
+            <w:r>
+              <w:rPr>
+                <w:szCs w:val="20"/>
+              </w:rPr>
+              <w:t>modules</w:t>
+            </w:r>
+            <w:proofErr w:type="spellEnd"/>
+            <w:r>
+              <w:rPr>
+                <w:szCs w:val="20"/>
+              </w:rPr>
+              <w:t>:</w:t>
+            </w:r>
           </w:p>
         </w:tc>
         <w:tc>
           <w:tcPr>
             <w:tcW w:w="3221" w:type="dxa"/>
+            <w:vAlign w:val="center"/>
           </w:tcPr>
           <w:p>
             <w:pPr>
@@ -858,14 +1036,12 @@
                 <w:szCs w:val="20"/>
               </w:rPr>
             </w:pPr>
-            <w:proofErr w:type="spellStart"/>
-            <w:r>
-              <w:rPr>
-                <w:szCs w:val="20"/>
-              </w:rPr>
-              <w:t>saddasdas</w:t>
-            </w:r>
-            <w:proofErr w:type="spellEnd"/>
+            <w:r>
+              <w:rPr>
+                <w:szCs w:val="20"/>
+              </w:rPr>
+              <w:t>Liczba modułów</w:t>
+            </w:r>
           </w:p>
         </w:tc>
         <w:tc>
@@ -889,18 +1065,28 @@
         <w:tc>
           <w:tcPr>
             <w:tcW w:w="3366" w:type="dxa"/>
+            <w:vAlign w:val="center"/>
           </w:tcPr>
           <w:p>
             <w:pPr>
               <w:rPr>
                 <w:szCs w:val="20"/>
+                <w:lang w:val="en-US"/>
               </w:rPr>
             </w:pPr>
+            <w:r>
+              <w:rPr>
+                <w:szCs w:val="20"/>
+                <w:lang w:val="en-GB"/>
+              </w:rPr>
+              <w:t xml:space="preserve">Acoustic value (Certified by BRI): </w:t>
+            </w:r>
           </w:p>
         </w:tc>
         <w:tc>
           <w:tcPr>
             <w:tcW w:w="3221" w:type="dxa"/>
+            <w:vAlign w:val="center"/>
           </w:tcPr>
           <w:p>
             <w:pPr>
@@ -908,6 +1094,45 @@
                 <w:szCs w:val="20"/>
               </w:rPr>
             </w:pPr>
+            <w:proofErr w:type="spellStart"/>
+            <w:r>
+              <w:t>Rw</w:t>
+            </w:r>
+            <w:proofErr w:type="spellEnd"/>
+            <w:r>
+              <w:t xml:space="preserve"> = </w:t>
+            </w:r>
+            <w:sdt>
+              <w:sdtPr>
+                <w:id w:val="-1784109588"/>
+                <w:placeholder>
+                  <w:docPart w:val="3F2149EBADA941C6BDC333BAFD2F845B"/>
+                </w:placeholder>
+                <w:comboBox>
+                  <w:listItem w:displayText="-" w:value="-"/>
+                  <w:listItem w:displayText="45" w:value="45"/>
+                  <w:listItem w:displayText="49" w:value="49"/>
+                  <w:listItem w:displayText="51" w:value="51"/>
+                  <w:listItem w:displayText="52" w:value="52"/>
+                  <w:listItem w:displayText="53" w:value="53"/>
+                  <w:listItem w:displayText="54" w:value="54"/>
+                  <w:listItem w:displayText="57" w:value="57"/>
+                </w:comboBox>
+              </w:sdtPr>
+              <w:sdtContent>
+                <w:r>
+                  <w:t>45</w:t>
+                </w:r>
+              </w:sdtContent>
+            </w:sdt>
+            <w:r>
+              <w:t xml:space="preserve"> </w:t>
+            </w:r>
+            <w:proofErr w:type="spellStart"/>
+            <w:r>
+              <w:t>dB</w:t>
+            </w:r>
+            <w:proofErr w:type="spellEnd"/>
           </w:p>
         </w:tc>
         <w:tc>
@@ -931,6 +1156,7 @@
         <w:tc>
           <w:tcPr>
             <w:tcW w:w="3366" w:type="dxa"/>
+            <w:vAlign w:val="center"/>
           </w:tcPr>
           <w:p>
             <w:pPr>
@@ -938,18 +1164,55 @@
                 <w:szCs w:val="20"/>
               </w:rPr>
             </w:pPr>
+            <w:proofErr w:type="spellStart"/>
+            <w:r>
+              <w:rPr>
+                <w:szCs w:val="20"/>
+              </w:rPr>
+              <w:t>Covered</w:t>
+            </w:r>
+            <w:proofErr w:type="spellEnd"/>
+            <w:r>
+              <w:rPr>
+                <w:szCs w:val="20"/>
+              </w:rPr>
+              <w:t xml:space="preserve"> with</w:t>
+            </w:r>
+            <w:r>
+              <w:rPr>
+                <w:szCs w:val="20"/>
+              </w:rPr>
+              <w:t xml:space="preserve">: </w:t>
+            </w:r>
           </w:p>
         </w:tc>
         <w:tc>
           <w:tcPr>
             <w:tcW w:w="3221" w:type="dxa"/>
+            <w:vAlign w:val="center"/>
           </w:tcPr>
           <w:p>
             <w:pPr>
               <w:rPr>
                 <w:szCs w:val="20"/>
+                <w:lang w:val="en-US"/>
               </w:rPr>
             </w:pPr>
+            <w:r>
+              <w:rPr>
+                <w:szCs w:val="20"/>
+                <w:lang w:val="en-US"/>
+              </w:rPr>
+              <w:t>p</w:t>
+            </w:r>
+            <w:proofErr w:type="spellStart"/>
+            <w:r>
+              <w:rPr>
+                <w:szCs w:val="20"/>
+              </w:rPr>
+              <w:t>yta</w:t>
+            </w:r>
+            <w:proofErr w:type="spellEnd"/>
           </w:p>
         </w:tc>
         <w:tc>
@@ -961,6 +1224,7 @@
             <w:pPr>
               <w:rPr>
                 <w:szCs w:val="20"/>
+                <w:lang w:val="en-US"/>
               </w:rPr>
             </w:pPr>
           </w:p>
@@ -973,6 +1237,7 @@
         <w:tc>
           <w:tcPr>
             <w:tcW w:w="3366" w:type="dxa"/>
+            <w:vAlign w:val="center"/>
           </w:tcPr>
           <w:p>
             <w:pPr>
@@ -980,20 +1245,59 @@
                 <w:szCs w:val="20"/>
               </w:rPr>
             </w:pPr>
+            <w:proofErr w:type="spellStart"/>
+            <w:r>
+              <w:rPr>
+                <w:szCs w:val="20"/>
+              </w:rPr>
+              <w:t>Operation</w:t>
+            </w:r>
+            <w:proofErr w:type="spellEnd"/>
+            <w:r>
+              <w:rPr>
+                <w:szCs w:val="20"/>
+              </w:rPr>
+              <w:t>:</w:t>
+            </w:r>
           </w:p>
         </w:tc>
-        <w:tc>
-          <w:tcPr>
-            <w:tcW w:w="3221" w:type="dxa"/>
-          </w:tcPr>
-          <w:p>
-            <w:pPr>
-              <w:rPr>
-                <w:szCs w:val="20"/>
-              </w:rPr>
-            </w:pPr>
-          </w:p>
-        </w:tc>
+        <w:sdt>
+          <w:sdtPr>
+            <w:rPr>
+              <w:rStyle w:val="Styl2"/>
+            </w:rPr>
+            <w:id w:val="1044867502"/>
+            <w:placeholder>
+              <w:docPart w:val="F4B29857C5354EA8894BAB27E69CC9F5"/>
+            </w:placeholder>
+            <w:comboBox>
+              <w:listItem w:displayText="-" w:value="-"/>
+              <w:listItem w:displayText="manual" w:value="manual"/>
+              <w:listItem w:displayText="semi-automatic" w:value="semi-automatic"/>
+            </w:comboBox>
+          </w:sdtPr>
+          <w:sdtContent>
+            <w:tc>
+              <w:tcPr>
+                <w:tcW w:w="3221" w:type="dxa"/>
+                <w:vAlign w:val="center"/>
+              </w:tcPr>
+              <w:p>
+                <w:pPr>
+                  <w:rPr>
+                    <w:szCs w:val="20"/>
+                  </w:rPr>
+                </w:pPr>
+                <w:r>
+                  <w:rPr>
+                    <w:rStyle w:val="Styl2"/>
+                  </w:rPr>
+                  <w:t>-</w:t>
+                </w:r>
+              </w:p>
+            </w:tc>
+          </w:sdtContent>
+        </w:sdt>
         <w:tc>
           <w:tcPr>
             <w:tcW w:w="3620" w:type="dxa"/>
@@ -1015,6 +1319,7 @@
         <w:tc>
           <w:tcPr>
             <w:tcW w:w="3366" w:type="dxa"/>
+            <w:vAlign w:val="center"/>
           </w:tcPr>
           <w:p>
             <w:pPr>
@@ -1022,20 +1327,60 @@
                 <w:szCs w:val="20"/>
               </w:rPr>
             </w:pPr>
+            <w:proofErr w:type="spellStart"/>
+            <w:r>
+              <w:rPr>
+                <w:szCs w:val="20"/>
+              </w:rPr>
+              <w:t>Rail</w:t>
+            </w:r>
+            <w:proofErr w:type="spellEnd"/>
+            <w:r>
+              <w:rPr>
+                <w:szCs w:val="20"/>
+              </w:rPr>
+              <w:t xml:space="preserve">: </w:t>
+            </w:r>
           </w:p>
         </w:tc>
-        <w:tc>
-          <w:tcPr>
-            <w:tcW w:w="3221" w:type="dxa"/>
-          </w:tcPr>
-          <w:p>
-            <w:pPr>
-              <w:rPr>
-                <w:szCs w:val="20"/>
-              </w:rPr>
-            </w:pPr>
-          </w:p>
-        </w:tc>
+        <w:sdt>
+          <w:sdtPr>
+            <w:rPr>
+              <w:rStyle w:val="Styl2"/>
+            </w:rPr>
+            <w:id w:val="950593397"/>
+            <w:placeholder>
+              <w:docPart w:val="DA95DA6521174184BCFCE178C5D1DF39"/>
+            </w:placeholder>
+            <w:comboBox>
+              <w:listItem w:displayText="-" w:value="-"/>
+              <w:listItem w:displayText="RAW" w:value="RAW"/>
+              <w:listItem w:displayText="Standard RAL 9010" w:value="Standard RAL 9010"/>
+              <w:listItem w:displayText="Other RAL " w:value="Other RAL "/>
+            </w:comboBox>
+          </w:sdtPr>
+          <w:sdtContent>
+            <w:tc>
+              <w:tcPr>
+                <w:tcW w:w="3221" w:type="dxa"/>
+                <w:vAlign w:val="center"/>
+              </w:tcPr>
+              <w:p>
+                <w:pPr>
+                  <w:rPr>
+                    <w:szCs w:val="20"/>
+                  </w:rPr>
+                </w:pPr>
+                <w:r>
+                  <w:rPr>
+                    <w:rStyle w:val="Styl2"/>
+                  </w:rPr>
+                  <w:t>-</w:t>
+                </w:r>
+              </w:p>
+            </w:tc>
+          </w:sdtContent>
+        </w:sdt>
         <w:tc>
           <w:tcPr>
             <w:tcW w:w="3620" w:type="dxa"/>
@@ -1057,6 +1402,7 @@
         <w:tc>
           <w:tcPr>
             <w:tcW w:w="3366" w:type="dxa"/>
+            <w:vAlign w:val="center"/>
           </w:tcPr>
           <w:p>
             <w:pPr>
@@ -1064,20 +1410,60 @@
                 <w:szCs w:val="20"/>
               </w:rPr>
             </w:pPr>
+            <w:proofErr w:type="spellStart"/>
+            <w:r>
+              <w:rPr>
+                <w:szCs w:val="20"/>
+              </w:rPr>
+              <w:t>Doors</w:t>
+            </w:r>
+            <w:proofErr w:type="spellEnd"/>
+            <w:r>
+              <w:rPr>
+                <w:szCs w:val="20"/>
+              </w:rPr>
+              <w:t xml:space="preserve">: </w:t>
+            </w:r>
           </w:p>
         </w:tc>
-        <w:tc>
-          <w:tcPr>
-            <w:tcW w:w="3221" w:type="dxa"/>
-          </w:tcPr>
-          <w:p>
-            <w:pPr>
-              <w:rPr>
-                <w:szCs w:val="20"/>
-              </w:rPr>
-            </w:pPr>
-          </w:p>
-        </w:tc>
+        <w:sdt>
+          <w:sdtPr>
+            <w:rPr>
+              <w:rStyle w:val="Styl2"/>
+            </w:rPr>
+            <w:id w:val="-347324769"/>
+            <w:placeholder>
+              <w:docPart w:val="5A34E62CCE5F4B45A913930961FE8EAD"/>
+            </w:placeholder>
+            <w:comboBox>
+              <w:listItem w:displayText="-" w:value="-"/>
+              <w:listItem w:displayText="Without door " w:value="Without door "/>
+              <w:listItem w:displayText="Single door " w:value="Single door "/>
+              <w:listItem w:displayText="Double door" w:value="Double door"/>
+            </w:comboBox>
+          </w:sdtPr>
+          <w:sdtContent>
+            <w:tc>
+              <w:tcPr>
+                <w:tcW w:w="3221" w:type="dxa"/>
+                <w:vAlign w:val="center"/>
+              </w:tcPr>
+              <w:p>
+                <w:pPr>
+                  <w:rPr>
+                    <w:szCs w:val="20"/>
+                  </w:rPr>
+                </w:pPr>
+                <w:r>
+                  <w:rPr>
+                    <w:rStyle w:val="Styl2"/>
+                  </w:rPr>
+                  <w:t>-</w:t>
+                </w:r>
+              </w:p>
+            </w:tc>
+          </w:sdtContent>
+        </w:sdt>
         <w:tc>
           <w:tcPr>
             <w:tcW w:w="3620" w:type="dxa"/>
@@ -1099,6 +1485,7 @@
         <w:tc>
           <w:tcPr>
             <w:tcW w:w="3366" w:type="dxa"/>
+            <w:vAlign w:val="center"/>
           </w:tcPr>
           <w:p>
             <w:pPr>
@@ -1106,20 +1493,68 @@
                 <w:szCs w:val="20"/>
               </w:rPr>
             </w:pPr>
+            <w:r>
+              <w:rPr>
+                <w:szCs w:val="20"/>
+              </w:rPr>
+              <w:t xml:space="preserve">Glass </w:t>
+            </w:r>
+            <w:proofErr w:type="spellStart"/>
+            <w:r>
+              <w:rPr>
+                <w:szCs w:val="20"/>
+              </w:rPr>
+              <w:t>Modules</w:t>
+            </w:r>
+            <w:proofErr w:type="spellEnd"/>
+            <w:r>
+              <w:rPr>
+                <w:szCs w:val="20"/>
+              </w:rPr>
+              <w:t xml:space="preserve">: </w:t>
+            </w:r>
           </w:p>
         </w:tc>
-        <w:tc>
-          <w:tcPr>
-            <w:tcW w:w="3221" w:type="dxa"/>
-          </w:tcPr>
-          <w:p>
-            <w:pPr>
-              <w:rPr>
-                <w:szCs w:val="20"/>
-              </w:rPr>
-            </w:pPr>
-          </w:p>
-        </w:tc>
+        <w:sdt>
+          <w:sdtPr>
+            <w:rPr>
+              <w:rStyle w:val="Styl2"/>
+            </w:rPr>
+            <w:id w:val="1874648713"/>
+            <w:placeholder>
+              <w:docPart w:val="277E24F56C164BF7B3D10C15D89AEBD0"/>
+            </w:placeholder>
+            <w:comboBox>
+              <w:listItem w:displayText="-" w:value="-"/>
+              <w:listItem w:displayText="Surface glass 8mm ESG (toughened)" w:value="Surface glass 8mm ESG (toughened)"/>
+              <w:listItem w:displayText="Internal glass 44.2mm VSG (laminated)" w:value="Internal glass 44.2mm VSG (laminated)"/>
+              <w:listItem w:displayText="OPT 50 33.1 VSG" w:value="OPT 50 33.1 VSG"/>
+              <w:listItem w:displayText="OPT 50 44.1 VSG" w:value="OPT 50 44.1 VSG"/>
+              <w:listItem w:displayText="Without glass - sourced locally " w:value="Without glass - sourced locally "/>
+            </w:comboBox>
+          </w:sdtPr>
+          <w:sdtContent>
+            <w:tc>
+              <w:tcPr>
+                <w:tcW w:w="3221" w:type="dxa"/>
+                <w:vAlign w:val="center"/>
+              </w:tcPr>
+              <w:p>
+                <w:pPr>
+                  <w:rPr>
+                    <w:szCs w:val="20"/>
+                  </w:rPr>
+                </w:pPr>
+                <w:r>
+                  <w:rPr>
+                    <w:rStyle w:val="Styl2"/>
+                  </w:rPr>
+                  <w:t>-</w:t>
+                </w:r>
+              </w:p>
+            </w:tc>
+          </w:sdtContent>
+        </w:sdt>
         <w:tc>
           <w:tcPr>
             <w:tcW w:w="3620" w:type="dxa"/>
@@ -1141,6 +1576,7 @@
         <w:tc>
           <w:tcPr>
             <w:tcW w:w="3366" w:type="dxa"/>
+            <w:vAlign w:val="center"/>
           </w:tcPr>
           <w:p>
             <w:pPr>
@@ -1148,11 +1584,69 @@
                 <w:szCs w:val="20"/>
               </w:rPr>
             </w:pPr>
+            <w:proofErr w:type="spellStart"/>
+            <w:r>
+              <w:rPr>
+                <w:szCs w:val="20"/>
+              </w:rPr>
+              <w:t>Profile</w:t>
+            </w:r>
+            <w:r>
+              <w:rPr>
+                <w:szCs w:val="20"/>
+              </w:rPr>
+              <w:t>s</w:t>
+            </w:r>
+            <w:proofErr w:type="spellEnd"/>
+            <w:r>
+              <w:rPr>
+                <w:szCs w:val="20"/>
+              </w:rPr>
+              <w:t xml:space="preserve">: </w:t>
+            </w:r>
           </w:p>
         </w:tc>
         <w:tc>
           <w:tcPr>
             <w:tcW w:w="3221" w:type="dxa"/>
+            <w:vAlign w:val="center"/>
+          </w:tcPr>
+          <w:sdt>
+            <w:sdtPr>
+              <w:rPr>
+                <w:rStyle w:val="Styl2"/>
+              </w:rPr>
+              <w:id w:val="-604806855"/>
+              <w:placeholder>
+                <w:docPart w:val="5A54BE8B02124928B26C6A77DCDDC861"/>
+              </w:placeholder>
+              <w:comboBox>
+                <w:listItem w:displayText="-" w:value="-"/>
+                <w:listItem w:displayText="anodised" w:value="anodised"/>
+                <w:listItem w:displayText="Powder coated RAL" w:value="Powder coated RAL"/>
+              </w:comboBox>
+            </w:sdtPr>
+            <w:sdtContent>
+              <w:p>
+                <w:pPr>
+                  <w:rPr>
+                    <w:szCs w:val="20"/>
+                  </w:rPr>
+                </w:pPr>
+                <w:r>
+                  <w:rPr>
+                    <w:rStyle w:val="Styl2"/>
+                  </w:rPr>
+                  <w:t>-</w:t>
+                </w:r>
+              </w:p>
+            </w:sdtContent>
+          </w:sdt>
+        </w:tc>
+        <w:tc>
+          <w:tcPr>
+            <w:tcW w:w="3620" w:type="dxa"/>
+            <w:vMerge/>
           </w:tcPr>
           <w:p>
             <w:pPr>
@@ -1161,6 +1655,93 @@
               </w:rPr>
             </w:pPr>
           </w:p>
+        </w:tc>
+      </w:tr>
+      <w:tr>
+        <w:trPr>
+          <w:trHeight w:val="301"/>
+        </w:trPr>
+        <w:tc>
+          <w:tcPr>
+            <w:tcW w:w="3366" w:type="dxa"/>
+            <w:vAlign w:val="center"/>
+          </w:tcPr>
+          <w:p>
+            <w:pPr>
+              <w:rPr>
+                <w:szCs w:val="20"/>
+              </w:rPr>
+            </w:pPr>
+            <w:proofErr w:type="spellStart"/>
+            <w:r>
+              <w:rPr>
+                <w:szCs w:val="20"/>
+              </w:rPr>
+              <w:t>Additional</w:t>
+            </w:r>
+            <w:proofErr w:type="spellEnd"/>
+            <w:r>
+              <w:rPr>
+                <w:szCs w:val="20"/>
+              </w:rPr>
+              <w:t xml:space="preserve"> </w:t>
+            </w:r>
+            <w:proofErr w:type="spellStart"/>
+            <w:r>
+              <w:rPr>
+                <w:szCs w:val="20"/>
+              </w:rPr>
+              <w:t>Equipment</w:t>
+            </w:r>
+            <w:proofErr w:type="spellEnd"/>
+            <w:r>
+              <w:rPr>
+                <w:szCs w:val="20"/>
+              </w:rPr>
+              <w:t>:</w:t>
+            </w:r>
+          </w:p>
+        </w:tc>
+        <w:tc>
+          <w:tcPr>
+            <w:tcW w:w="3221" w:type="dxa"/>
+            <w:vAlign w:val="center"/>
+          </w:tcPr>
+          <w:sdt>
+            <w:sdtPr>
+              <w:rPr>
+                <w:rStyle w:val="Styl2"/>
+              </w:rPr>
+              <w:id w:val="-792675943"/>
+              <w:placeholder>
+                <w:docPart w:val="68939F3796D4429F9F2A44DAF480F1C0"/>
+              </w:placeholder>
+              <w:comboBox>
+                <w:listItem w:displayText="-" w:value="-"/>
+                <w:listItem w:displayText="anti-panic push bar (single door)" w:value="anti-panic push bar (single door)"/>
+                <w:listItem w:displayText="anti-panic push bar (double door)" w:value="anti-panic push bar (double door)"/>
+                <w:listItem w:displayText="Steel suspension " w:value="Steel suspension "/>
+                <w:listItem w:displayText="Concealed profiles" w:value="Concealed profiles"/>
+                <w:listItem w:displayText="No additional equipment needed" w:value="No additional equipment needed"/>
+              </w:comboBox>
+            </w:sdtPr>
+            <w:sdtContent>
+              <w:p>
+                <w:pPr>
+                  <w:rPr>
+                    <w:rStyle w:val="Styl2"/>
+                  </w:rPr>
+                </w:pPr>
+                <w:r>
+                  <w:rPr>
+                    <w:rStyle w:val="Styl2"/>
+                  </w:rPr>
+                  <w:t>-</w:t>
+                </w:r>
+              </w:p>
+            </w:sdtContent>
+          </w:sdt>
+          <w:p/>
         </w:tc>
         <w:tc>
           <w:tcPr>
@@ -2496,6 +3077,262 @@
         </w:p>
       </w:docPartBody>
     </w:docPart>
+    <w:docPart>
+      <w:docPartPr>
+        <w:name w:val="3F2149EBADA941C6BDC333BAFD2F845B"/>
+        <w:category>
+          <w:name w:val="Ogólne"/>
+          <w:gallery w:val="placeholder"/>
+        </w:category>
+        <w:types>
+          <w:type w:val="bbPlcHdr"/>
+        </w:types>
+        <w:behaviors>
+          <w:behavior w:val="content"/>
+        </w:behaviors>
+        <w:guid w:val="{03EF95E9-CCA7-464A-B9A4-A49D1DECA098}"/>
+      </w:docPartPr>
+      <w:docPartBody>
+        <w:p>
+          <w:pPr>
+            <w:pStyle w:val="3F2149EBADA941C6BDC333BAFD2F845B"/>
+          </w:pPr>
+          <w:r>
+            <w:rPr>
+              <w:rStyle w:val="Tekstzastpczy"/>
+            </w:rPr>
+            <w:t xml:space="preserve">Wybierz </w:t>
+          </w:r>
+          <w:r>
+            <w:rPr>
+              <w:rStyle w:val="Tekstzastpczy"/>
+            </w:rPr>
+            <w:t>akustykę</w:t>
+          </w:r>
+        </w:p>
+      </w:docPartBody>
+    </w:docPart>
+    <w:docPart>
+      <w:docPartPr>
+        <w:name w:val="F4B29857C5354EA8894BAB27E69CC9F5"/>
+        <w:category>
+          <w:name w:val="Ogólne"/>
+          <w:gallery w:val="placeholder"/>
+        </w:category>
+        <w:types>
+          <w:type w:val="bbPlcHdr"/>
+        </w:types>
+        <w:behaviors>
+          <w:behavior w:val="content"/>
+        </w:behaviors>
+        <w:guid w:val="{47017E49-1E03-459C-8C70-1E951B60A56E}"/>
+      </w:docPartPr>
+      <w:docPartBody>
+        <w:p>
+          <w:pPr>
+            <w:pStyle w:val="F4B29857C5354EA8894BAB27E69CC9F5"/>
+          </w:pPr>
+          <w:r>
+            <w:rPr>
+              <w:rStyle w:val="Tekstzastpczy"/>
+            </w:rPr>
+            <w:t xml:space="preserve">Wybierz </w:t>
+          </w:r>
+          <w:r>
+            <w:rPr>
+              <w:rStyle w:val="Tekstzastpczy"/>
+            </w:rPr>
+            <w:t>obsługę</w:t>
+          </w:r>
+        </w:p>
+      </w:docPartBody>
+    </w:docPart>
+    <w:docPart>
+      <w:docPartPr>
+        <w:name w:val="DA95DA6521174184BCFCE178C5D1DF39"/>
+        <w:category>
+          <w:name w:val="Ogólne"/>
+          <w:gallery w:val="placeholder"/>
+        </w:category>
+        <w:types>
+          <w:type w:val="bbPlcHdr"/>
+        </w:types>
+        <w:behaviors>
+          <w:behavior w:val="content"/>
+        </w:behaviors>
+        <w:guid w:val="{7AE2EF54-764E-48CB-8F87-5CEA2CCA2F8B}"/>
+      </w:docPartPr>
+      <w:docPartBody>
+        <w:p>
+          <w:pPr>
+            <w:pStyle w:val="DA95DA6521174184BCFCE178C5D1DF39"/>
+          </w:pPr>
+          <w:r>
+            <w:rPr>
+              <w:rStyle w:val="Tekstzastpczy"/>
+            </w:rPr>
+            <w:t xml:space="preserve">Wybierz </w:t>
+          </w:r>
+          <w:r>
+            <w:rPr>
+              <w:rStyle w:val="Tekstzastpczy"/>
+            </w:rPr>
+            <w:t>kolor toru</w:t>
+          </w:r>
+        </w:p>
+      </w:docPartBody>
+    </w:docPart>
+    <w:docPart>
+      <w:docPartPr>
+        <w:name w:val="5A34E62CCE5F4B45A913930961FE8EAD"/>
+        <w:category>
+          <w:name w:val="Ogólne"/>
+          <w:gallery w:val="placeholder"/>
+        </w:category>
+        <w:types>
+          <w:type w:val="bbPlcHdr"/>
+        </w:types>
+        <w:behaviors>
+          <w:behavior w:val="content"/>
+        </w:behaviors>
+        <w:guid w:val="{7DC601AC-7C56-402E-B350-31E665BDB4C3}"/>
+      </w:docPartPr>
+      <w:docPartBody>
+        <w:p>
+          <w:pPr>
+            <w:pStyle w:val="5A34E62CCE5F4B45A913930961FE8EAD"/>
+          </w:pPr>
+          <w:r>
+            <w:rPr>
+              <w:rStyle w:val="Tekstzastpczy"/>
+            </w:rPr>
+            <w:t>Wybierz rodzaj drzwi</w:t>
+          </w:r>
+        </w:p>
+      </w:docPartBody>
+    </w:docPart>
+    <w:docPart>
+      <w:docPartPr>
+        <w:name w:val="277E24F56C164BF7B3D10C15D89AEBD0"/>
+        <w:category>
+          <w:name w:val="Ogólne"/>
+          <w:gallery w:val="placeholder"/>
+        </w:category>
+        <w:types>
+          <w:type w:val="bbPlcHdr"/>
+        </w:types>
+        <w:behaviors>
+          <w:behavior w:val="content"/>
+        </w:behaviors>
+        <w:guid w:val="{08971CE2-4A3E-4A84-8262-DECFF0648AAF}"/>
+      </w:docPartPr>
+      <w:docPartBody>
+        <w:p>
+          <w:pPr>
+            <w:pStyle w:val="277E24F56C164BF7B3D10C15D89AEBD0"/>
+          </w:pPr>
+          <w:r>
+            <w:rPr>
+              <w:rStyle w:val="Tekstzastpczy"/>
+            </w:rPr>
+            <w:t>Wybierz rodzaj drzwi</w:t>
+          </w:r>
+        </w:p>
+      </w:docPartBody>
+    </w:docPart>
+    <w:docPart>
+      <w:docPartPr>
+        <w:name w:val="5A54BE8B02124928B26C6A77DCDDC861"/>
+        <w:category>
+          <w:name w:val="Ogólne"/>
+          <w:gallery w:val="placeholder"/>
+        </w:category>
+        <w:types>
+          <w:type w:val="bbPlcHdr"/>
+        </w:types>
+        <w:behaviors>
+          <w:behavior w:val="content"/>
+        </w:behaviors>
+        <w:guid w:val="{6341D1B6-7333-4FB1-A326-349867B22EDF}"/>
+      </w:docPartPr>
+      <w:docPartBody>
+        <w:p>
+          <w:pPr>
+            <w:pStyle w:val="5A54BE8B02124928B26C6A77DCDDC861"/>
+          </w:pPr>
+          <w:r>
+            <w:rPr>
+              <w:rStyle w:val="Tekstzastpczy"/>
+            </w:rPr>
+            <w:t>Wy</w:t>
+          </w:r>
+          <w:r>
+            <w:rPr>
+              <w:rStyle w:val="Tekstzastpczy"/>
+            </w:rPr>
+            <w:t>bierz kolor profili</w:t>
+          </w:r>
+        </w:p>
+      </w:docPartBody>
+    </w:docPart>
+    <w:docPart>
+      <w:docPartPr>
+        <w:name w:val="68939F3796D4429F9F2A44DAF480F1C0"/>
+        <w:category>
+          <w:name w:val="Ogólne"/>
+          <w:gallery w:val="placeholder"/>
+        </w:category>
+        <w:types>
+          <w:type w:val="bbPlcHdr"/>
+        </w:types>
+        <w:behaviors>
+          <w:behavior w:val="content"/>
+        </w:behaviors>
+        <w:guid w:val="{24647C66-8A9E-446C-8AD8-7497B8146F68}"/>
+      </w:docPartPr>
+      <w:docPartBody>
+        <w:p>
+          <w:pPr>
+            <w:pStyle w:val="68939F3796D4429F9F2A44DAF480F1C0"/>
+          </w:pPr>
+          <w:r>
+            <w:rPr>
+              <w:rStyle w:val="Styl2"/>
+            </w:rPr>
+            <w:t>Dodatkowe akcesoria</w:t>
+          </w:r>
+        </w:p>
+      </w:docPartBody>
+    </w:docPart>
+    <w:docPart>
+      <w:docPartPr>
+        <w:name w:val="C55793E1BCB24B79BD09894C7B8BED6A"/>
+        <w:category>
+          <w:name w:val="Ogólne"/>
+          <w:gallery w:val="placeholder"/>
+        </w:category>
+        <w:types>
+          <w:type w:val="bbPlcHdr"/>
+        </w:types>
+        <w:behaviors>
+          <w:behavior w:val="content"/>
+        </w:behaviors>
+        <w:guid w:val="{0A7845F1-4654-4D80-81D4-A6A3D464A911}"/>
+      </w:docPartPr>
+      <w:docPartBody>
+        <w:p>
+          <w:pPr>
+            <w:pStyle w:val="C55793E1BCB24B79BD09894C7B8BED6A"/>
+          </w:pPr>
+          <w:r>
+            <w:rPr>
+              <w:rStyle w:val="Tekstzastpczy"/>
+            </w:rPr>
+            <w:t>Cena ściany</w:t>
+          </w:r>
+        </w:p>
+      </w:docPartBody>
+    </w:docPart>
   </w:docParts>
 </w:glossaryDocument>
 </file>
@@ -2536,7 +3373,7 @@
   </w:font>
   <w:font w:name="Tahoma">
     <w:panose1 w:val="020B0604030504040204"/>
-    <w:charset w:val="00"/>
+    <w:charset w:val="EE"/>
     <w:family w:val="swiss"/>
     <w:pitch w:val="variable"/>
     <w:sig w:usb0="E1002EFF" w:usb1="C000605B" w:usb2="00000029" w:usb3="00000000" w:csb0="000101FF" w:csb1="00000000"/>
@@ -2568,14 +3405,28 @@
   </w:compat>
   <w:rsids>
     <w:rsidRoot w:val="004B629E"/>
+    <w:rsid w:val="00311124"/>
+    <w:rsid w:val="00371491"/>
+    <w:rsid w:val="00374A1F"/>
     <w:rsid w:val="00377AB0"/>
     <w:rsid w:val="004B629E"/>
     <w:rsid w:val="00650F49"/>
+    <w:rsid w:val="00705174"/>
+    <w:rsid w:val="00753D23"/>
     <w:rsid w:val="007B2028"/>
+    <w:rsid w:val="007F3F19"/>
+    <w:rsid w:val="00816FCC"/>
+    <w:rsid w:val="00924ABD"/>
+    <w:rsid w:val="0093601B"/>
+    <w:rsid w:val="00964355"/>
     <w:rsid w:val="00AD7DCB"/>
+    <w:rsid w:val="00C545F0"/>
+    <w:rsid w:val="00C84558"/>
     <w:rsid w:val="00C976A1"/>
     <w:rsid w:val="00CF03DA"/>
+    <w:rsid w:val="00DC092A"/>
     <w:rsid w:val="00E81563"/>
+    <w:rsid w:val="00F82133"/>
   </w:rsids>
   <m:mathPr>
     <m:mathFont m:val="Cambria Math"/>
@@ -3031,148 +3882,56 @@
     <w:basedOn w:val="Domylnaczcionkaakapitu"/>
     <w:uiPriority w:val="99"/>
     <w:semiHidden/>
-    <w:rsid w:val="00CF03DA"/>
+    <w:rsid w:val="00371491"/>
     <w:rPr>
       <w:color w:val="808080"/>
     </w:rPr>
   </w:style>
-  <w:style w:type="paragraph" w:customStyle="1" w:styleId="39780F85CE924F6C9CE4C18AAFFEC287">
-    <w:name w:val="39780F85CE924F6C9CE4C18AAFFEC287"/>
-    <w:rsid w:val="00CF03DA"/>
-  </w:style>
   <w:style w:type="paragraph" w:customStyle="1" w:styleId="EAB7688BF63C4764B3086C9F2BC2A37C">
     <w:name w:val="EAB7688BF63C4764B3086C9F2BC2A37C"/>
     <w:rsid w:val="007B2028"/>
-  </w:style>
-  <w:style w:type="paragraph" w:customStyle="1" w:styleId="233945FCF2DA4FBFA45986EFA458B230">
-    <w:name w:val="233945FCF2DA4FBFA45986EFA458B230"/>
-    <w:rsid w:val="00CF03DA"/>
-  </w:style>
-  <w:style w:type="paragraph" w:customStyle="1" w:styleId="2E5DFE92972A484EB54D13A0F4524D2F">
-    <w:name w:val="2E5DFE92972A484EB54D13A0F4524D2F"/>
-    <w:rsid w:val="00CF03DA"/>
-  </w:style>
-  <w:style w:type="paragraph" w:customStyle="1" w:styleId="6E83DA182F3344CEA0945B20FF88B7E1">
-    <w:name w:val="6E83DA182F3344CEA0945B20FF88B7E1"/>
-    <w:rsid w:val="00CF03DA"/>
-  </w:style>
-  <w:style w:type="paragraph" w:customStyle="1" w:styleId="6E9813AF5B8045DA8E9C93487CAB149C">
-    <w:name w:val="6E9813AF5B8045DA8E9C93487CAB149C"/>
-    <w:rsid w:val="00CF03DA"/>
-  </w:style>
-  <w:style w:type="paragraph" w:customStyle="1" w:styleId="07915247C125445F8E6CC95883614F39">
-    <w:name w:val="07915247C125445F8E6CC95883614F39"/>
-    <w:rsid w:val="00CF03DA"/>
-  </w:style>
-  <w:style w:type="paragraph" w:customStyle="1" w:styleId="8EF413D4E31A413882D57513CA014A1F">
-    <w:name w:val="8EF413D4E31A413882D57513CA014A1F"/>
-    <w:rsid w:val="00CF03DA"/>
-  </w:style>
-  <w:style w:type="paragraph" w:customStyle="1" w:styleId="0E282CE727FA4AD98886A22E5D0CD643">
-    <w:name w:val="0E282CE727FA4AD98886A22E5D0CD643"/>
-    <w:rsid w:val="00CF03DA"/>
-  </w:style>
-  <w:style w:type="paragraph" w:customStyle="1" w:styleId="E7E569A67A7A4660A68CA7AC5B41DE4E">
-    <w:name w:val="E7E569A67A7A4660A68CA7AC5B41DE4E"/>
-    <w:rsid w:val="00CF03DA"/>
-  </w:style>
-  <w:style w:type="paragraph" w:customStyle="1" w:styleId="BCE5C65AE30747298864522BB6ABD293">
-    <w:name w:val="BCE5C65AE30747298864522BB6ABD293"/>
-    <w:rsid w:val="00CF03DA"/>
-  </w:style>
-  <w:style w:type="paragraph" w:customStyle="1" w:styleId="D387284472B149189174F8B85D0E3F2B">
-    <w:name w:val="D387284472B149189174F8B85D0E3F2B"/>
-    <w:rsid w:val="00CF03DA"/>
   </w:style>
   <w:style w:type="character" w:customStyle="1" w:styleId="Styl2">
     <w:name w:val="Styl2"/>
     <w:basedOn w:val="Domylnaczcionkaakapitu"/>
     <w:uiPriority w:val="1"/>
-    <w:rsid w:val="00CF03DA"/>
-  </w:style>
-  <w:style w:type="paragraph" w:customStyle="1" w:styleId="A7ECF6DE32D54BB7972815E3B3F07970">
-    <w:name w:val="A7ECF6DE32D54BB7972815E3B3F07970"/>
-    <w:rsid w:val="00CF03DA"/>
-  </w:style>
-  <w:style w:type="paragraph" w:customStyle="1" w:styleId="1D15EC2D590B499599C42AC97243669E">
-    <w:name w:val="1D15EC2D590B499599C42AC97243669E"/>
-    <w:rsid w:val="00CF03DA"/>
-  </w:style>
-  <w:style w:type="paragraph" w:customStyle="1" w:styleId="2E43189AF6254E908EFC3E16A3824F01">
-    <w:name w:val="2E43189AF6254E908EFC3E16A3824F01"/>
-    <w:rsid w:val="00CF03DA"/>
-  </w:style>
-  <w:style w:type="paragraph" w:customStyle="1" w:styleId="E176935FA709446EA50C53CFDACCDDB0">
-    <w:name w:val="E176935FA709446EA50C53CFDACCDDB0"/>
-    <w:rsid w:val="00CF03DA"/>
-  </w:style>
-  <w:style w:type="paragraph" w:customStyle="1" w:styleId="D192B0299D6A40B2B1E27EDD074CEFB9">
-    <w:name w:val="D192B0299D6A40B2B1E27EDD074CEFB9"/>
-    <w:rsid w:val="00CF03DA"/>
-  </w:style>
-  <w:style w:type="paragraph" w:customStyle="1" w:styleId="123A46B7E82C4D269BD79345F8F9C7C0">
-    <w:name w:val="123A46B7E82C4D269BD79345F8F9C7C0"/>
-    <w:rsid w:val="00CF03DA"/>
-  </w:style>
-  <w:style w:type="paragraph" w:customStyle="1" w:styleId="39081D99BFF1407492EB372299BB0C5C">
-    <w:name w:val="39081D99BFF1407492EB372299BB0C5C"/>
-    <w:rsid w:val="00CF03DA"/>
-  </w:style>
-  <w:style w:type="paragraph" w:customStyle="1" w:styleId="EE4861051A3844F4AA6EF3F8F8867591">
-    <w:name w:val="EE4861051A3844F4AA6EF3F8F8867591"/>
-    <w:rsid w:val="00CF03DA"/>
-  </w:style>
-  <w:style w:type="paragraph" w:customStyle="1" w:styleId="CA4F5E0C73794F269121A8D1495BD0E7">
-    <w:name w:val="CA4F5E0C73794F269121A8D1495BD0E7"/>
-    <w:rsid w:val="00CF03DA"/>
-  </w:style>
-  <w:style w:type="paragraph" w:customStyle="1" w:styleId="68853DB2E7B94D85BF77FFC2CC15066B">
-    <w:name w:val="68853DB2E7B94D85BF77FFC2CC15066B"/>
-    <w:rsid w:val="00CF03DA"/>
-  </w:style>
-  <w:style w:type="paragraph" w:customStyle="1" w:styleId="48DAE4E2F6C748D1AADA9F9C7192D2DC">
-    <w:name w:val="48DAE4E2F6C748D1AADA9F9C7192D2DC"/>
-    <w:rsid w:val="00CF03DA"/>
-  </w:style>
-  <w:style w:type="paragraph" w:customStyle="1" w:styleId="033EA8423C76453CA9310AD37CA764DF">
-    <w:name w:val="033EA8423C76453CA9310AD37CA764DF"/>
-    <w:rsid w:val="00CF03DA"/>
-  </w:style>
-  <w:style w:type="paragraph" w:customStyle="1" w:styleId="EA9437FB1CBE4DE3ADDD1C8012312480">
-    <w:name w:val="EA9437FB1CBE4DE3ADDD1C8012312480"/>
-    <w:rsid w:val="00CF03DA"/>
-  </w:style>
-  <w:style w:type="paragraph" w:customStyle="1" w:styleId="5C82DCB8CE3541E48EB21FCB50A9A01C">
-    <w:name w:val="5C82DCB8CE3541E48EB21FCB50A9A01C"/>
-    <w:rsid w:val="00CF03DA"/>
-  </w:style>
-  <w:style w:type="paragraph" w:customStyle="1" w:styleId="1B2EA1288E6447B3BDA838FF2CCD6A68">
-    <w:name w:val="1B2EA1288E6447B3BDA838FF2CCD6A68"/>
-    <w:rsid w:val="00CF03DA"/>
-  </w:style>
-  <w:style w:type="paragraph" w:customStyle="1" w:styleId="109C0049BC6A466AAB35E9AFD1967B50">
-    <w:name w:val="109C0049BC6A466AAB35E9AFD1967B50"/>
-    <w:rsid w:val="00CF03DA"/>
-  </w:style>
-  <w:style w:type="paragraph" w:customStyle="1" w:styleId="8A153692B31E4EFD982E18C31C706292">
-    <w:name w:val="8A153692B31E4EFD982E18C31C706292"/>
-    <w:rsid w:val="00CF03DA"/>
-  </w:style>
-  <w:style w:type="paragraph" w:customStyle="1" w:styleId="92B0FFCF1B7C46B98E820DEE3ECC4876">
-    <w:name w:val="92B0FFCF1B7C46B98E820DEE3ECC4876"/>
-    <w:rsid w:val="00CF03DA"/>
-  </w:style>
-  <w:style w:type="paragraph" w:customStyle="1" w:styleId="F29EF5F9983C44978C449DB20D13AF53">
-    <w:name w:val="F29EF5F9983C44978C449DB20D13AF53"/>
-    <w:rsid w:val="00CF03DA"/>
-  </w:style>
-  <w:style w:type="paragraph" w:customStyle="1" w:styleId="1099973DD1A64649AB7BDA879E75D9E9">
-    <w:name w:val="1099973DD1A64649AB7BDA879E75D9E9"/>
-    <w:rsid w:val="00CF03DA"/>
-  </w:style>
-  <w:style w:type="paragraph" w:customStyle="1" w:styleId="0EAFF0A1D2184B66858A4988BA174C00">
-    <w:name w:val="0EAFF0A1D2184B66858A4988BA174C00"/>
-    <w:rsid w:val="00CF03DA"/>
+    <w:rsid w:val="00C545F0"/>
+  </w:style>
+  <w:style w:type="paragraph" w:customStyle="1" w:styleId="3F2149EBADA941C6BDC333BAFD2F845B">
+    <w:name w:val="3F2149EBADA941C6BDC333BAFD2F845B"/>
+    <w:rsid w:val="00C545F0"/>
+  </w:style>
+  <w:style w:type="paragraph" w:customStyle="1" w:styleId="CA1DE9CEFB044F8888FDDCBDA74F0652">
+    <w:name w:val="CA1DE9CEFB044F8888FDDCBDA74F0652"/>
+    <w:rsid w:val="00C545F0"/>
+  </w:style>
+  <w:style w:type="paragraph" w:customStyle="1" w:styleId="F4B29857C5354EA8894BAB27E69CC9F5">
+    <w:name w:val="F4B29857C5354EA8894BAB27E69CC9F5"/>
+    <w:rsid w:val="00C545F0"/>
+  </w:style>
+  <w:style w:type="paragraph" w:customStyle="1" w:styleId="DA95DA6521174184BCFCE178C5D1DF39">
+    <w:name w:val="DA95DA6521174184BCFCE178C5D1DF39"/>
+    <w:rsid w:val="00C545F0"/>
+  </w:style>
+  <w:style w:type="paragraph" w:customStyle="1" w:styleId="5A34E62CCE5F4B45A913930961FE8EAD">
+    <w:name w:val="5A34E62CCE5F4B45A913930961FE8EAD"/>
+    <w:rsid w:val="00C545F0"/>
+  </w:style>
+  <w:style w:type="paragraph" w:customStyle="1" w:styleId="277E24F56C164BF7B3D10C15D89AEBD0">
+    <w:name w:val="277E24F56C164BF7B3D10C15D89AEBD0"/>
+    <w:rsid w:val="00C545F0"/>
+  </w:style>
+  <w:style w:type="paragraph" w:customStyle="1" w:styleId="5A54BE8B02124928B26C6A77DCDDC861">
+    <w:name w:val="5A54BE8B02124928B26C6A77DCDDC861"/>
+    <w:rsid w:val="00C545F0"/>
+  </w:style>
+  <w:style w:type="paragraph" w:customStyle="1" w:styleId="68939F3796D4429F9F2A44DAF480F1C0">
+    <w:name w:val="68939F3796D4429F9F2A44DAF480F1C0"/>
+    <w:rsid w:val="00C545F0"/>
+  </w:style>
+  <w:style w:type="paragraph" w:customStyle="1" w:styleId="C55793E1BCB24B79BD09894C7B8BED6A">
+    <w:name w:val="C55793E1BCB24B79BD09894C7B8BED6A"/>
+    <w:rsid w:val="00C545F0"/>
   </w:style>
 </w:styles>
 </file>

</xml_diff>

<commit_message>
Save before changing filling loop
</commit_message>
<xml_diff>
--- a/krolik_doswiadczalny.docx
+++ b/krolik_doswiadczalny.docx
@@ -728,30 +728,11 @@
                 <w:szCs w:val="20"/>
               </w:rPr>
             </w:pPr>
-            <w:sdt>
-              <w:sdtPr>
-                <w:rPr>
-                  <w:rStyle w:val="Styl1"/>
-                </w:rPr>
-                <w:id w:val="1669826174"/>
-                <w:placeholder>
-                  <w:docPart w:val="C55793E1BCB24B79BD09894C7B8BED6A"/>
-                </w:placeholder>
-                <w:showingPlcHdr/>
-              </w:sdtPr>
-              <w:sdtContent>
-                <w:r>
-                  <w:rPr>
-                    <w:rStyle w:val="Tekstzastpczy"/>
-                    <w:b/>
-                    <w:bCs/>
-                  </w:rPr>
-                  <w:t>Cena ściany</w:t>
-                </w:r>
-              </w:sdtContent>
-            </w:sdt>
-            <w:r>
-              <w:t xml:space="preserve"> </w:t>
+            <w:r>
+              <w:rPr>
+                <w:rStyle w:val="Styl1"/>
+              </w:rPr>
+              <w:t xml:space="preserve">Cena </w:t>
             </w:r>
             <w:r>
               <w:rPr>
@@ -1261,43 +1242,25 @@
             </w:r>
           </w:p>
         </w:tc>
-        <w:sdt>
-          <w:sdtPr>
-            <w:rPr>
-              <w:rStyle w:val="Styl2"/>
-            </w:rPr>
-            <w:id w:val="1044867502"/>
-            <w:placeholder>
-              <w:docPart w:val="F4B29857C5354EA8894BAB27E69CC9F5"/>
-            </w:placeholder>
-            <w:comboBox>
-              <w:listItem w:displayText="-" w:value="-"/>
-              <w:listItem w:displayText="manual" w:value="manual"/>
-              <w:listItem w:displayText="semi-automatic" w:value="semi-automatic"/>
-            </w:comboBox>
-          </w:sdtPr>
-          <w:sdtContent>
-            <w:tc>
-              <w:tcPr>
-                <w:tcW w:w="3221" w:type="dxa"/>
-                <w:vAlign w:val="center"/>
-              </w:tcPr>
-              <w:p>
-                <w:pPr>
-                  <w:rPr>
-                    <w:szCs w:val="20"/>
-                  </w:rPr>
-                </w:pPr>
-                <w:r>
-                  <w:rPr>
-                    <w:rStyle w:val="Styl2"/>
-                  </w:rPr>
-                  <w:t>-</w:t>
-                </w:r>
-              </w:p>
-            </w:tc>
-          </w:sdtContent>
-        </w:sdt>
+        <w:tc>
+          <w:tcPr>
+            <w:tcW w:w="3221" w:type="dxa"/>
+            <w:vAlign w:val="center"/>
+          </w:tcPr>
+          <w:p>
+            <w:pPr>
+              <w:rPr>
+                <w:szCs w:val="20"/>
+              </w:rPr>
+            </w:pPr>
+            <w:r>
+              <w:rPr>
+                <w:szCs w:val="20"/>
+              </w:rPr>
+              <w:t>operacja</w:t>
+            </w:r>
+          </w:p>
+        </w:tc>
         <w:tc>
           <w:tcPr>
             <w:tcW w:w="3620" w:type="dxa"/>
@@ -1343,44 +1306,25 @@
             </w:r>
           </w:p>
         </w:tc>
-        <w:sdt>
-          <w:sdtPr>
-            <w:rPr>
-              <w:rStyle w:val="Styl2"/>
-            </w:rPr>
-            <w:id w:val="950593397"/>
-            <w:placeholder>
-              <w:docPart w:val="DA95DA6521174184BCFCE178C5D1DF39"/>
-            </w:placeholder>
-            <w:comboBox>
-              <w:listItem w:displayText="-" w:value="-"/>
-              <w:listItem w:displayText="RAW" w:value="RAW"/>
-              <w:listItem w:displayText="Standard RAL 9010" w:value="Standard RAL 9010"/>
-              <w:listItem w:displayText="Other RAL " w:value="Other RAL "/>
-            </w:comboBox>
-          </w:sdtPr>
-          <w:sdtContent>
-            <w:tc>
-              <w:tcPr>
-                <w:tcW w:w="3221" w:type="dxa"/>
-                <w:vAlign w:val="center"/>
-              </w:tcPr>
-              <w:p>
-                <w:pPr>
-                  <w:rPr>
-                    <w:szCs w:val="20"/>
-                  </w:rPr>
-                </w:pPr>
-                <w:r>
-                  <w:rPr>
-                    <w:rStyle w:val="Styl2"/>
-                  </w:rPr>
-                  <w:t>-</w:t>
-                </w:r>
-              </w:p>
-            </w:tc>
-          </w:sdtContent>
-        </w:sdt>
+        <w:tc>
+          <w:tcPr>
+            <w:tcW w:w="3221" w:type="dxa"/>
+            <w:vAlign w:val="center"/>
+          </w:tcPr>
+          <w:p>
+            <w:pPr>
+              <w:rPr>
+                <w:szCs w:val="20"/>
+              </w:rPr>
+            </w:pPr>
+            <w:r>
+              <w:rPr>
+                <w:szCs w:val="20"/>
+              </w:rPr>
+              <w:t>tory</w:t>
+            </w:r>
+          </w:p>
+        </w:tc>
         <w:tc>
           <w:tcPr>
             <w:tcW w:w="3620" w:type="dxa"/>
@@ -1426,44 +1370,25 @@
             </w:r>
           </w:p>
         </w:tc>
-        <w:sdt>
-          <w:sdtPr>
-            <w:rPr>
-              <w:rStyle w:val="Styl2"/>
-            </w:rPr>
-            <w:id w:val="-347324769"/>
-            <w:placeholder>
-              <w:docPart w:val="5A34E62CCE5F4B45A913930961FE8EAD"/>
-            </w:placeholder>
-            <w:comboBox>
-              <w:listItem w:displayText="-" w:value="-"/>
-              <w:listItem w:displayText="Without door " w:value="Without door "/>
-              <w:listItem w:displayText="Single door " w:value="Single door "/>
-              <w:listItem w:displayText="Double door" w:value="Double door"/>
-            </w:comboBox>
-          </w:sdtPr>
-          <w:sdtContent>
-            <w:tc>
-              <w:tcPr>
-                <w:tcW w:w="3221" w:type="dxa"/>
-                <w:vAlign w:val="center"/>
-              </w:tcPr>
-              <w:p>
-                <w:pPr>
-                  <w:rPr>
-                    <w:szCs w:val="20"/>
-                  </w:rPr>
-                </w:pPr>
-                <w:r>
-                  <w:rPr>
-                    <w:rStyle w:val="Styl2"/>
-                  </w:rPr>
-                  <w:t>-</w:t>
-                </w:r>
-              </w:p>
-            </w:tc>
-          </w:sdtContent>
-        </w:sdt>
+        <w:tc>
+          <w:tcPr>
+            <w:tcW w:w="3221" w:type="dxa"/>
+            <w:vAlign w:val="center"/>
+          </w:tcPr>
+          <w:p>
+            <w:pPr>
+              <w:rPr>
+                <w:szCs w:val="20"/>
+              </w:rPr>
+            </w:pPr>
+            <w:r>
+              <w:rPr>
+                <w:szCs w:val="20"/>
+              </w:rPr>
+              <w:t>drzwi</w:t>
+            </w:r>
+          </w:p>
+        </w:tc>
         <w:tc>
           <w:tcPr>
             <w:tcW w:w="3620" w:type="dxa"/>
@@ -1515,46 +1440,25 @@
             </w:r>
           </w:p>
         </w:tc>
-        <w:sdt>
-          <w:sdtPr>
-            <w:rPr>
-              <w:rStyle w:val="Styl2"/>
-            </w:rPr>
-            <w:id w:val="1874648713"/>
-            <w:placeholder>
-              <w:docPart w:val="277E24F56C164BF7B3D10C15D89AEBD0"/>
-            </w:placeholder>
-            <w:comboBox>
-              <w:listItem w:displayText="-" w:value="-"/>
-              <w:listItem w:displayText="Surface glass 8mm ESG (toughened)" w:value="Surface glass 8mm ESG (toughened)"/>
-              <w:listItem w:displayText="Internal glass 44.2mm VSG (laminated)" w:value="Internal glass 44.2mm VSG (laminated)"/>
-              <w:listItem w:displayText="OPT 50 33.1 VSG" w:value="OPT 50 33.1 VSG"/>
-              <w:listItem w:displayText="OPT 50 44.1 VSG" w:value="OPT 50 44.1 VSG"/>
-              <w:listItem w:displayText="Without glass - sourced locally " w:value="Without glass - sourced locally "/>
-            </w:comboBox>
-          </w:sdtPr>
-          <w:sdtContent>
-            <w:tc>
-              <w:tcPr>
-                <w:tcW w:w="3221" w:type="dxa"/>
-                <w:vAlign w:val="center"/>
-              </w:tcPr>
-              <w:p>
-                <w:pPr>
-                  <w:rPr>
-                    <w:szCs w:val="20"/>
-                  </w:rPr>
-                </w:pPr>
-                <w:r>
-                  <w:rPr>
-                    <w:rStyle w:val="Styl2"/>
-                  </w:rPr>
-                  <w:t>-</w:t>
-                </w:r>
-              </w:p>
-            </w:tc>
-          </w:sdtContent>
-        </w:sdt>
+        <w:tc>
+          <w:tcPr>
+            <w:tcW w:w="3221" w:type="dxa"/>
+            <w:vAlign w:val="center"/>
+          </w:tcPr>
+          <w:p>
+            <w:pPr>
+              <w:rPr>
+                <w:szCs w:val="20"/>
+              </w:rPr>
+            </w:pPr>
+            <w:r>
+              <w:rPr>
+                <w:rStyle w:val="Styl2"/>
+              </w:rPr>
+              <w:t>szkło</w:t>
+            </w:r>
+          </w:p>
+        </w:tc>
         <w:tc>
           <w:tcPr>
             <w:tcW w:w="3620" w:type="dxa"/>
@@ -1611,37 +1515,19 @@
             <w:tcW w:w="3221" w:type="dxa"/>
             <w:vAlign w:val="center"/>
           </w:tcPr>
-          <w:sdt>
-            <w:sdtPr>
+          <w:p>
+            <w:pPr>
+              <w:rPr>
+                <w:szCs w:val="20"/>
+              </w:rPr>
+            </w:pPr>
+            <w:r>
               <w:rPr>
                 <w:rStyle w:val="Styl2"/>
               </w:rPr>
-              <w:id w:val="-604806855"/>
-              <w:placeholder>
-                <w:docPart w:val="5A54BE8B02124928B26C6A77DCDDC861"/>
-              </w:placeholder>
-              <w:comboBox>
-                <w:listItem w:displayText="-" w:value="-"/>
-                <w:listItem w:displayText="anodised" w:value="anodised"/>
-                <w:listItem w:displayText="Powder coated RAL" w:value="Powder coated RAL"/>
-              </w:comboBox>
-            </w:sdtPr>
-            <w:sdtContent>
-              <w:p>
-                <w:pPr>
-                  <w:rPr>
-                    <w:szCs w:val="20"/>
-                  </w:rPr>
-                </w:pPr>
-                <w:r>
-                  <w:rPr>
-                    <w:rStyle w:val="Styl2"/>
-                  </w:rPr>
-                  <w:t>-</w:t>
-                </w:r>
-              </w:p>
-            </w:sdtContent>
-          </w:sdt>
+              <w:t>aluminium</w:t>
+            </w:r>
+          </w:p>
         </w:tc>
         <w:tc>
           <w:tcPr>
@@ -1707,41 +1593,13 @@
             <w:tcW w:w="3221" w:type="dxa"/>
             <w:vAlign w:val="center"/>
           </w:tcPr>
-          <w:sdt>
-            <w:sdtPr>
-              <w:rPr>
-                <w:rStyle w:val="Styl2"/>
-              </w:rPr>
-              <w:id w:val="-792675943"/>
-              <w:placeholder>
-                <w:docPart w:val="68939F3796D4429F9F2A44DAF480F1C0"/>
-              </w:placeholder>
-              <w:comboBox>
-                <w:listItem w:displayText="-" w:value="-"/>
-                <w:listItem w:displayText="anti-panic push bar (single door)" w:value="anti-panic push bar (single door)"/>
-                <w:listItem w:displayText="anti-panic push bar (double door)" w:value="anti-panic push bar (double door)"/>
-                <w:listItem w:displayText="Steel suspension " w:value="Steel suspension "/>
-                <w:listItem w:displayText="Concealed profiles" w:value="Concealed profiles"/>
-                <w:listItem w:displayText="No additional equipment needed" w:value="No additional equipment needed"/>
-              </w:comboBox>
-            </w:sdtPr>
-            <w:sdtContent>
-              <w:p>
-                <w:pPr>
-                  <w:rPr>
-                    <w:rStyle w:val="Styl2"/>
-                  </w:rPr>
-                </w:pPr>
-                <w:r>
-                  <w:rPr>
-                    <w:rStyle w:val="Styl2"/>
-                  </w:rPr>
-                  <w:t>-</w:t>
-                </w:r>
-              </w:p>
-            </w:sdtContent>
-          </w:sdt>
-          <w:p/>
+          <w:p>
+            <w:proofErr w:type="spellStart"/>
+            <w:r>
+              <w:t>adyszynal</w:t>
+            </w:r>
+            <w:proofErr w:type="spellEnd"/>
+          </w:p>
         </w:tc>
         <w:tc>
           <w:tcPr>
@@ -3112,227 +2970,6 @@
         </w:p>
       </w:docPartBody>
     </w:docPart>
-    <w:docPart>
-      <w:docPartPr>
-        <w:name w:val="F4B29857C5354EA8894BAB27E69CC9F5"/>
-        <w:category>
-          <w:name w:val="Ogólne"/>
-          <w:gallery w:val="placeholder"/>
-        </w:category>
-        <w:types>
-          <w:type w:val="bbPlcHdr"/>
-        </w:types>
-        <w:behaviors>
-          <w:behavior w:val="content"/>
-        </w:behaviors>
-        <w:guid w:val="{47017E49-1E03-459C-8C70-1E951B60A56E}"/>
-      </w:docPartPr>
-      <w:docPartBody>
-        <w:p>
-          <w:pPr>
-            <w:pStyle w:val="F4B29857C5354EA8894BAB27E69CC9F5"/>
-          </w:pPr>
-          <w:r>
-            <w:rPr>
-              <w:rStyle w:val="Tekstzastpczy"/>
-            </w:rPr>
-            <w:t xml:space="preserve">Wybierz </w:t>
-          </w:r>
-          <w:r>
-            <w:rPr>
-              <w:rStyle w:val="Tekstzastpczy"/>
-            </w:rPr>
-            <w:t>obsługę</w:t>
-          </w:r>
-        </w:p>
-      </w:docPartBody>
-    </w:docPart>
-    <w:docPart>
-      <w:docPartPr>
-        <w:name w:val="DA95DA6521174184BCFCE178C5D1DF39"/>
-        <w:category>
-          <w:name w:val="Ogólne"/>
-          <w:gallery w:val="placeholder"/>
-        </w:category>
-        <w:types>
-          <w:type w:val="bbPlcHdr"/>
-        </w:types>
-        <w:behaviors>
-          <w:behavior w:val="content"/>
-        </w:behaviors>
-        <w:guid w:val="{7AE2EF54-764E-48CB-8F87-5CEA2CCA2F8B}"/>
-      </w:docPartPr>
-      <w:docPartBody>
-        <w:p>
-          <w:pPr>
-            <w:pStyle w:val="DA95DA6521174184BCFCE178C5D1DF39"/>
-          </w:pPr>
-          <w:r>
-            <w:rPr>
-              <w:rStyle w:val="Tekstzastpczy"/>
-            </w:rPr>
-            <w:t xml:space="preserve">Wybierz </w:t>
-          </w:r>
-          <w:r>
-            <w:rPr>
-              <w:rStyle w:val="Tekstzastpczy"/>
-            </w:rPr>
-            <w:t>kolor toru</w:t>
-          </w:r>
-        </w:p>
-      </w:docPartBody>
-    </w:docPart>
-    <w:docPart>
-      <w:docPartPr>
-        <w:name w:val="5A34E62CCE5F4B45A913930961FE8EAD"/>
-        <w:category>
-          <w:name w:val="Ogólne"/>
-          <w:gallery w:val="placeholder"/>
-        </w:category>
-        <w:types>
-          <w:type w:val="bbPlcHdr"/>
-        </w:types>
-        <w:behaviors>
-          <w:behavior w:val="content"/>
-        </w:behaviors>
-        <w:guid w:val="{7DC601AC-7C56-402E-B350-31E665BDB4C3}"/>
-      </w:docPartPr>
-      <w:docPartBody>
-        <w:p>
-          <w:pPr>
-            <w:pStyle w:val="5A34E62CCE5F4B45A913930961FE8EAD"/>
-          </w:pPr>
-          <w:r>
-            <w:rPr>
-              <w:rStyle w:val="Tekstzastpczy"/>
-            </w:rPr>
-            <w:t>Wybierz rodzaj drzwi</w:t>
-          </w:r>
-        </w:p>
-      </w:docPartBody>
-    </w:docPart>
-    <w:docPart>
-      <w:docPartPr>
-        <w:name w:val="277E24F56C164BF7B3D10C15D89AEBD0"/>
-        <w:category>
-          <w:name w:val="Ogólne"/>
-          <w:gallery w:val="placeholder"/>
-        </w:category>
-        <w:types>
-          <w:type w:val="bbPlcHdr"/>
-        </w:types>
-        <w:behaviors>
-          <w:behavior w:val="content"/>
-        </w:behaviors>
-        <w:guid w:val="{08971CE2-4A3E-4A84-8262-DECFF0648AAF}"/>
-      </w:docPartPr>
-      <w:docPartBody>
-        <w:p>
-          <w:pPr>
-            <w:pStyle w:val="277E24F56C164BF7B3D10C15D89AEBD0"/>
-          </w:pPr>
-          <w:r>
-            <w:rPr>
-              <w:rStyle w:val="Tekstzastpczy"/>
-            </w:rPr>
-            <w:t>Wybierz rodzaj drzwi</w:t>
-          </w:r>
-        </w:p>
-      </w:docPartBody>
-    </w:docPart>
-    <w:docPart>
-      <w:docPartPr>
-        <w:name w:val="5A54BE8B02124928B26C6A77DCDDC861"/>
-        <w:category>
-          <w:name w:val="Ogólne"/>
-          <w:gallery w:val="placeholder"/>
-        </w:category>
-        <w:types>
-          <w:type w:val="bbPlcHdr"/>
-        </w:types>
-        <w:behaviors>
-          <w:behavior w:val="content"/>
-        </w:behaviors>
-        <w:guid w:val="{6341D1B6-7333-4FB1-A326-349867B22EDF}"/>
-      </w:docPartPr>
-      <w:docPartBody>
-        <w:p>
-          <w:pPr>
-            <w:pStyle w:val="5A54BE8B02124928B26C6A77DCDDC861"/>
-          </w:pPr>
-          <w:r>
-            <w:rPr>
-              <w:rStyle w:val="Tekstzastpczy"/>
-            </w:rPr>
-            <w:t>Wy</w:t>
-          </w:r>
-          <w:r>
-            <w:rPr>
-              <w:rStyle w:val="Tekstzastpczy"/>
-            </w:rPr>
-            <w:t>bierz kolor profili</w:t>
-          </w:r>
-        </w:p>
-      </w:docPartBody>
-    </w:docPart>
-    <w:docPart>
-      <w:docPartPr>
-        <w:name w:val="68939F3796D4429F9F2A44DAF480F1C0"/>
-        <w:category>
-          <w:name w:val="Ogólne"/>
-          <w:gallery w:val="placeholder"/>
-        </w:category>
-        <w:types>
-          <w:type w:val="bbPlcHdr"/>
-        </w:types>
-        <w:behaviors>
-          <w:behavior w:val="content"/>
-        </w:behaviors>
-        <w:guid w:val="{24647C66-8A9E-446C-8AD8-7497B8146F68}"/>
-      </w:docPartPr>
-      <w:docPartBody>
-        <w:p>
-          <w:pPr>
-            <w:pStyle w:val="68939F3796D4429F9F2A44DAF480F1C0"/>
-          </w:pPr>
-          <w:r>
-            <w:rPr>
-              <w:rStyle w:val="Styl2"/>
-            </w:rPr>
-            <w:t>Dodatkowe akcesoria</w:t>
-          </w:r>
-        </w:p>
-      </w:docPartBody>
-    </w:docPart>
-    <w:docPart>
-      <w:docPartPr>
-        <w:name w:val="C55793E1BCB24B79BD09894C7B8BED6A"/>
-        <w:category>
-          <w:name w:val="Ogólne"/>
-          <w:gallery w:val="placeholder"/>
-        </w:category>
-        <w:types>
-          <w:type w:val="bbPlcHdr"/>
-        </w:types>
-        <w:behaviors>
-          <w:behavior w:val="content"/>
-        </w:behaviors>
-        <w:guid w:val="{0A7845F1-4654-4D80-81D4-A6A3D464A911}"/>
-      </w:docPartPr>
-      <w:docPartBody>
-        <w:p>
-          <w:pPr>
-            <w:pStyle w:val="C55793E1BCB24B79BD09894C7B8BED6A"/>
-          </w:pPr>
-          <w:r>
-            <w:rPr>
-              <w:rStyle w:val="Tekstzastpczy"/>
-            </w:rPr>
-            <w:t>Cena ściany</w:t>
-          </w:r>
-        </w:p>
-      </w:docPartBody>
-    </w:docPart>
   </w:docParts>
 </w:glossaryDocument>
 </file>
@@ -3405,12 +3042,16 @@
   </w:compat>
   <w:rsids>
     <w:rsidRoot w:val="004B629E"/>
+    <w:rsid w:val="00005A40"/>
     <w:rsid w:val="00311124"/>
     <w:rsid w:val="00371491"/>
     <w:rsid w:val="00374A1F"/>
     <w:rsid w:val="00377AB0"/>
+    <w:rsid w:val="00453FAF"/>
     <w:rsid w:val="004B629E"/>
+    <w:rsid w:val="005A1CBC"/>
     <w:rsid w:val="00650F49"/>
+    <w:rsid w:val="006B709F"/>
     <w:rsid w:val="00705174"/>
     <w:rsid w:val="00753D23"/>
     <w:rsid w:val="007B2028"/>
@@ -3419,7 +3060,10 @@
     <w:rsid w:val="00924ABD"/>
     <w:rsid w:val="0093601B"/>
     <w:rsid w:val="00964355"/>
+    <w:rsid w:val="00A36251"/>
+    <w:rsid w:val="00AC4255"/>
     <w:rsid w:val="00AD7DCB"/>
+    <w:rsid w:val="00B345B2"/>
     <w:rsid w:val="00C545F0"/>
     <w:rsid w:val="00C84558"/>
     <w:rsid w:val="00C976A1"/>
@@ -3882,7 +3526,7 @@
     <w:basedOn w:val="Domylnaczcionkaakapitu"/>
     <w:uiPriority w:val="99"/>
     <w:semiHidden/>
-    <w:rsid w:val="00371491"/>
+    <w:rsid w:val="00453FAF"/>
     <w:rPr>
       <w:color w:val="808080"/>
     </w:rPr>
@@ -3899,22 +3543,6 @@
   </w:style>
   <w:style w:type="paragraph" w:customStyle="1" w:styleId="3F2149EBADA941C6BDC333BAFD2F845B">
     <w:name w:val="3F2149EBADA941C6BDC333BAFD2F845B"/>
-    <w:rsid w:val="00C545F0"/>
-  </w:style>
-  <w:style w:type="paragraph" w:customStyle="1" w:styleId="CA1DE9CEFB044F8888FDDCBDA74F0652">
-    <w:name w:val="CA1DE9CEFB044F8888FDDCBDA74F0652"/>
-    <w:rsid w:val="00C545F0"/>
-  </w:style>
-  <w:style w:type="paragraph" w:customStyle="1" w:styleId="F4B29857C5354EA8894BAB27E69CC9F5">
-    <w:name w:val="F4B29857C5354EA8894BAB27E69CC9F5"/>
-    <w:rsid w:val="00C545F0"/>
-  </w:style>
-  <w:style w:type="paragraph" w:customStyle="1" w:styleId="DA95DA6521174184BCFCE178C5D1DF39">
-    <w:name w:val="DA95DA6521174184BCFCE178C5D1DF39"/>
-    <w:rsid w:val="00C545F0"/>
-  </w:style>
-  <w:style w:type="paragraph" w:customStyle="1" w:styleId="5A34E62CCE5F4B45A913930961FE8EAD">
-    <w:name w:val="5A34E62CCE5F4B45A913930961FE8EAD"/>
     <w:rsid w:val="00C545F0"/>
   </w:style>
   <w:style w:type="paragraph" w:customStyle="1" w:styleId="277E24F56C164BF7B3D10C15D89AEBD0">

</xml_diff>

<commit_message>
A save before adding iteration over multiple walls
</commit_message>
<xml_diff>
--- a/krolik_doswiadczalny.docx
+++ b/krolik_doswiadczalny.docx
@@ -1627,6 +1627,194 @@
         </w:rPr>
       </w:pPr>
     </w:p>
+    <w:tbl>
+      <w:tblPr>
+        <w:tblStyle w:val="Tabela-Siatka"/>
+        <w:tblpPr w:leftFromText="141" w:rightFromText="141" w:vertAnchor="text" w:horzAnchor="margin" w:tblpXSpec="center" w:tblpY="179"/>
+        <w:tblW w:w="10206" w:type="dxa"/>
+        <w:tblLook w:val="04A0" w:firstRow="1" w:lastRow="0" w:firstColumn="1" w:lastColumn="0" w:noHBand="0" w:noVBand="1"/>
+      </w:tblPr>
+      <w:tblGrid>
+        <w:gridCol w:w="7772"/>
+        <w:gridCol w:w="24"/>
+        <w:gridCol w:w="2410"/>
+      </w:tblGrid>
+      <w:tr>
+        <w:trPr>
+          <w:trHeight w:val="468"/>
+        </w:trPr>
+        <w:tc>
+          <w:tcPr>
+            <w:tcW w:w="7772" w:type="dxa"/>
+            <w:tcBorders>
+              <w:top w:val="nil"/>
+              <w:left w:val="nil"/>
+              <w:bottom w:val="single" w:sz="4" w:space="0" w:color="auto"/>
+              <w:right w:val="nil"/>
+            </w:tcBorders>
+            <w:shd w:val="clear" w:color="auto" w:fill="A6A6A6" w:themeFill="background1" w:themeFillShade="A6"/>
+            <w:vAlign w:val="center"/>
+          </w:tcPr>
+          <w:p>
+            <w:pPr>
+              <w:pStyle w:val="western"/>
+              <w:spacing w:before="0" w:beforeAutospacing="0" w:after="0" w:line="259" w:lineRule="auto"/>
+              <w:ind w:left="37" w:right="113"/>
+              <w:rPr>
+                <w:b/>
+                <w:bCs/>
+                <w:color w:val="FFFFFF" w:themeColor="background1"/>
+                <w:szCs w:val="20"/>
+              </w:rPr>
+            </w:pPr>
+            <w:proofErr w:type="spellStart"/>
+            <w:r>
+              <w:rPr>
+                <w:b/>
+                <w:bCs/>
+                <w:color w:val="FFFFFF" w:themeColor="background1"/>
+                <w:szCs w:val="20"/>
+              </w:rPr>
+              <w:t>Additional</w:t>
+            </w:r>
+            <w:proofErr w:type="spellEnd"/>
+            <w:r>
+              <w:rPr>
+                <w:b/>
+                <w:bCs/>
+                <w:color w:val="FFFFFF" w:themeColor="background1"/>
+                <w:szCs w:val="20"/>
+              </w:rPr>
+              <w:t xml:space="preserve"> notes:</w:t>
+            </w:r>
+          </w:p>
+        </w:tc>
+        <w:tc>
+          <w:tcPr>
+            <w:tcW w:w="2434" w:type="dxa"/>
+            <w:gridSpan w:val="2"/>
+            <w:tcBorders>
+              <w:top w:val="nil"/>
+              <w:left w:val="nil"/>
+              <w:bottom w:val="single" w:sz="4" w:space="0" w:color="auto"/>
+              <w:right w:val="nil"/>
+            </w:tcBorders>
+            <w:shd w:val="clear" w:color="auto" w:fill="A6A6A6" w:themeFill="background1" w:themeFillShade="A6"/>
+            <w:vAlign w:val="center"/>
+          </w:tcPr>
+          <w:p>
+            <w:pPr>
+              <w:rPr>
+                <w:b/>
+                <w:bCs/>
+                <w:color w:val="FFFFFF" w:themeColor="background1"/>
+                <w:szCs w:val="20"/>
+              </w:rPr>
+            </w:pPr>
+          </w:p>
+        </w:tc>
+      </w:tr>
+      <w:tr>
+        <w:trPr>
+          <w:trHeight w:val="805"/>
+        </w:trPr>
+        <w:tc>
+          <w:tcPr>
+            <w:tcW w:w="7796" w:type="dxa"/>
+            <w:gridSpan w:val="2"/>
+            <w:tcBorders>
+              <w:top w:val="single" w:sz="4" w:space="0" w:color="auto"/>
+              <w:left w:val="single" w:sz="4" w:space="0" w:color="auto"/>
+              <w:bottom w:val="single" w:sz="4" w:space="0" w:color="auto"/>
+              <w:right w:val="single" w:sz="4" w:space="0" w:color="auto"/>
+            </w:tcBorders>
+            <w:vAlign w:val="center"/>
+          </w:tcPr>
+          <w:p>
+            <w:pPr>
+              <w:rPr>
+                <w:szCs w:val="20"/>
+              </w:rPr>
+            </w:pPr>
+            <w:proofErr w:type="spellStart"/>
+            <w:r>
+              <w:rPr>
+                <w:szCs w:val="20"/>
+              </w:rPr>
+              <w:t>hihihihahahaha</w:t>
+            </w:r>
+            <w:proofErr w:type="spellEnd"/>
+          </w:p>
+        </w:tc>
+        <w:tc>
+          <w:tcPr>
+            <w:tcW w:w="2410" w:type="dxa"/>
+            <w:tcBorders>
+              <w:top w:val="single" w:sz="4" w:space="0" w:color="auto"/>
+              <w:left w:val="single" w:sz="4" w:space="0" w:color="auto"/>
+              <w:bottom w:val="single" w:sz="4" w:space="0" w:color="auto"/>
+              <w:right w:val="single" w:sz="4" w:space="0" w:color="auto"/>
+            </w:tcBorders>
+            <w:vAlign w:val="center"/>
+          </w:tcPr>
+          <w:p>
+            <w:pPr>
+              <w:jc w:val="center"/>
+              <w:rPr>
+                <w:b/>
+                <w:bCs/>
+                <w:szCs w:val="20"/>
+              </w:rPr>
+            </w:pPr>
+            <w:r>
+              <w:rPr>
+                <w:szCs w:val="20"/>
+              </w:rPr>
+              <w:t>+</w:t>
+            </w:r>
+            <w:r>
+              <w:rPr>
+                <w:szCs w:val="20"/>
+              </w:rPr>
+              <w:t xml:space="preserve"> </w:t>
+            </w:r>
+            <w:sdt>
+              <w:sdtPr>
+                <w:rPr>
+                  <w:szCs w:val="20"/>
+                </w:rPr>
+                <w:id w:val="346070020"/>
+                <w:placeholder>
+                  <w:docPart w:val="D1217FF7EE43442BA3354D289652BC01"/>
+                </w:placeholder>
+                <w:showingPlcHdr/>
+                <w:text/>
+              </w:sdtPr>
+              <w:sdtContent>
+                <w:r>
+                  <w:rPr>
+                    <w:rStyle w:val="Tekstzastpczy"/>
+                  </w:rPr>
+                  <w:t>Cena</w:t>
+                </w:r>
+              </w:sdtContent>
+            </w:sdt>
+            <w:r>
+              <w:rPr>
+                <w:szCs w:val="20"/>
+              </w:rPr>
+              <w:t xml:space="preserve"> </w:t>
+            </w:r>
+            <w:r>
+              <w:rPr>
+                <w:szCs w:val="20"/>
+              </w:rPr>
+              <w:t>EUR</w:t>
+            </w:r>
+          </w:p>
+        </w:tc>
+      </w:tr>
+    </w:tbl>
     <w:p>
       <w:pPr>
         <w:rPr>
@@ -2970,6 +3158,35 @@
         </w:p>
       </w:docPartBody>
     </w:docPart>
+    <w:docPart>
+      <w:docPartPr>
+        <w:name w:val="D1217FF7EE43442BA3354D289652BC01"/>
+        <w:category>
+          <w:name w:val="Ogólne"/>
+          <w:gallery w:val="placeholder"/>
+        </w:category>
+        <w:types>
+          <w:type w:val="bbPlcHdr"/>
+        </w:types>
+        <w:behaviors>
+          <w:behavior w:val="content"/>
+        </w:behaviors>
+        <w:guid w:val="{0B26E93F-3486-4796-AEE4-B09AA7B01620}"/>
+      </w:docPartPr>
+      <w:docPartBody>
+        <w:p>
+          <w:pPr>
+            <w:pStyle w:val="D1217FF7EE43442BA3354D289652BC01"/>
+          </w:pPr>
+          <w:r>
+            <w:rPr>
+              <w:rStyle w:val="Tekstzastpczy"/>
+            </w:rPr>
+            <w:t>Cena</w:t>
+          </w:r>
+        </w:p>
+      </w:docPartBody>
+    </w:docPart>
   </w:docParts>
 </w:glossaryDocument>
 </file>
@@ -3043,12 +3260,16 @@
   <w:rsids>
     <w:rsidRoot w:val="004B629E"/>
     <w:rsid w:val="00005A40"/>
+    <w:rsid w:val="0011660A"/>
     <w:rsid w:val="00311124"/>
+    <w:rsid w:val="00333CA7"/>
     <w:rsid w:val="00371491"/>
     <w:rsid w:val="00374A1F"/>
     <w:rsid w:val="00377AB0"/>
+    <w:rsid w:val="0044390F"/>
     <w:rsid w:val="00453FAF"/>
     <w:rsid w:val="004B629E"/>
+    <w:rsid w:val="004C341D"/>
     <w:rsid w:val="005A1CBC"/>
     <w:rsid w:val="00650F49"/>
     <w:rsid w:val="006B709F"/>
@@ -3057,6 +3278,7 @@
     <w:rsid w:val="007B2028"/>
     <w:rsid w:val="007F3F19"/>
     <w:rsid w:val="00816FCC"/>
+    <w:rsid w:val="00910631"/>
     <w:rsid w:val="00924ABD"/>
     <w:rsid w:val="0093601B"/>
     <w:rsid w:val="00964355"/>
@@ -3064,6 +3286,7 @@
     <w:rsid w:val="00AC4255"/>
     <w:rsid w:val="00AD7DCB"/>
     <w:rsid w:val="00B345B2"/>
+    <w:rsid w:val="00BF7380"/>
     <w:rsid w:val="00C545F0"/>
     <w:rsid w:val="00C84558"/>
     <w:rsid w:val="00C976A1"/>
@@ -3526,7 +3749,7 @@
     <w:basedOn w:val="Domylnaczcionkaakapitu"/>
     <w:uiPriority w:val="99"/>
     <w:semiHidden/>
-    <w:rsid w:val="00453FAF"/>
+    <w:rsid w:val="004C341D"/>
     <w:rPr>
       <w:color w:val="808080"/>
     </w:rPr>
@@ -3535,31 +3758,13 @@
     <w:name w:val="EAB7688BF63C4764B3086C9F2BC2A37C"/>
     <w:rsid w:val="007B2028"/>
   </w:style>
-  <w:style w:type="character" w:customStyle="1" w:styleId="Styl2">
-    <w:name w:val="Styl2"/>
-    <w:basedOn w:val="Domylnaczcionkaakapitu"/>
-    <w:uiPriority w:val="1"/>
-    <w:rsid w:val="00C545F0"/>
-  </w:style>
   <w:style w:type="paragraph" w:customStyle="1" w:styleId="3F2149EBADA941C6BDC333BAFD2F845B">
     <w:name w:val="3F2149EBADA941C6BDC333BAFD2F845B"/>
     <w:rsid w:val="00C545F0"/>
   </w:style>
-  <w:style w:type="paragraph" w:customStyle="1" w:styleId="277E24F56C164BF7B3D10C15D89AEBD0">
-    <w:name w:val="277E24F56C164BF7B3D10C15D89AEBD0"/>
-    <w:rsid w:val="00C545F0"/>
-  </w:style>
-  <w:style w:type="paragraph" w:customStyle="1" w:styleId="5A54BE8B02124928B26C6A77DCDDC861">
-    <w:name w:val="5A54BE8B02124928B26C6A77DCDDC861"/>
-    <w:rsid w:val="00C545F0"/>
-  </w:style>
-  <w:style w:type="paragraph" w:customStyle="1" w:styleId="68939F3796D4429F9F2A44DAF480F1C0">
-    <w:name w:val="68939F3796D4429F9F2A44DAF480F1C0"/>
-    <w:rsid w:val="00C545F0"/>
-  </w:style>
-  <w:style w:type="paragraph" w:customStyle="1" w:styleId="C55793E1BCB24B79BD09894C7B8BED6A">
-    <w:name w:val="C55793E1BCB24B79BD09894C7B8BED6A"/>
-    <w:rsid w:val="00C545F0"/>
+  <w:style w:type="paragraph" w:customStyle="1" w:styleId="D1217FF7EE43442BA3354D289652BC01">
+    <w:name w:val="D1217FF7EE43442BA3354D289652BC01"/>
+    <w:rsid w:val="004C341D"/>
   </w:style>
 </w:styles>
 </file>

</xml_diff>

<commit_message>
Wrong filling table bug fixed
</commit_message>
<xml_diff>
--- a/krolik_doswiadczalny.docx
+++ b/krolik_doswiadczalny.docx
@@ -921,16 +921,8 @@
               <w:rPr>
                 <w:szCs w:val="20"/>
               </w:rPr>
-              <w:t xml:space="preserve">Kac </w:t>
-            </w:r>
-            <w:proofErr w:type="spellStart"/>
-            <w:r>
-              <w:rPr>
-                <w:szCs w:val="20"/>
-              </w:rPr>
-              <w:t>bałagane</w:t>
-            </w:r>
-            <w:proofErr w:type="spellEnd"/>
+              <w:t>Kac</w:t>
+            </w:r>
           </w:p>
         </w:tc>
         <w:tc>
@@ -1073,45 +1065,15 @@
             <w:pPr>
               <w:rPr>
                 <w:szCs w:val="20"/>
+                <w:lang w:val="en-US"/>
               </w:rPr>
             </w:pPr>
             <w:proofErr w:type="spellStart"/>
             <w:r>
-              <w:t>Rw</w:t>
-            </w:r>
-            <w:proofErr w:type="spellEnd"/>
-            <w:r>
-              <w:t xml:space="preserve"> = </w:t>
-            </w:r>
-            <w:sdt>
-              <w:sdtPr>
-                <w:id w:val="-1784109588"/>
-                <w:placeholder>
-                  <w:docPart w:val="3F2149EBADA941C6BDC333BAFD2F845B"/>
-                </w:placeholder>
-                <w:comboBox>
-                  <w:listItem w:displayText="-" w:value="-"/>
-                  <w:listItem w:displayText="45" w:value="45"/>
-                  <w:listItem w:displayText="49" w:value="49"/>
-                  <w:listItem w:displayText="51" w:value="51"/>
-                  <w:listItem w:displayText="52" w:value="52"/>
-                  <w:listItem w:displayText="53" w:value="53"/>
-                  <w:listItem w:displayText="54" w:value="54"/>
-                  <w:listItem w:displayText="57" w:value="57"/>
-                </w:comboBox>
-              </w:sdtPr>
-              <w:sdtContent>
-                <w:r>
-                  <w:t>45</w:t>
-                </w:r>
-              </w:sdtContent>
-            </w:sdt>
-            <w:r>
-              <w:t xml:space="preserve"> </w:t>
-            </w:r>
-            <w:proofErr w:type="spellStart"/>
-            <w:r>
-              <w:t>dB</w:t>
+              <w:rPr>
+                <w:lang w:val="en-US"/>
+              </w:rPr>
+              <w:t>akustyka</w:t>
             </w:r>
             <w:proofErr w:type="spellEnd"/>
           </w:p>
@@ -1125,6 +1087,7 @@
             <w:pPr>
               <w:rPr>
                 <w:szCs w:val="20"/>
+                <w:lang w:val="en-US"/>
               </w:rPr>
             </w:pPr>
           </w:p>
@@ -1179,19 +1142,13 @@
                 <w:lang w:val="en-US"/>
               </w:rPr>
             </w:pPr>
+            <w:proofErr w:type="spellStart"/>
             <w:r>
               <w:rPr>
                 <w:szCs w:val="20"/>
                 <w:lang w:val="en-US"/>
               </w:rPr>
-              <w:t>p</w:t>
-            </w:r>
-            <w:proofErr w:type="spellStart"/>
-            <w:r>
-              <w:rPr>
-                <w:szCs w:val="20"/>
-              </w:rPr>
-              <w:t>yta</w:t>
+              <w:t>płyta</w:t>
             </w:r>
             <w:proofErr w:type="spellEnd"/>
           </w:p>
@@ -3125,41 +3082,6 @@
     </w:docPart>
     <w:docPart>
       <w:docPartPr>
-        <w:name w:val="3F2149EBADA941C6BDC333BAFD2F845B"/>
-        <w:category>
-          <w:name w:val="Ogólne"/>
-          <w:gallery w:val="placeholder"/>
-        </w:category>
-        <w:types>
-          <w:type w:val="bbPlcHdr"/>
-        </w:types>
-        <w:behaviors>
-          <w:behavior w:val="content"/>
-        </w:behaviors>
-        <w:guid w:val="{03EF95E9-CCA7-464A-B9A4-A49D1DECA098}"/>
-      </w:docPartPr>
-      <w:docPartBody>
-        <w:p>
-          <w:pPr>
-            <w:pStyle w:val="3F2149EBADA941C6BDC333BAFD2F845B"/>
-          </w:pPr>
-          <w:r>
-            <w:rPr>
-              <w:rStyle w:val="Tekstzastpczy"/>
-            </w:rPr>
-            <w:t xml:space="preserve">Wybierz </w:t>
-          </w:r>
-          <w:r>
-            <w:rPr>
-              <w:rStyle w:val="Tekstzastpczy"/>
-            </w:rPr>
-            <w:t>akustykę</w:t>
-          </w:r>
-        </w:p>
-      </w:docPartBody>
-    </w:docPart>
-    <w:docPart>
-      <w:docPartPr>
         <w:name w:val="D1217FF7EE43442BA3354D289652BC01"/>
         <w:category>
           <w:name w:val="Ogólne"/>
@@ -3261,23 +3183,28 @@
     <w:rsidRoot w:val="004B629E"/>
     <w:rsid w:val="00005A40"/>
     <w:rsid w:val="0011660A"/>
+    <w:rsid w:val="002C53A2"/>
     <w:rsid w:val="00311124"/>
     <w:rsid w:val="00333CA7"/>
     <w:rsid w:val="00371491"/>
     <w:rsid w:val="00374A1F"/>
     <w:rsid w:val="00377AB0"/>
+    <w:rsid w:val="00397E1F"/>
     <w:rsid w:val="0044390F"/>
     <w:rsid w:val="00453FAF"/>
     <w:rsid w:val="004B629E"/>
     <w:rsid w:val="004C341D"/>
+    <w:rsid w:val="005278D1"/>
     <w:rsid w:val="005A1CBC"/>
     <w:rsid w:val="00650F49"/>
     <w:rsid w:val="006B709F"/>
     <w:rsid w:val="00705174"/>
     <w:rsid w:val="00753D23"/>
     <w:rsid w:val="007B2028"/>
+    <w:rsid w:val="007E2039"/>
     <w:rsid w:val="007F3F19"/>
     <w:rsid w:val="00816FCC"/>
+    <w:rsid w:val="00827012"/>
     <w:rsid w:val="00910631"/>
     <w:rsid w:val="00924ABD"/>
     <w:rsid w:val="0093601B"/>
@@ -3290,6 +3217,7 @@
     <w:rsid w:val="00C545F0"/>
     <w:rsid w:val="00C84558"/>
     <w:rsid w:val="00C976A1"/>
+    <w:rsid w:val="00CE4786"/>
     <w:rsid w:val="00CF03DA"/>
     <w:rsid w:val="00DC092A"/>
     <w:rsid w:val="00E81563"/>
@@ -3758,10 +3686,6 @@
     <w:name w:val="EAB7688BF63C4764B3086C9F2BC2A37C"/>
     <w:rsid w:val="007B2028"/>
   </w:style>
-  <w:style w:type="paragraph" w:customStyle="1" w:styleId="3F2149EBADA941C6BDC333BAFD2F845B">
-    <w:name w:val="3F2149EBADA941C6BDC333BAFD2F845B"/>
-    <w:rsid w:val="00C545F0"/>
-  </w:style>
   <w:style w:type="paragraph" w:customStyle="1" w:styleId="D1217FF7EE43442BA3354D289652BC01">
     <w:name w:val="D1217FF7EE43442BA3354D289652BC01"/>
     <w:rsid w:val="004C341D"/>

</xml_diff>

<commit_message>
Serivce of multiple walls added!
</commit_message>
<xml_diff>
--- a/krolik_doswiadczalny.docx
+++ b/krolik_doswiadczalny.docx
@@ -425,7 +425,6 @@
                 <w:szCs w:val="24"/>
               </w:rPr>
             </w:pPr>
-            <w:proofErr w:type="spellStart"/>
             <w:r>
               <w:rPr>
                 <w:rFonts w:ascii="Lato" w:hAnsi="Lato"/>
@@ -435,19 +434,7 @@
                 <w:sz w:val="24"/>
                 <w:szCs w:val="24"/>
               </w:rPr>
-              <w:t>Facility</w:t>
-            </w:r>
-            <w:proofErr w:type="spellEnd"/>
-            <w:r>
-              <w:rPr>
-                <w:rFonts w:ascii="Lato" w:hAnsi="Lato"/>
-                <w:b/>
-                <w:bCs/>
-                <w:color w:val="FFFFFF" w:themeColor="background1"/>
-                <w:sz w:val="24"/>
-                <w:szCs w:val="24"/>
-              </w:rPr>
-              <w:t>:</w:t>
+              <w:t>Facility:</w:t>
             </w:r>
           </w:p>
         </w:tc>
@@ -624,19 +611,8 @@
                 <w:sz w:val="28"/>
                 <w:szCs w:val="28"/>
               </w:rPr>
-              <w:t xml:space="preserve">Project </w:t>
+              <w:t>Project Quotation</w:t>
             </w:r>
-            <w:proofErr w:type="spellStart"/>
-            <w:r>
-              <w:rPr>
-                <w:b/>
-                <w:bCs/>
-                <w:sz w:val="28"/>
-                <w:szCs w:val="28"/>
-              </w:rPr>
-              <w:t>Quotation</w:t>
-            </w:r>
-            <w:proofErr w:type="spellEnd"/>
             <w:r>
               <w:rPr>
                 <w:b/>
@@ -676,14 +652,17 @@
               <w:bottom w:val="single" w:sz="4" w:space="0" w:color="auto"/>
               <w:right w:val="nil"/>
             </w:tcBorders>
-            <w:shd w:val="clear" w:color="auto" w:fill="ADADAD" w:themeFill="background2" w:themeFillShade="BF"/>
-          </w:tcPr>
-          <w:p>
-            <w:pPr>
-              <w:rPr>
-                <w:b/>
+            <w:shd w:val="clear" w:color="auto" w:fill="A6A6A6" w:themeFill="background1" w:themeFillShade="A6"/>
+            <w:vAlign w:val="center"/>
+          </w:tcPr>
+          <w:p>
+            <w:pPr>
+              <w:rPr>
+                <w:rStyle w:val="Styl1"/>
+                <w:rFonts w:ascii="Lato" w:hAnsi="Lato"/>
                 <w:bCs/>
-                <w:szCs w:val="20"/>
+                <w:sz w:val="24"/>
+                <w:szCs w:val="24"/>
               </w:rPr>
             </w:pPr>
             <w:r>
@@ -694,15 +673,7 @@
                 <w:sz w:val="24"/>
                 <w:szCs w:val="24"/>
               </w:rPr>
-              <w:t>W1</w:t>
-            </w:r>
-            <w:r>
-              <w:rPr>
-                <w:b/>
-                <w:bCs/>
-                <w:szCs w:val="20"/>
-              </w:rPr>
-              <w:t>:</w:t>
+              <w:t>Wx:</w:t>
             </w:r>
           </w:p>
         </w:tc>
@@ -753,23 +724,13 @@
                 <w:szCs w:val="20"/>
               </w:rPr>
             </w:pPr>
-            <w:proofErr w:type="spellStart"/>
             <w:r>
               <w:rPr>
                 <w:rFonts w:ascii="Lato" w:hAnsi="Lato"/>
                 <w:sz w:val="20"/>
                 <w:szCs w:val="20"/>
               </w:rPr>
-              <w:t>Optimal</w:t>
-            </w:r>
-            <w:proofErr w:type="spellEnd"/>
-            <w:r>
-              <w:rPr>
-                <w:rFonts w:ascii="Lato" w:hAnsi="Lato"/>
-                <w:sz w:val="20"/>
-                <w:szCs w:val="20"/>
-              </w:rPr>
-              <w:t xml:space="preserve"> 110</w:t>
+              <w:t>Optimal 110</w:t>
             </w:r>
           </w:p>
         </w:tc>
@@ -833,23 +794,13 @@
                 <w:szCs w:val="20"/>
               </w:rPr>
             </w:pPr>
-            <w:proofErr w:type="spellStart"/>
             <w:r>
               <w:rPr>
                 <w:rFonts w:ascii="Lato" w:hAnsi="Lato"/>
                 <w:sz w:val="20"/>
                 <w:szCs w:val="20"/>
               </w:rPr>
-              <w:t>Dimensions</w:t>
-            </w:r>
-            <w:proofErr w:type="spellEnd"/>
-            <w:r>
-              <w:rPr>
-                <w:rFonts w:ascii="Lato" w:hAnsi="Lato"/>
-                <w:sz w:val="20"/>
-                <w:szCs w:val="20"/>
-              </w:rPr>
-              <w:t xml:space="preserve">: </w:t>
+              <w:t xml:space="preserve">Dimensions: </w:t>
             </w:r>
           </w:p>
           <w:p>
@@ -1005,25 +956,7 @@
                 <w:sz w:val="20"/>
                 <w:szCs w:val="20"/>
               </w:rPr>
-              <w:t xml:space="preserve">Parking / Suspension </w:t>
-            </w:r>
-            <w:proofErr w:type="spellStart"/>
-            <w:r>
-              <w:rPr>
-                <w:rFonts w:ascii="Lato" w:hAnsi="Lato"/>
-                <w:sz w:val="20"/>
-                <w:szCs w:val="20"/>
-              </w:rPr>
-              <w:t>type</w:t>
-            </w:r>
-            <w:proofErr w:type="spellEnd"/>
-            <w:r>
-              <w:rPr>
-                <w:rFonts w:ascii="Lato" w:hAnsi="Lato"/>
-                <w:sz w:val="20"/>
-                <w:szCs w:val="20"/>
-              </w:rPr>
-              <w:t>:</w:t>
+              <w:t>Parking / Suspension type:</w:t>
             </w:r>
           </w:p>
         </w:tc>
@@ -1081,59 +1014,13 @@
                 <w:szCs w:val="20"/>
               </w:rPr>
             </w:pPr>
-            <w:proofErr w:type="spellStart"/>
             <w:r>
               <w:rPr>
                 <w:rFonts w:ascii="Lato" w:hAnsi="Lato"/>
                 <w:sz w:val="20"/>
                 <w:szCs w:val="20"/>
               </w:rPr>
-              <w:t>Sugested</w:t>
-            </w:r>
-            <w:proofErr w:type="spellEnd"/>
-            <w:r>
-              <w:rPr>
-                <w:rFonts w:ascii="Lato" w:hAnsi="Lato"/>
-                <w:sz w:val="20"/>
-                <w:szCs w:val="20"/>
-              </w:rPr>
-              <w:t xml:space="preserve"> </w:t>
-            </w:r>
-            <w:proofErr w:type="spellStart"/>
-            <w:r>
-              <w:rPr>
-                <w:rFonts w:ascii="Lato" w:hAnsi="Lato"/>
-                <w:sz w:val="20"/>
-                <w:szCs w:val="20"/>
-              </w:rPr>
-              <w:t>number</w:t>
-            </w:r>
-            <w:proofErr w:type="spellEnd"/>
-            <w:r>
-              <w:rPr>
-                <w:rFonts w:ascii="Lato" w:hAnsi="Lato"/>
-                <w:sz w:val="20"/>
-                <w:szCs w:val="20"/>
-              </w:rPr>
-              <w:t xml:space="preserve"> of </w:t>
-            </w:r>
-            <w:proofErr w:type="spellStart"/>
-            <w:r>
-              <w:rPr>
-                <w:rFonts w:ascii="Lato" w:hAnsi="Lato"/>
-                <w:sz w:val="20"/>
-                <w:szCs w:val="20"/>
-              </w:rPr>
-              <w:t>modules</w:t>
-            </w:r>
-            <w:proofErr w:type="spellEnd"/>
-            <w:r>
-              <w:rPr>
-                <w:rFonts w:ascii="Lato" w:hAnsi="Lato"/>
-                <w:sz w:val="20"/>
-                <w:szCs w:val="20"/>
-              </w:rPr>
-              <w:t>:</w:t>
+              <w:t>Sugested number of modules:</w:t>
             </w:r>
           </w:p>
         </w:tc>
@@ -1217,7 +1104,6 @@
                 <w:lang w:val="en-US"/>
               </w:rPr>
             </w:pPr>
-            <w:proofErr w:type="spellStart"/>
             <w:r>
               <w:rPr>
                 <w:rFonts w:ascii="Lato" w:hAnsi="Lato"/>
@@ -1227,7 +1113,6 @@
               </w:rPr>
               <w:t>akustyka</w:t>
             </w:r>
-            <w:proofErr w:type="spellEnd"/>
           </w:p>
         </w:tc>
         <w:tc>
@@ -1262,23 +1147,13 @@
                 <w:szCs w:val="20"/>
               </w:rPr>
             </w:pPr>
-            <w:proofErr w:type="spellStart"/>
             <w:r>
               <w:rPr>
                 <w:rFonts w:ascii="Lato" w:hAnsi="Lato"/>
                 <w:sz w:val="20"/>
                 <w:szCs w:val="20"/>
               </w:rPr>
-              <w:t>Covered</w:t>
-            </w:r>
-            <w:proofErr w:type="spellEnd"/>
-            <w:r>
-              <w:rPr>
-                <w:rFonts w:ascii="Lato" w:hAnsi="Lato"/>
-                <w:sz w:val="20"/>
-                <w:szCs w:val="20"/>
-              </w:rPr>
-              <w:t xml:space="preserve"> with: </w:t>
+              <w:t xml:space="preserve">Covered with: </w:t>
             </w:r>
           </w:p>
         </w:tc>
@@ -1296,7 +1171,6 @@
                 <w:lang w:val="en-US"/>
               </w:rPr>
             </w:pPr>
-            <w:proofErr w:type="spellStart"/>
             <w:r>
               <w:rPr>
                 <w:rFonts w:ascii="Lato" w:hAnsi="Lato"/>
@@ -1304,9 +1178,8 @@
                 <w:szCs w:val="20"/>
                 <w:lang w:val="en-US"/>
               </w:rPr>
-              <w:t>płyta</w:t>
+              <w:t>Płyta</w:t>
             </w:r>
-            <w:proofErr w:type="spellEnd"/>
           </w:p>
         </w:tc>
         <w:tc>
@@ -1341,23 +1214,13 @@
                 <w:szCs w:val="20"/>
               </w:rPr>
             </w:pPr>
-            <w:proofErr w:type="spellStart"/>
             <w:r>
               <w:rPr>
                 <w:rFonts w:ascii="Lato" w:hAnsi="Lato"/>
                 <w:sz w:val="20"/>
                 <w:szCs w:val="20"/>
               </w:rPr>
-              <w:t>Operation</w:t>
-            </w:r>
-            <w:proofErr w:type="spellEnd"/>
-            <w:r>
-              <w:rPr>
-                <w:rFonts w:ascii="Lato" w:hAnsi="Lato"/>
-                <w:sz w:val="20"/>
-                <w:szCs w:val="20"/>
-              </w:rPr>
-              <w:t>:</w:t>
+              <w:t>Operation:</w:t>
             </w:r>
           </w:p>
         </w:tc>
@@ -1415,23 +1278,13 @@
                 <w:szCs w:val="20"/>
               </w:rPr>
             </w:pPr>
-            <w:proofErr w:type="spellStart"/>
             <w:r>
               <w:rPr>
                 <w:rFonts w:ascii="Lato" w:hAnsi="Lato"/>
                 <w:sz w:val="20"/>
                 <w:szCs w:val="20"/>
               </w:rPr>
-              <w:t>Rail</w:t>
-            </w:r>
-            <w:proofErr w:type="spellEnd"/>
-            <w:r>
-              <w:rPr>
-                <w:rFonts w:ascii="Lato" w:hAnsi="Lato"/>
-                <w:sz w:val="20"/>
-                <w:szCs w:val="20"/>
-              </w:rPr>
-              <w:t xml:space="preserve">: </w:t>
+              <w:t xml:space="preserve">Rail: </w:t>
             </w:r>
           </w:p>
         </w:tc>
@@ -1489,23 +1342,13 @@
                 <w:szCs w:val="20"/>
               </w:rPr>
             </w:pPr>
-            <w:proofErr w:type="spellStart"/>
             <w:r>
               <w:rPr>
                 <w:rFonts w:ascii="Lato" w:hAnsi="Lato"/>
                 <w:sz w:val="20"/>
                 <w:szCs w:val="20"/>
               </w:rPr>
-              <w:t>Doors</w:t>
-            </w:r>
-            <w:proofErr w:type="spellEnd"/>
-            <w:r>
-              <w:rPr>
-                <w:rFonts w:ascii="Lato" w:hAnsi="Lato"/>
-                <w:sz w:val="20"/>
-                <w:szCs w:val="20"/>
-              </w:rPr>
-              <w:t xml:space="preserve">: </w:t>
+              <w:t xml:space="preserve">Doors: </w:t>
             </w:r>
           </w:p>
         </w:tc>
@@ -1569,25 +1412,7 @@
                 <w:sz w:val="20"/>
                 <w:szCs w:val="20"/>
               </w:rPr>
-              <w:t xml:space="preserve">Glass </w:t>
-            </w:r>
-            <w:proofErr w:type="spellStart"/>
-            <w:r>
-              <w:rPr>
-                <w:rFonts w:ascii="Lato" w:hAnsi="Lato"/>
-                <w:sz w:val="20"/>
-                <w:szCs w:val="20"/>
-              </w:rPr>
-              <w:t>Modules</w:t>
-            </w:r>
-            <w:proofErr w:type="spellEnd"/>
-            <w:r>
-              <w:rPr>
-                <w:rFonts w:ascii="Lato" w:hAnsi="Lato"/>
-                <w:sz w:val="20"/>
-                <w:szCs w:val="20"/>
-              </w:rPr>
-              <w:t xml:space="preserve">: </w:t>
+              <w:t xml:space="preserve">Glass Modules: </w:t>
             </w:r>
           </w:p>
         </w:tc>
@@ -1646,23 +1471,13 @@
                 <w:szCs w:val="20"/>
               </w:rPr>
             </w:pPr>
-            <w:proofErr w:type="spellStart"/>
             <w:r>
               <w:rPr>
                 <w:rFonts w:ascii="Lato" w:hAnsi="Lato"/>
                 <w:sz w:val="20"/>
                 <w:szCs w:val="20"/>
               </w:rPr>
-              <w:t>Profiles</w:t>
-            </w:r>
-            <w:proofErr w:type="spellEnd"/>
-            <w:r>
-              <w:rPr>
-                <w:rFonts w:ascii="Lato" w:hAnsi="Lato"/>
-                <w:sz w:val="20"/>
-                <w:szCs w:val="20"/>
-              </w:rPr>
-              <w:t xml:space="preserve">: </w:t>
+              <w:t xml:space="preserve">Profiles: </w:t>
             </w:r>
           </w:p>
         </w:tc>
@@ -1721,41 +1536,13 @@
                 <w:szCs w:val="20"/>
               </w:rPr>
             </w:pPr>
-            <w:proofErr w:type="spellStart"/>
             <w:r>
               <w:rPr>
                 <w:rFonts w:ascii="Lato" w:hAnsi="Lato"/>
                 <w:sz w:val="20"/>
                 <w:szCs w:val="20"/>
               </w:rPr>
-              <w:t>Additional</w:t>
-            </w:r>
-            <w:proofErr w:type="spellEnd"/>
-            <w:r>
-              <w:rPr>
-                <w:rFonts w:ascii="Lato" w:hAnsi="Lato"/>
-                <w:sz w:val="20"/>
-                <w:szCs w:val="20"/>
-              </w:rPr>
-              <w:t xml:space="preserve"> </w:t>
-            </w:r>
-            <w:proofErr w:type="spellStart"/>
-            <w:r>
-              <w:rPr>
-                <w:rFonts w:ascii="Lato" w:hAnsi="Lato"/>
-                <w:sz w:val="20"/>
-                <w:szCs w:val="20"/>
-              </w:rPr>
-              <w:t>Equipment</w:t>
-            </w:r>
-            <w:proofErr w:type="spellEnd"/>
-            <w:r>
-              <w:rPr>
-                <w:rFonts w:ascii="Lato" w:hAnsi="Lato"/>
-                <w:sz w:val="20"/>
-                <w:szCs w:val="20"/>
-              </w:rPr>
-              <w:t>:</w:t>
+              <w:t>Additional Equipment:</w:t>
             </w:r>
           </w:p>
         </w:tc>
@@ -1772,7 +1559,6 @@
                 <w:szCs w:val="20"/>
               </w:rPr>
             </w:pPr>
-            <w:proofErr w:type="spellStart"/>
             <w:r>
               <w:rPr>
                 <w:rFonts w:ascii="Lato" w:hAnsi="Lato"/>
@@ -1781,7 +1567,6 @@
               </w:rPr>
               <w:t>adyszynal</w:t>
             </w:r>
-            <w:proofErr w:type="spellEnd"/>
           </w:p>
         </w:tc>
         <w:tc>
@@ -1850,7 +1635,6 @@
                 <w:szCs w:val="20"/>
               </w:rPr>
             </w:pPr>
-            <w:proofErr w:type="spellStart"/>
             <w:r>
               <w:rPr>
                 <w:b/>
@@ -1858,17 +1642,7 @@
                 <w:color w:val="FFFFFF" w:themeColor="background1"/>
                 <w:szCs w:val="20"/>
               </w:rPr>
-              <w:t>Additional</w:t>
-            </w:r>
-            <w:proofErr w:type="spellEnd"/>
-            <w:r>
-              <w:rPr>
-                <w:b/>
-                <w:bCs/>
-                <w:color w:val="FFFFFF" w:themeColor="background1"/>
-                <w:szCs w:val="20"/>
-              </w:rPr>
-              <w:t xml:space="preserve"> notes:</w:t>
+              <w:t>Additional notes:</w:t>
             </w:r>
           </w:p>
         </w:tc>
@@ -1923,7 +1697,6 @@
                 <w:szCs w:val="20"/>
               </w:rPr>
             </w:pPr>
-            <w:proofErr w:type="spellStart"/>
             <w:r>
               <w:rPr>
                 <w:rFonts w:ascii="Lato" w:hAnsi="Lato"/>
@@ -1932,7 +1705,6 @@
               </w:rPr>
               <w:t>hihihihahahaha</w:t>
             </w:r>
-            <w:proofErr w:type="spellEnd"/>
           </w:p>
         </w:tc>
         <w:tc>
@@ -3595,7 +3367,11 @@
     <w:rsidRoot w:val="004B629E"/>
     <w:rsid w:val="000045D5"/>
     <w:rsid w:val="00005A40"/>
+    <w:rsid w:val="000B36AD"/>
+    <w:rsid w:val="0011521F"/>
     <w:rsid w:val="0011660A"/>
+    <w:rsid w:val="00274E42"/>
+    <w:rsid w:val="002A4B89"/>
     <w:rsid w:val="002C53A2"/>
     <w:rsid w:val="00311124"/>
     <w:rsid w:val="00333CA7"/>
@@ -3611,14 +3387,17 @@
     <w:rsid w:val="005278D1"/>
     <w:rsid w:val="00544658"/>
     <w:rsid w:val="0057081F"/>
+    <w:rsid w:val="005A089D"/>
     <w:rsid w:val="005A1CBC"/>
     <w:rsid w:val="00636A3D"/>
     <w:rsid w:val="00650F49"/>
     <w:rsid w:val="006B709F"/>
     <w:rsid w:val="00705174"/>
     <w:rsid w:val="00753D23"/>
+    <w:rsid w:val="0077582B"/>
     <w:rsid w:val="007B2028"/>
     <w:rsid w:val="007E2039"/>
+    <w:rsid w:val="007F1F05"/>
     <w:rsid w:val="007F3F19"/>
     <w:rsid w:val="00816FCC"/>
     <w:rsid w:val="00827012"/>
@@ -3629,21 +3408,28 @@
     <w:rsid w:val="00964355"/>
     <w:rsid w:val="00A22528"/>
     <w:rsid w:val="00A36251"/>
+    <w:rsid w:val="00AB65BC"/>
     <w:rsid w:val="00AC4255"/>
     <w:rsid w:val="00AC6BC4"/>
+    <w:rsid w:val="00AD061D"/>
     <w:rsid w:val="00AD7DCB"/>
     <w:rsid w:val="00B345B2"/>
+    <w:rsid w:val="00B8134A"/>
     <w:rsid w:val="00B9467B"/>
     <w:rsid w:val="00BF7380"/>
+    <w:rsid w:val="00C244D3"/>
     <w:rsid w:val="00C545F0"/>
+    <w:rsid w:val="00C73640"/>
     <w:rsid w:val="00C84558"/>
     <w:rsid w:val="00C976A1"/>
     <w:rsid w:val="00CE4786"/>
     <w:rsid w:val="00CF03DA"/>
+    <w:rsid w:val="00D60EA5"/>
     <w:rsid w:val="00D85957"/>
     <w:rsid w:val="00DC092A"/>
     <w:rsid w:val="00E81563"/>
     <w:rsid w:val="00F82133"/>
+    <w:rsid w:val="00FE4E0F"/>
   </w:rsids>
   <m:mathPr>
     <m:mathFont m:val="Cambria Math"/>

</xml_diff>

<commit_message>
Version alpha 0.1! :)
</commit_message>
<xml_diff>
--- a/krolik_doswiadczalny.docx
+++ b/krolik_doswiadczalny.docx
@@ -20,16 +20,16 @@
           <w:szCs w:val="20"/>
         </w:rPr>
         <w:drawing>
-          <wp:anchor distT="0" distB="0" distL="114300" distR="114300" simplePos="0" relativeHeight="251658240" behindDoc="0" locked="0" layoutInCell="1" allowOverlap="1" wp14:anchorId="36AD7B66" wp14:editId="2A23B575">
+          <wp:anchor distT="0" distB="0" distL="114300" distR="114300" simplePos="0" relativeHeight="251658240" behindDoc="0" locked="0" layoutInCell="1" allowOverlap="1" wp14:anchorId="36AD7B66" wp14:editId="073BBF6A">
             <wp:simplePos x="0" y="0"/>
-            <wp:positionH relativeFrom="column">
-              <wp:posOffset>-890270</wp:posOffset>
+            <wp:positionH relativeFrom="page">
+              <wp:posOffset>-14031</wp:posOffset>
             </wp:positionH>
             <wp:positionV relativeFrom="page">
-              <wp:posOffset>9525</wp:posOffset>
+              <wp:posOffset>7620</wp:posOffset>
             </wp:positionV>
-            <wp:extent cx="7524750" cy="7751445"/>
-            <wp:effectExtent l="0" t="0" r="0" b="1905"/>
+            <wp:extent cx="7573071" cy="7840980"/>
+            <wp:effectExtent l="0" t="0" r="8890" b="7620"/>
             <wp:wrapTopAndBottom/>
             <wp:docPr id="1327371546" name="Obraz 2"/>
             <wp:cNvGraphicFramePr>
@@ -39,20 +39,19 @@
               <a:graphicData uri="http://schemas.openxmlformats.org/drawingml/2006/picture">
                 <pic:pic xmlns:pic="http://schemas.openxmlformats.org/drawingml/2006/picture">
                   <pic:nvPicPr>
-                    <pic:cNvPr id="0" name="Picture 4"/>
+                    <pic:cNvPr id="1327371546" name="Obraz 2"/>
                     <pic:cNvPicPr>
                       <a:picLocks noChangeAspect="1" noChangeArrowheads="1"/>
                     </pic:cNvPicPr>
                   </pic:nvPicPr>
                   <pic:blipFill>
-                    <a:blip r:embed="rId7">
+                    <a:blip r:embed="rId8">
                       <a:extLst>
                         <a:ext uri="{28A0092B-C50C-407E-A947-70E740481C1C}">
                           <a14:useLocalDpi xmlns:a14="http://schemas.microsoft.com/office/drawing/2010/main" val="0"/>
                         </a:ext>
                       </a:extLst>
                     </a:blip>
-                    <a:srcRect/>
                     <a:stretch>
                       <a:fillRect/>
                     </a:stretch>
@@ -60,7 +59,7 @@
                   <pic:spPr bwMode="auto">
                     <a:xfrm>
                       <a:off x="0" y="0"/>
-                      <a:ext cx="7524750" cy="7751445"/>
+                      <a:ext cx="7575880" cy="7843888"/>
                     </a:xfrm>
                     <a:prstGeom prst="rect">
                       <a:avLst/>
@@ -140,7 +139,7 @@
         <w:spacing w:after="0"/>
         <w:ind w:left="-426"/>
         <w:rPr>
-          <w:lang w:val="en-GB"/>
+          <w:lang w:val="en-US"/>
         </w:rPr>
       </w:pPr>
       <w:sdt>
@@ -148,16 +147,16 @@
           <w:rPr>
             <w:color w:val="747474" w:themeColor="background2" w:themeShade="80"/>
             <w:szCs w:val="20"/>
-            <w:lang w:val="en-GB"/>
+            <w:lang w:val="en-US"/>
           </w:rPr>
           <w:id w:val="-975749429"/>
           <w:placeholder>
             <w:docPart w:val="EAB7688BF63C4764B3086C9F2BC2A37C"/>
           </w:placeholder>
           <w:comboBox>
-            <w:listItem w:displayText="Sebastian Kalota (+48 501 286 402 e-mail: international@optimalpoland.com.pl)" w:value="Sebastian Kalota "/>
+            <w:listItem w:displayText="Mateusz Lipert (+48 501 286 402 e-mail: international@optimalpoland.com.pl)" w:value="Mateusz Lipert "/>
             <w:listItem w:displayText="Michał Magala (+48 690 371 355 e-mail: m.magala@optimalpoland.com.pl)" w:value="Michał Magala (+48 690 371 355 e-mail: m.magala@optimalpoland.com.pl)"/>
-            <w:listItem w:displayText="Barbara Bielińska (+48 48 734 855 590 e-mail: b.bielinska@optimalpoland.com.pl)" w:value="Barbara Bielińska (+48 48 734 855 590 e-mail: b.bielinska@optimalpoland.com.pl)"/>
+            <w:listItem w:displayText="Bartosz Ogorzałek (+48 48 734 855 590 e-mail: international@optimalpoland.com.pl)" w:value="Bartosz Ogorzałek (+48 48 734 855 590 e-mail: international@optimalpoland.com.pl)"/>
           </w:comboBox>
         </w:sdtPr>
         <w:sdtContent>
@@ -165,7 +164,7 @@
             <w:rPr>
               <w:color w:val="747474" w:themeColor="background2" w:themeShade="80"/>
               <w:szCs w:val="20"/>
-              <w:lang w:val="en-GB"/>
+              <w:lang w:val="en-US"/>
             </w:rPr>
             <w:t>Michał Magala (+48 690 371 355 e-mail: m.magala@optimalpoland.com.pl)</w:t>
           </w:r>
@@ -173,7 +172,7 @@
       </w:sdt>
       <w:r>
         <w:rPr>
-          <w:lang w:val="en-GB"/>
+          <w:lang w:val="en-US"/>
         </w:rPr>
         <w:t xml:space="preserve"> </w:t>
       </w:r>
@@ -185,7 +184,7 @@
           <w:kern w:val="0"/>
           <w:sz w:val="20"/>
           <w:szCs w:val="22"/>
-          <w:lang w:val="en-GB"/>
+          <w:lang w:val="en-US"/>
           <w14:ligatures w14:val="none"/>
         </w:rPr>
       </w:pPr>
@@ -220,7 +219,7 @@
                     </pic:cNvPicPr>
                   </pic:nvPicPr>
                   <pic:blipFill>
-                    <a:blip r:embed="rId8">
+                    <a:blip r:embed="rId9">
                       <a:extLst>
                         <a:ext uri="{28A0092B-C50C-407E-A947-70E740481C1C}">
                           <a14:useLocalDpi xmlns:a14="http://schemas.microsoft.com/office/drawing/2010/main" val="0"/>
@@ -287,7 +286,7 @@
                     </pic:cNvPicPr>
                   </pic:nvPicPr>
                   <pic:blipFill>
-                    <a:blip r:embed="rId9">
+                    <a:blip r:embed="rId10">
                       <a:extLst>
                         <a:ext uri="{28A0092B-C50C-407E-A947-70E740481C1C}">
                           <a14:useLocalDpi xmlns:a14="http://schemas.microsoft.com/office/drawing/2010/main" val="0"/>
@@ -326,7 +325,7 @@
       </w:r>
       <w:r>
         <w:rPr>
-          <w:lang w:val="en-GB"/>
+          <w:lang w:val="en-US"/>
         </w:rPr>
         <w:br w:type="page"/>
       </w:r>
@@ -335,26 +334,37 @@
       <w:pPr>
         <w:pStyle w:val="Zawartoramki"/>
         <w:spacing w:after="0"/>
-        <w:ind w:left="-426"/>
         <w:rPr>
           <w:noProof/>
-          <w:lang w:val="en-GB"/>
-        </w:rPr>
-      </w:pPr>
-      <w:r>
+          <w:lang w:val="en-US"/>
+        </w:rPr>
+        <w:sectPr>
+          <w:headerReference w:type="default" r:id="rId11"/>
+          <w:footerReference w:type="default" r:id="rId12"/>
+          <w:headerReference w:type="first" r:id="rId13"/>
+          <w:footerReference w:type="first" r:id="rId14"/>
+          <w:pgSz w:w="11906" w:h="16838"/>
+          <w:pgMar w:top="1417" w:right="1417" w:bottom="1417" w:left="1417" w:header="708" w:footer="708" w:gutter="0"/>
+          <w:cols w:space="708"/>
+          <w:titlePg/>
+          <w:docGrid w:linePitch="360"/>
+        </w:sectPr>
+      </w:pPr>
+    </w:p>
+    <w:p>
+      <w:pPr>
+        <w:pStyle w:val="Zawartoramki"/>
+        <w:spacing w:after="0"/>
         <w:rPr>
           <w:noProof/>
-          <w:lang w:val="en-GB"/>
-        </w:rPr>
-        <w:lastRenderedPageBreak/>
-        <w:t xml:space="preserve"> </w:t>
-      </w:r>
+          <w:lang w:val="en-US"/>
+        </w:rPr>
+      </w:pPr>
     </w:p>
     <w:tbl>
       <w:tblPr>
         <w:tblStyle w:val="Tabela-Siatka"/>
         <w:tblW w:w="10552" w:type="dxa"/>
-        <w:tblInd w:w="-729" w:type="dxa"/>
         <w:tblLook w:val="04A0" w:firstRow="1" w:lastRow="0" w:firstColumn="1" w:lastColumn="0" w:noHBand="0" w:noVBand="1"/>
       </w:tblPr>
       <w:tblGrid>
@@ -1773,11 +1783,11 @@
       <w:tblPr>
         <w:tblStyle w:val="Tabela-Siatka"/>
         <w:tblpPr w:leftFromText="141" w:rightFromText="141" w:vertAnchor="text" w:horzAnchor="margin" w:tblpXSpec="center" w:tblpY="179"/>
-        <w:tblW w:w="10206" w:type="dxa"/>
+        <w:tblW w:w="10348" w:type="dxa"/>
         <w:tblLook w:val="04A0" w:firstRow="1" w:lastRow="0" w:firstColumn="1" w:lastColumn="0" w:noHBand="0" w:noVBand="1"/>
       </w:tblPr>
       <w:tblGrid>
-        <w:gridCol w:w="7772"/>
+        <w:gridCol w:w="7914"/>
         <w:gridCol w:w="24"/>
         <w:gridCol w:w="2410"/>
       </w:tblGrid>
@@ -1787,7 +1797,7 @@
         </w:trPr>
         <w:tc>
           <w:tcPr>
-            <w:tcW w:w="7772" w:type="dxa"/>
+            <w:tcW w:w="7914" w:type="dxa"/>
             <w:tcBorders>
               <w:top w:val="nil"/>
               <w:left w:val="nil"/>
@@ -1864,7 +1874,7 @@
         </w:trPr>
         <w:tc>
           <w:tcPr>
-            <w:tcW w:w="7796" w:type="dxa"/>
+            <w:tcW w:w="7938" w:type="dxa"/>
             <w:gridSpan w:val="2"/>
             <w:tcBorders>
               <w:top w:val="single" w:sz="4" w:space="0" w:color="auto"/>
@@ -1940,60 +1950,1304 @@
       <w:pPr>
         <w:rPr>
           <w:szCs w:val="20"/>
+          <w:lang w:val="en-GB"/>
+        </w:rPr>
+      </w:pPr>
+    </w:p>
+    <w:tbl>
+      <w:tblPr>
+        <w:tblStyle w:val="Tabela-Siatka"/>
+        <w:tblpPr w:leftFromText="141" w:rightFromText="141" w:vertAnchor="text" w:horzAnchor="margin" w:tblpY="8"/>
+        <w:tblW w:w="10348" w:type="dxa"/>
+        <w:tblLook w:val="04A0" w:firstRow="1" w:lastRow="0" w:firstColumn="1" w:lastColumn="0" w:noHBand="0" w:noVBand="1"/>
+      </w:tblPr>
+      <w:tblGrid>
+        <w:gridCol w:w="7938"/>
+        <w:gridCol w:w="2410"/>
+      </w:tblGrid>
+      <w:tr>
+        <w:trPr>
+          <w:trHeight w:val="407"/>
+        </w:trPr>
+        <w:tc>
+          <w:tcPr>
+            <w:tcW w:w="7938" w:type="dxa"/>
+            <w:tcBorders>
+              <w:top w:val="nil"/>
+              <w:left w:val="nil"/>
+              <w:bottom w:val="single" w:sz="4" w:space="0" w:color="auto"/>
+              <w:right w:val="nil"/>
+            </w:tcBorders>
+            <w:shd w:val="clear" w:color="auto" w:fill="A6A6A6" w:themeFill="background1" w:themeFillShade="A6"/>
+            <w:vAlign w:val="center"/>
+            <w:hideMark/>
+          </w:tcPr>
+          <w:p>
+            <w:pPr>
+              <w:pStyle w:val="western"/>
+              <w:spacing w:before="0" w:beforeAutospacing="0" w:after="0" w:line="259" w:lineRule="auto"/>
+              <w:ind w:left="37" w:right="113"/>
+              <w:rPr>
+                <w:b/>
+                <w:bCs/>
+                <w:color w:val="FFFFFF" w:themeColor="background1"/>
+                <w:szCs w:val="20"/>
+                <w:lang w:eastAsia="en-US"/>
+              </w:rPr>
+            </w:pPr>
+            <w:r>
+              <w:rPr>
+                <w:b/>
+                <w:bCs/>
+                <w:color w:val="FFFFFF" w:themeColor="background1"/>
+                <w:szCs w:val="20"/>
+              </w:rPr>
+              <w:t xml:space="preserve">Transport </w:t>
+            </w:r>
+            <w:proofErr w:type="spellStart"/>
+            <w:r>
+              <w:rPr>
+                <w:b/>
+                <w:bCs/>
+                <w:color w:val="FFFFFF" w:themeColor="background1"/>
+                <w:szCs w:val="20"/>
+              </w:rPr>
+              <w:t>rates</w:t>
+            </w:r>
+            <w:proofErr w:type="spellEnd"/>
+            <w:r>
+              <w:rPr>
+                <w:b/>
+                <w:bCs/>
+                <w:color w:val="FFFFFF" w:themeColor="background1"/>
+                <w:szCs w:val="20"/>
+              </w:rPr>
+              <w:t>:</w:t>
+            </w:r>
+          </w:p>
+        </w:tc>
+        <w:tc>
+          <w:tcPr>
+            <w:tcW w:w="2410" w:type="dxa"/>
+            <w:tcBorders>
+              <w:top w:val="nil"/>
+              <w:left w:val="nil"/>
+              <w:bottom w:val="single" w:sz="4" w:space="0" w:color="auto"/>
+              <w:right w:val="nil"/>
+            </w:tcBorders>
+            <w:shd w:val="clear" w:color="auto" w:fill="A6A6A6" w:themeFill="background1" w:themeFillShade="A6"/>
+            <w:vAlign w:val="center"/>
+          </w:tcPr>
+          <w:p>
+            <w:pPr>
+              <w:rPr>
+                <w:b/>
+                <w:bCs/>
+                <w:color w:val="FFFFFF" w:themeColor="background1"/>
+                <w:szCs w:val="20"/>
+              </w:rPr>
+            </w:pPr>
+          </w:p>
+        </w:tc>
+      </w:tr>
+      <w:tr>
+        <w:trPr>
+          <w:trHeight w:val="304"/>
+        </w:trPr>
+        <w:tc>
+          <w:tcPr>
+            <w:tcW w:w="7938" w:type="dxa"/>
+            <w:tcBorders>
+              <w:top w:val="single" w:sz="4" w:space="0" w:color="auto"/>
+              <w:left w:val="single" w:sz="4" w:space="0" w:color="auto"/>
+              <w:bottom w:val="single" w:sz="4" w:space="0" w:color="auto"/>
+              <w:right w:val="single" w:sz="4" w:space="0" w:color="auto"/>
+            </w:tcBorders>
+            <w:vAlign w:val="center"/>
+            <w:hideMark/>
+          </w:tcPr>
+          <w:p>
+            <w:pPr>
+              <w:rPr>
+                <w:szCs w:val="20"/>
+                <w:lang w:val="en-GB"/>
+              </w:rPr>
+            </w:pPr>
+            <w:r>
+              <w:rPr>
+                <w:rFonts w:ascii="Lato" w:hAnsi="Lato"/>
+                <w:b/>
+                <w:bCs/>
+                <w:sz w:val="20"/>
+                <w:szCs w:val="20"/>
+                <w:lang w:val="en-GB"/>
+              </w:rPr>
+              <w:t>Transport cost (</w:t>
+            </w:r>
+            <w:proofErr w:type="spellStart"/>
+            <w:r>
+              <w:rPr>
+                <w:rFonts w:ascii="Lato" w:hAnsi="Lato"/>
+                <w:b/>
+                <w:bCs/>
+                <w:sz w:val="20"/>
+                <w:szCs w:val="20"/>
+                <w:lang w:val="en-GB"/>
+              </w:rPr>
+              <w:t>miejscowość</w:t>
+            </w:r>
+            <w:proofErr w:type="spellEnd"/>
+            <w:r>
+              <w:rPr>
+                <w:rFonts w:ascii="Lato" w:hAnsi="Lato"/>
+                <w:b/>
+                <w:bCs/>
+                <w:sz w:val="20"/>
+                <w:szCs w:val="20"/>
+                <w:lang w:val="en-GB"/>
+              </w:rPr>
+              <w:t>)</w:t>
+            </w:r>
+            <w:r>
+              <w:rPr>
+                <w:b/>
+                <w:bCs/>
+                <w:szCs w:val="20"/>
+                <w:lang w:val="en-GB"/>
+              </w:rPr>
+              <w:t xml:space="preserve">  : </w:t>
+            </w:r>
+            <w:r>
+              <w:rPr>
+                <w:rStyle w:val="Styl2"/>
+                <w:lang w:val="en-GB"/>
+              </w:rPr>
+              <w:t xml:space="preserve"> </w:t>
+            </w:r>
+            <w:sdt>
+              <w:sdtPr>
+                <w:rPr>
+                  <w:rStyle w:val="Styl2"/>
+                  <w:rFonts w:ascii="Lato" w:hAnsi="Lato"/>
+                  <w:sz w:val="20"/>
+                  <w:szCs w:val="20"/>
+                  <w:lang w:val="en-GB"/>
+                </w:rPr>
+                <w:id w:val="-618064494"/>
+                <w:placeholder>
+                  <w:docPart w:val="F2D8582A4D50444BA1BCBAFA6EF41B86"/>
+                </w:placeholder>
+                <w:comboBox>
+                  <w:listItem w:displayText="-" w:value="-"/>
+                  <w:listItem w:displayText="Ex-Works" w:value="Ex-Works"/>
+                  <w:listItem w:displayText="Single Transport (Rails&amp;Walls)" w:value="Single Transport (Rails&amp;Walls)"/>
+                  <w:listItem w:displayText="Rails only (Stage 1)" w:value="Rails only (Stage 1)"/>
+                  <w:listItem w:displayText="Modules (Stage 2)" w:value="Modules (Stage 2)"/>
+                </w:comboBox>
+              </w:sdtPr>
+              <w:sdtContent>
+                <w:r>
+                  <w:rPr>
+                    <w:rStyle w:val="Styl2"/>
+                    <w:rFonts w:ascii="Lato" w:hAnsi="Lato"/>
+                    <w:sz w:val="20"/>
+                    <w:szCs w:val="20"/>
+                    <w:lang w:val="en-GB"/>
+                  </w:rPr>
+                  <w:t>Modules (Stage 2)</w:t>
+                </w:r>
+              </w:sdtContent>
+            </w:sdt>
+          </w:p>
+        </w:tc>
+        <w:tc>
+          <w:tcPr>
+            <w:tcW w:w="2410" w:type="dxa"/>
+            <w:tcBorders>
+              <w:top w:val="single" w:sz="4" w:space="0" w:color="auto"/>
+              <w:left w:val="single" w:sz="4" w:space="0" w:color="auto"/>
+              <w:bottom w:val="single" w:sz="4" w:space="0" w:color="auto"/>
+              <w:right w:val="single" w:sz="4" w:space="0" w:color="auto"/>
+            </w:tcBorders>
+            <w:vAlign w:val="center"/>
+            <w:hideMark/>
+          </w:tcPr>
+          <w:p>
+            <w:pPr>
+              <w:jc w:val="center"/>
+              <w:rPr>
+                <w:szCs w:val="20"/>
+                <w:lang w:val="en-GB"/>
+              </w:rPr>
+            </w:pPr>
+            <w:r>
+              <w:rPr>
+                <w:b/>
+                <w:bCs/>
+                <w:lang w:val="en-GB"/>
+              </w:rPr>
+              <w:t xml:space="preserve"> </w:t>
+            </w:r>
+            <w:sdt>
+              <w:sdtPr>
+                <w:rPr>
+                  <w:rStyle w:val="Styl1"/>
+                  <w:b w:val="0"/>
+                  <w:bCs/>
+                </w:rPr>
+                <w:id w:val="-603497040"/>
+                <w:placeholder>
+                  <w:docPart w:val="52A659DDF8B34231B94ABD37CE182CCE"/>
+                </w:placeholder>
+                <w:showingPlcHdr/>
+              </w:sdtPr>
+              <w:sdtContent>
+                <w:r>
+                  <w:rPr>
+                    <w:rStyle w:val="Tekstzastpczy"/>
+                    <w:rFonts w:ascii="Lato" w:hAnsi="Lato"/>
+                    <w:sz w:val="20"/>
+                    <w:szCs w:val="20"/>
+                    <w:lang w:val="en-GB"/>
+                  </w:rPr>
+                  <w:t>Cena transportu</w:t>
+                </w:r>
+              </w:sdtContent>
+            </w:sdt>
+            <w:r>
+              <w:rPr>
+                <w:b/>
+                <w:bCs/>
+                <w:lang w:val="en-GB"/>
+              </w:rPr>
+              <w:t xml:space="preserve"> </w:t>
+            </w:r>
+            <w:r>
+              <w:rPr>
+                <w:rFonts w:ascii="Lato" w:hAnsi="Lato"/>
+                <w:b/>
+                <w:bCs/>
+                <w:sz w:val="20"/>
+                <w:szCs w:val="20"/>
+                <w:lang w:val="en-GB"/>
+              </w:rPr>
+              <w:t>EUR</w:t>
+            </w:r>
+            <w:r>
+              <w:rPr>
+                <w:b/>
+                <w:bCs/>
+                <w:lang w:val="en-GB"/>
+              </w:rPr>
+              <w:t xml:space="preserve"> </w:t>
+            </w:r>
+          </w:p>
+        </w:tc>
+      </w:tr>
+    </w:tbl>
+    <w:p>
+      <w:pPr>
+        <w:rPr>
+          <w:szCs w:val="20"/>
+          <w:lang w:val="en-GB"/>
+        </w:rPr>
+      </w:pPr>
+    </w:p>
+    <w:tbl>
+      <w:tblPr>
+        <w:tblStyle w:val="Tabela-Siatka"/>
+        <w:tblpPr w:leftFromText="141" w:rightFromText="141" w:vertAnchor="text" w:horzAnchor="margin" w:tblpY="99"/>
+        <w:tblW w:w="10348" w:type="dxa"/>
+        <w:tblLook w:val="04A0" w:firstRow="1" w:lastRow="0" w:firstColumn="1" w:lastColumn="0" w:noHBand="0" w:noVBand="1"/>
+      </w:tblPr>
+      <w:tblGrid>
+        <w:gridCol w:w="7938"/>
+        <w:gridCol w:w="2410"/>
+      </w:tblGrid>
+      <w:tr>
+        <w:trPr>
+          <w:trHeight w:val="367"/>
+        </w:trPr>
+        <w:tc>
+          <w:tcPr>
+            <w:tcW w:w="7938" w:type="dxa"/>
+            <w:tcBorders>
+              <w:top w:val="nil"/>
+              <w:left w:val="nil"/>
+              <w:bottom w:val="single" w:sz="4" w:space="0" w:color="auto"/>
+              <w:right w:val="nil"/>
+            </w:tcBorders>
+            <w:shd w:val="clear" w:color="auto" w:fill="A6A6A6" w:themeFill="background1" w:themeFillShade="A6"/>
+            <w:vAlign w:val="center"/>
+          </w:tcPr>
+          <w:p>
+            <w:pPr>
+              <w:pStyle w:val="western"/>
+              <w:spacing w:before="0" w:beforeAutospacing="0" w:after="0" w:line="259" w:lineRule="auto"/>
+              <w:ind w:right="113"/>
+              <w:rPr>
+                <w:b/>
+                <w:bCs/>
+                <w:color w:val="FFFFFF" w:themeColor="background1"/>
+                <w:szCs w:val="20"/>
+              </w:rPr>
+            </w:pPr>
+            <w:r>
+              <w:rPr>
+                <w:b/>
+                <w:bCs/>
+                <w:sz w:val="24"/>
+              </w:rPr>
+              <w:t xml:space="preserve">Grand </w:t>
+            </w:r>
+            <w:proofErr w:type="spellStart"/>
+            <w:r>
+              <w:rPr>
+                <w:b/>
+                <w:bCs/>
+                <w:sz w:val="24"/>
+              </w:rPr>
+              <w:t>total</w:t>
+            </w:r>
+            <w:proofErr w:type="spellEnd"/>
+            <w:r>
+              <w:rPr>
+                <w:b/>
+                <w:bCs/>
+              </w:rPr>
+              <w:t>:</w:t>
+            </w:r>
+          </w:p>
+        </w:tc>
+        <w:tc>
+          <w:tcPr>
+            <w:tcW w:w="2410" w:type="dxa"/>
+            <w:tcBorders>
+              <w:top w:val="nil"/>
+              <w:left w:val="nil"/>
+              <w:bottom w:val="single" w:sz="4" w:space="0" w:color="auto"/>
+              <w:right w:val="nil"/>
+            </w:tcBorders>
+            <w:shd w:val="clear" w:color="auto" w:fill="A6A6A6" w:themeFill="background1" w:themeFillShade="A6"/>
+            <w:vAlign w:val="center"/>
+          </w:tcPr>
+          <w:p>
+            <w:pPr>
+              <w:rPr>
+                <w:b/>
+                <w:bCs/>
+                <w:color w:val="FFFFFF" w:themeColor="background1"/>
+                <w:szCs w:val="20"/>
+              </w:rPr>
+            </w:pPr>
+          </w:p>
+        </w:tc>
+      </w:tr>
+      <w:tr>
+        <w:trPr>
+          <w:trHeight w:val="274"/>
+        </w:trPr>
+        <w:tc>
+          <w:tcPr>
+            <w:tcW w:w="7938" w:type="dxa"/>
+            <w:tcBorders>
+              <w:top w:val="single" w:sz="4" w:space="0" w:color="auto"/>
+              <w:left w:val="single" w:sz="4" w:space="0" w:color="auto"/>
+              <w:bottom w:val="single" w:sz="4" w:space="0" w:color="auto"/>
+              <w:right w:val="single" w:sz="4" w:space="0" w:color="auto"/>
+            </w:tcBorders>
+            <w:vAlign w:val="center"/>
+          </w:tcPr>
+          <w:p>
+            <w:pPr>
+              <w:rPr>
+                <w:szCs w:val="20"/>
+              </w:rPr>
+            </w:pPr>
+            <w:r>
+              <w:rPr>
+                <w:rFonts w:ascii="Lato" w:hAnsi="Lato"/>
+                <w:b/>
+                <w:bCs/>
+                <w:sz w:val="20"/>
+                <w:szCs w:val="20"/>
+                <w:lang w:val="en-GB"/>
+              </w:rPr>
+              <w:t xml:space="preserve">Total </w:t>
+            </w:r>
+            <w:proofErr w:type="spellStart"/>
+            <w:r>
+              <w:rPr>
+                <w:rFonts w:ascii="Lato" w:hAnsi="Lato"/>
+                <w:b/>
+                <w:bCs/>
+                <w:sz w:val="20"/>
+                <w:szCs w:val="20"/>
+                <w:lang w:val="en-GB"/>
+              </w:rPr>
+              <w:t>value</w:t>
+            </w:r>
+            <w:proofErr w:type="spellEnd"/>
+            <w:r>
+              <w:rPr>
+                <w:rFonts w:ascii="Lato" w:hAnsi="Lato"/>
+                <w:b/>
+                <w:bCs/>
+                <w:sz w:val="20"/>
+                <w:szCs w:val="20"/>
+                <w:lang w:val="en-GB"/>
+              </w:rPr>
+              <w:t xml:space="preserve"> (</w:t>
+            </w:r>
+            <w:proofErr w:type="spellStart"/>
+            <w:r>
+              <w:rPr>
+                <w:rFonts w:ascii="Lato" w:hAnsi="Lato"/>
+                <w:b/>
+                <w:bCs/>
+                <w:sz w:val="20"/>
+                <w:szCs w:val="20"/>
+                <w:lang w:val="en-GB"/>
+              </w:rPr>
+              <w:t>walls</w:t>
+            </w:r>
+            <w:proofErr w:type="spellEnd"/>
+            <w:r>
+              <w:rPr>
+                <w:rFonts w:ascii="Lato" w:hAnsi="Lato"/>
+                <w:b/>
+                <w:bCs/>
+                <w:sz w:val="20"/>
+                <w:szCs w:val="20"/>
+                <w:lang w:val="en-GB"/>
+              </w:rPr>
+              <w:t xml:space="preserve"> &amp; transport):</w:t>
+            </w:r>
+          </w:p>
+        </w:tc>
+        <w:tc>
+          <w:tcPr>
+            <w:tcW w:w="2410" w:type="dxa"/>
+            <w:tcBorders>
+              <w:top w:val="single" w:sz="4" w:space="0" w:color="auto"/>
+              <w:left w:val="single" w:sz="4" w:space="0" w:color="auto"/>
+              <w:bottom w:val="single" w:sz="4" w:space="0" w:color="auto"/>
+              <w:right w:val="single" w:sz="4" w:space="0" w:color="auto"/>
+            </w:tcBorders>
+            <w:vAlign w:val="center"/>
+          </w:tcPr>
+          <w:p>
+            <w:pPr>
+              <w:jc w:val="center"/>
+              <w:rPr>
+                <w:szCs w:val="20"/>
+              </w:rPr>
+            </w:pPr>
+            <w:r>
+              <w:rPr>
+                <w:b/>
+                <w:bCs/>
+              </w:rPr>
+              <w:t xml:space="preserve"> </w:t>
+            </w:r>
+            <w:sdt>
+              <w:sdtPr>
+                <w:rPr>
+                  <w:rStyle w:val="Styl1"/>
+                </w:rPr>
+                <w:id w:val="1815367359"/>
+                <w:placeholder>
+                  <w:docPart w:val="631B74F7A4104B66B4FE428300330972"/>
+                </w:placeholder>
+                <w:showingPlcHdr/>
+              </w:sdtPr>
+              <w:sdtEndPr>
+                <w:rPr>
+                  <w:rStyle w:val="Domylnaczcionkaakapitu"/>
+                  <w:b w:val="0"/>
+                  <w:bCs/>
+                </w:rPr>
+              </w:sdtEndPr>
+              <w:sdtContent>
+                <w:r>
+                  <w:rPr>
+                    <w:rStyle w:val="Tekstzastpczy"/>
+                    <w:rFonts w:ascii="Lato" w:hAnsi="Lato"/>
+                    <w:sz w:val="20"/>
+                    <w:szCs w:val="20"/>
+                    <w:lang w:val="en-GB"/>
+                  </w:rPr>
+                  <w:t>Wartość</w:t>
+                </w:r>
+              </w:sdtContent>
+            </w:sdt>
+            <w:r>
+              <w:rPr>
+                <w:b/>
+                <w:bCs/>
+              </w:rPr>
+              <w:t xml:space="preserve"> </w:t>
+            </w:r>
+            <w:r>
+              <w:rPr>
+                <w:b/>
+                <w:bCs/>
+              </w:rPr>
+              <w:t>EUR</w:t>
+            </w:r>
+            <w:r>
+              <w:rPr>
+                <w:b/>
+                <w:bCs/>
+              </w:rPr>
+              <w:t xml:space="preserve"> </w:t>
+            </w:r>
+          </w:p>
+        </w:tc>
+      </w:tr>
+    </w:tbl>
+    <w:p>
+      <w:pPr>
+        <w:rPr>
+          <w:szCs w:val="20"/>
+          <w:lang w:val="en-GB"/>
         </w:rPr>
       </w:pPr>
     </w:p>
     <w:p>
       <w:pPr>
-        <w:rPr>
-          <w:szCs w:val="20"/>
-        </w:rPr>
-      </w:pPr>
-    </w:p>
-    <w:p>
-      <w:pPr>
-        <w:rPr>
-          <w:szCs w:val="20"/>
-          <w:lang w:val="en-GB"/>
-        </w:rPr>
-      </w:pPr>
-    </w:p>
-    <w:p>
-      <w:pPr>
-        <w:rPr>
-          <w:szCs w:val="20"/>
-        </w:rPr>
-      </w:pPr>
-    </w:p>
-    <w:p>
-      <w:pPr>
-        <w:ind w:left="1416" w:firstLine="708"/>
-        <w:rPr>
+        <w:jc w:val="center"/>
+        <w:rPr>
+          <w:rFonts w:ascii="Lato" w:hAnsi="Lato"/>
           <w:sz w:val="22"/>
           <w:lang w:val="en-GB"/>
         </w:rPr>
       </w:pPr>
       <w:r>
         <w:rPr>
+          <w:rFonts w:ascii="Lato" w:hAnsi="Lato"/>
           <w:b/>
           <w:bCs/>
           <w:sz w:val="22"/>
           <w:lang w:val="en-GB"/>
         </w:rPr>
-        <w:t>Offer valid f</w:t>
-      </w:r>
-      <w:r>
+        <w:t>Offer valid for 60 days only.</w:t>
+      </w:r>
+    </w:p>
+    <w:p>
+      <w:pPr>
+        <w:rPr>
+          <w:rFonts w:ascii="Lato Black" w:hAnsi="Lato Black"/>
+          <w:szCs w:val="20"/>
+          <w:lang w:val="en-GB"/>
+        </w:rPr>
+      </w:pPr>
+      <w:r>
+        <w:rPr>
+          <w:rFonts w:ascii="Lato Black" w:hAnsi="Lato Black"/>
+          <w:szCs w:val="20"/>
+          <w:lang w:val="en-GB"/>
+        </w:rPr>
+        <w:t>Offer includes:</w:t>
+      </w:r>
+    </w:p>
+    <w:p>
+      <w:pPr>
+        <w:ind w:left="720"/>
+        <w:rPr>
+          <w:szCs w:val="20"/>
+          <w:lang w:val="en-GB"/>
+        </w:rPr>
+      </w:pPr>
+    </w:p>
+    <w:p>
+      <w:pPr>
+        <w:numPr>
+          <w:ilvl w:val="0"/>
+          <w:numId w:val="1"/>
+        </w:numPr>
+        <w:suppressAutoHyphens/>
+        <w:spacing w:after="100" w:line="240" w:lineRule="auto"/>
+        <w:rPr>
+          <w:szCs w:val="20"/>
+        </w:rPr>
+      </w:pPr>
+      <w:r>
+        <w:rPr>
+          <w:szCs w:val="20"/>
+        </w:rPr>
+        <w:lastRenderedPageBreak/>
+        <w:t xml:space="preserve">Technical </w:t>
+      </w:r>
+      <w:proofErr w:type="spellStart"/>
+      <w:r>
+        <w:rPr>
+          <w:szCs w:val="20"/>
+        </w:rPr>
+        <w:t>advice</w:t>
+      </w:r>
+      <w:proofErr w:type="spellEnd"/>
+      <w:r>
+        <w:rPr>
+          <w:szCs w:val="20"/>
+        </w:rPr>
+        <w:t xml:space="preserve"> </w:t>
+      </w:r>
+    </w:p>
+    <w:p>
+      <w:pPr>
+        <w:numPr>
+          <w:ilvl w:val="0"/>
+          <w:numId w:val="1"/>
+        </w:numPr>
+        <w:suppressAutoHyphens/>
+        <w:spacing w:after="100" w:line="240" w:lineRule="auto"/>
+        <w:rPr>
+          <w:szCs w:val="20"/>
+        </w:rPr>
+      </w:pPr>
+      <w:r>
+        <w:rPr>
+          <w:szCs w:val="20"/>
+        </w:rPr>
+        <w:t xml:space="preserve">Mobile </w:t>
+      </w:r>
+      <w:proofErr w:type="spellStart"/>
+      <w:r>
+        <w:rPr>
+          <w:szCs w:val="20"/>
+        </w:rPr>
+        <w:t>wall</w:t>
+      </w:r>
+      <w:proofErr w:type="spellEnd"/>
+      <w:r>
+        <w:rPr>
+          <w:szCs w:val="20"/>
+        </w:rPr>
+        <w:t xml:space="preserve"> design.</w:t>
+      </w:r>
+    </w:p>
+    <w:p>
+      <w:pPr>
+        <w:numPr>
+          <w:ilvl w:val="0"/>
+          <w:numId w:val="1"/>
+        </w:numPr>
+        <w:suppressAutoHyphens/>
+        <w:spacing w:after="100" w:line="240" w:lineRule="auto"/>
+        <w:rPr>
+          <w:szCs w:val="20"/>
+          <w:lang w:val="en-GB"/>
+        </w:rPr>
+      </w:pPr>
+      <w:r>
+        <w:rPr>
+          <w:szCs w:val="20"/>
+          <w:lang w:val="en-GB"/>
+        </w:rPr>
+        <w:t>Transport to the installation site (</w:t>
+      </w:r>
+      <w:r>
+        <w:rPr>
+          <w:szCs w:val="20"/>
+          <w:lang w:val="en-GB"/>
+        </w:rPr>
+        <w:t>kerbside only</w:t>
+      </w:r>
+      <w:r>
+        <w:rPr>
+          <w:szCs w:val="20"/>
+          <w:lang w:val="en-GB"/>
+        </w:rPr>
+        <w:t>)</w:t>
+      </w:r>
+    </w:p>
+    <w:p>
+      <w:pPr>
+        <w:numPr>
+          <w:ilvl w:val="0"/>
+          <w:numId w:val="1"/>
+        </w:numPr>
+        <w:suppressAutoHyphens/>
+        <w:spacing w:after="100" w:line="240" w:lineRule="auto"/>
+        <w:rPr>
+          <w:szCs w:val="20"/>
+          <w:lang w:val="en-GB"/>
+        </w:rPr>
+      </w:pPr>
+      <w:r>
+        <w:rPr>
+          <w:szCs w:val="20"/>
+          <w:lang w:val="en-GB"/>
+        </w:rPr>
+        <w:t xml:space="preserve">Production </w:t>
+      </w:r>
+      <w:r>
+        <w:rPr>
+          <w:szCs w:val="20"/>
+          <w:lang w:val="en-GB"/>
+        </w:rPr>
+        <w:t xml:space="preserve">and </w:t>
+      </w:r>
+      <w:r>
+        <w:rPr>
+          <w:szCs w:val="20"/>
+          <w:lang w:val="en-GB"/>
+        </w:rPr>
+        <w:t>supply</w:t>
+      </w:r>
+      <w:r>
+        <w:rPr>
+          <w:szCs w:val="20"/>
+          <w:lang w:val="en-GB"/>
+        </w:rPr>
+        <w:t xml:space="preserve"> of </w:t>
+      </w:r>
+      <w:r>
+        <w:rPr>
+          <w:szCs w:val="20"/>
+          <w:lang w:val="en-GB"/>
+        </w:rPr>
+        <w:t>rails,</w:t>
+      </w:r>
+      <w:r>
+        <w:rPr>
+          <w:szCs w:val="20"/>
+          <w:lang w:val="en-GB"/>
+        </w:rPr>
+        <w:t xml:space="preserve"> and parking system (Stage I). </w:t>
+      </w:r>
+    </w:p>
+    <w:p>
+      <w:pPr>
+        <w:numPr>
+          <w:ilvl w:val="0"/>
+          <w:numId w:val="1"/>
+        </w:numPr>
+        <w:suppressAutoHyphens/>
+        <w:spacing w:after="100" w:line="240" w:lineRule="auto"/>
+        <w:rPr>
+          <w:szCs w:val="20"/>
+          <w:lang w:val="en-GB"/>
+        </w:rPr>
+      </w:pPr>
+      <w:r>
+        <w:rPr>
+          <w:szCs w:val="20"/>
+          <w:lang w:val="en-GB"/>
+        </w:rPr>
+        <w:t xml:space="preserve">Production and </w:t>
+      </w:r>
+      <w:r>
+        <w:rPr>
+          <w:szCs w:val="20"/>
+          <w:lang w:val="en-GB"/>
+        </w:rPr>
+        <w:t>supply</w:t>
+      </w:r>
+      <w:r>
+        <w:rPr>
+          <w:szCs w:val="20"/>
+          <w:lang w:val="en-GB"/>
+        </w:rPr>
+        <w:t xml:space="preserve"> of mo</w:t>
+      </w:r>
+      <w:r>
+        <w:rPr>
+          <w:szCs w:val="20"/>
+          <w:lang w:val="en-GB"/>
+        </w:rPr>
+        <w:t>vable</w:t>
+      </w:r>
+      <w:r>
+        <w:rPr>
+          <w:szCs w:val="20"/>
+          <w:lang w:val="en-GB"/>
+        </w:rPr>
+        <w:t xml:space="preserve"> wall </w:t>
+      </w:r>
+      <w:r>
+        <w:rPr>
+          <w:szCs w:val="20"/>
+          <w:lang w:val="en-GB"/>
+        </w:rPr>
+        <w:t>modules</w:t>
+      </w:r>
+      <w:r>
+        <w:rPr>
+          <w:szCs w:val="20"/>
+          <w:lang w:val="en-GB"/>
+        </w:rPr>
+        <w:t xml:space="preserve"> (Stage II). </w:t>
+      </w:r>
+    </w:p>
+    <w:p>
+      <w:pPr>
+        <w:numPr>
+          <w:ilvl w:val="0"/>
+          <w:numId w:val="1"/>
+        </w:numPr>
+        <w:suppressAutoHyphens/>
+        <w:spacing w:after="100" w:line="240" w:lineRule="auto"/>
+        <w:rPr>
+          <w:szCs w:val="20"/>
+          <w:lang w:val="en-GB"/>
+        </w:rPr>
+      </w:pPr>
+      <w:r>
+        <w:rPr>
+          <w:szCs w:val="20"/>
+          <w:lang w:val="en-GB"/>
+        </w:rPr>
+        <w:t>5-year</w:t>
+      </w:r>
+      <w:r>
+        <w:rPr>
+          <w:szCs w:val="20"/>
+          <w:lang w:val="en-GB"/>
+        </w:rPr>
+        <w:t xml:space="preserve"> product</w:t>
+      </w:r>
+      <w:r>
+        <w:rPr>
+          <w:szCs w:val="20"/>
+          <w:lang w:val="en-GB"/>
+        </w:rPr>
+        <w:t xml:space="preserve"> warranty of the direct Polish manufacturer</w:t>
+      </w:r>
+      <w:r>
+        <w:rPr>
+          <w:szCs w:val="20"/>
+          <w:lang w:val="en-GB"/>
+        </w:rPr>
+        <w:t>.</w:t>
+      </w:r>
+    </w:p>
+    <w:p>
+      <w:pPr>
+        <w:rPr>
+          <w:rFonts w:ascii="Lato Black" w:hAnsi="Lato Black"/>
+          <w:szCs w:val="20"/>
+          <w:lang w:val="en-GB"/>
+        </w:rPr>
+      </w:pPr>
+    </w:p>
+    <w:p>
+      <w:pPr>
+        <w:rPr>
+          <w:rFonts w:ascii="Lato Black" w:hAnsi="Lato Black"/>
+          <w:szCs w:val="20"/>
+        </w:rPr>
+      </w:pPr>
+      <w:proofErr w:type="spellStart"/>
+      <w:r>
+        <w:rPr>
+          <w:rFonts w:ascii="Lato Black" w:hAnsi="Lato Black"/>
+          <w:szCs w:val="20"/>
+        </w:rPr>
+        <w:t>Other</w:t>
+      </w:r>
+      <w:proofErr w:type="spellEnd"/>
+      <w:r>
+        <w:rPr>
+          <w:rFonts w:ascii="Lato Black" w:hAnsi="Lato Black"/>
+          <w:szCs w:val="20"/>
+        </w:rPr>
+        <w:t xml:space="preserve"> </w:t>
+      </w:r>
+      <w:proofErr w:type="spellStart"/>
+      <w:r>
+        <w:rPr>
+          <w:rFonts w:ascii="Lato Black" w:hAnsi="Lato Black"/>
+          <w:szCs w:val="20"/>
+        </w:rPr>
+        <w:t>applications</w:t>
+      </w:r>
+      <w:proofErr w:type="spellEnd"/>
+      <w:r>
+        <w:rPr>
+          <w:rFonts w:ascii="Lato Black" w:hAnsi="Lato Black"/>
+          <w:szCs w:val="20"/>
+        </w:rPr>
+        <w:t>:</w:t>
+      </w:r>
+    </w:p>
+    <w:p>
+      <w:pPr>
+        <w:numPr>
+          <w:ilvl w:val="0"/>
+          <w:numId w:val="2"/>
+        </w:numPr>
+        <w:suppressAutoHyphens/>
+        <w:spacing w:after="100" w:line="240" w:lineRule="auto"/>
+        <w:rPr>
+          <w:szCs w:val="20"/>
+        </w:rPr>
+      </w:pPr>
+      <w:r>
+        <w:rPr>
+          <w:szCs w:val="20"/>
+          <w:lang w:val="en-GB"/>
+        </w:rPr>
+        <w:t xml:space="preserve">Connecting modules using a tongue and groove system with the use of magnetic and pressure seals. </w:t>
+      </w:r>
+      <w:proofErr w:type="spellStart"/>
+      <w:r>
+        <w:rPr>
+          <w:szCs w:val="20"/>
+        </w:rPr>
+        <w:t>External</w:t>
+      </w:r>
+      <w:proofErr w:type="spellEnd"/>
+      <w:r>
+        <w:rPr>
+          <w:szCs w:val="20"/>
+        </w:rPr>
+        <w:t xml:space="preserve"> </w:t>
+      </w:r>
+      <w:proofErr w:type="spellStart"/>
+      <w:r>
+        <w:rPr>
+          <w:szCs w:val="20"/>
+        </w:rPr>
+        <w:t>distance</w:t>
+      </w:r>
+      <w:proofErr w:type="spellEnd"/>
+      <w:r>
+        <w:rPr>
+          <w:szCs w:val="20"/>
+        </w:rPr>
+        <w:t xml:space="preserve"> </w:t>
+      </w:r>
+      <w:proofErr w:type="spellStart"/>
+      <w:r>
+        <w:rPr>
+          <w:szCs w:val="20"/>
+        </w:rPr>
+        <w:t>between</w:t>
+      </w:r>
+      <w:proofErr w:type="spellEnd"/>
+      <w:r>
+        <w:rPr>
+          <w:szCs w:val="20"/>
+        </w:rPr>
+        <w:t xml:space="preserve"> </w:t>
+      </w:r>
+      <w:proofErr w:type="spellStart"/>
+      <w:r>
+        <w:rPr>
+          <w:szCs w:val="20"/>
+        </w:rPr>
+        <w:t>modules</w:t>
+      </w:r>
+      <w:proofErr w:type="spellEnd"/>
+      <w:r>
+        <w:rPr>
+          <w:szCs w:val="20"/>
+        </w:rPr>
+        <w:t xml:space="preserve"> from 1 mm to 3 mm.</w:t>
+      </w:r>
+    </w:p>
+    <w:p>
+      <w:pPr>
+        <w:numPr>
+          <w:ilvl w:val="0"/>
+          <w:numId w:val="2"/>
+        </w:numPr>
+        <w:suppressAutoHyphens/>
+        <w:spacing w:after="100" w:line="240" w:lineRule="auto"/>
+        <w:rPr>
+          <w:szCs w:val="20"/>
+          <w:lang w:val="en-GB"/>
+        </w:rPr>
+      </w:pPr>
+      <w:r>
+        <w:rPr>
+          <w:szCs w:val="20"/>
+          <w:lang w:val="en-GB"/>
+        </w:rPr>
+        <w:t>Horizontal clamping bars in black.</w:t>
+      </w:r>
+    </w:p>
+    <w:p>
+      <w:pPr>
+        <w:numPr>
+          <w:ilvl w:val="0"/>
+          <w:numId w:val="2"/>
+        </w:numPr>
+        <w:suppressAutoHyphens/>
+        <w:spacing w:after="100" w:line="240" w:lineRule="auto"/>
+        <w:rPr>
+          <w:szCs w:val="20"/>
+          <w:lang w:val="en-GB"/>
+        </w:rPr>
+      </w:pPr>
+      <w:r>
+        <w:rPr>
+          <w:szCs w:val="20"/>
+          <w:lang w:val="en-GB"/>
+        </w:rPr>
+        <w:t>The use of a door module reduces the level of sound insulation by 2dB.</w:t>
+      </w:r>
+    </w:p>
+    <w:p>
+      <w:pPr>
+        <w:numPr>
+          <w:ilvl w:val="0"/>
+          <w:numId w:val="2"/>
+        </w:numPr>
+        <w:suppressAutoHyphens/>
+        <w:spacing w:after="100" w:line="240" w:lineRule="auto"/>
+        <w:rPr>
+          <w:szCs w:val="20"/>
+          <w:lang w:val="en-GB"/>
+        </w:rPr>
+      </w:pPr>
+      <w:r>
+        <w:rPr>
+          <w:szCs w:val="20"/>
+          <w:lang w:val="en-GB"/>
+        </w:rPr>
+        <w:t xml:space="preserve">In the case of walls higher than 2.80 m, it is necessary to join cladding boards. Panels up to a height of 5.60 m can be used </w:t>
+      </w:r>
+      <w:r>
+        <w:rPr>
+          <w:szCs w:val="20"/>
+          <w:lang w:val="en-GB"/>
+        </w:rPr>
+        <w:t xml:space="preserve">in M1 class only. </w:t>
+      </w:r>
+    </w:p>
+    <w:p>
+      <w:pPr>
+        <w:numPr>
+          <w:ilvl w:val="0"/>
+          <w:numId w:val="2"/>
+        </w:numPr>
+        <w:suppressAutoHyphens/>
+        <w:spacing w:after="100" w:line="240" w:lineRule="auto"/>
+        <w:rPr>
+          <w:szCs w:val="20"/>
+          <w:lang w:val="en-GB"/>
+        </w:rPr>
+      </w:pPr>
+      <w:r>
+        <w:rPr>
+          <w:szCs w:val="20"/>
+          <w:lang w:val="en-GB"/>
+        </w:rPr>
+        <w:t xml:space="preserve">Availability of the full range of </w:t>
+      </w:r>
+      <w:r>
+        <w:rPr>
+          <w:szCs w:val="20"/>
+          <w:lang w:val="en-GB"/>
+        </w:rPr>
+        <w:t>melamine</w:t>
+      </w:r>
+      <w:r>
+        <w:rPr>
+          <w:szCs w:val="20"/>
+          <w:lang w:val="en-GB"/>
+        </w:rPr>
+        <w:t xml:space="preserve"> manufacturers: Egger, </w:t>
+      </w:r>
+      <w:proofErr w:type="spellStart"/>
+      <w:r>
+        <w:rPr>
+          <w:szCs w:val="20"/>
+          <w:lang w:val="en-GB"/>
+        </w:rPr>
+        <w:t>SwissKrono</w:t>
+      </w:r>
+      <w:proofErr w:type="spellEnd"/>
+      <w:r>
+        <w:rPr>
+          <w:szCs w:val="20"/>
+          <w:lang w:val="en-GB"/>
+        </w:rPr>
+        <w:t xml:space="preserve">, </w:t>
+      </w:r>
+      <w:proofErr w:type="spellStart"/>
+      <w:r>
+        <w:rPr>
+          <w:szCs w:val="20"/>
+          <w:lang w:val="en-GB"/>
+        </w:rPr>
+        <w:t>Finsa</w:t>
+      </w:r>
+      <w:proofErr w:type="spellEnd"/>
+      <w:r>
+        <w:rPr>
+          <w:szCs w:val="20"/>
+          <w:lang w:val="en-GB"/>
+        </w:rPr>
+        <w:t>, Kronospan</w:t>
+      </w:r>
+    </w:p>
+    <w:p>
+      <w:pPr>
+        <w:numPr>
+          <w:ilvl w:val="0"/>
+          <w:numId w:val="2"/>
+        </w:numPr>
+        <w:suppressAutoHyphens/>
+        <w:spacing w:after="100" w:line="240" w:lineRule="auto"/>
+        <w:rPr>
+          <w:szCs w:val="20"/>
+          <w:lang w:val="en-GB"/>
+        </w:rPr>
+      </w:pPr>
+      <w:r>
+        <w:rPr>
+          <w:szCs w:val="20"/>
+          <w:lang w:val="en-GB"/>
+        </w:rPr>
+        <w:t xml:space="preserve">If cladding panels are used in the non-flammable class, Optimal 110 sliding walls meet the NRO (Non-Fire Propagation, class B-s1, d0 for 45 dB, class B-s2, d0 for others) requirement, in accordance with the National Technical Assessment ITB-KOT-2022/1699 issued by the Building Research Institute. </w:t>
+      </w:r>
+    </w:p>
+    <w:p>
+      <w:pPr>
+        <w:numPr>
+          <w:ilvl w:val="0"/>
+          <w:numId w:val="2"/>
+        </w:numPr>
+        <w:suppressAutoHyphens/>
+        <w:spacing w:after="100" w:line="240" w:lineRule="auto"/>
+        <w:rPr>
+          <w:szCs w:val="20"/>
+          <w:lang w:val="en-GB"/>
+        </w:rPr>
+      </w:pPr>
+      <w:r>
+        <w:rPr>
+          <w:szCs w:val="20"/>
+          <w:lang w:val="en-GB"/>
+        </w:rPr>
+        <w:t xml:space="preserve">The offer includes decors from the basic colour palette of Optimal </w:t>
+      </w:r>
+      <w:r>
+        <w:rPr>
+          <w:szCs w:val="20"/>
+          <w:lang w:val="en-GB"/>
+        </w:rPr>
+        <w:t>System</w:t>
+      </w:r>
+    </w:p>
+    <w:p>
+      <w:pPr>
+        <w:pStyle w:val="Akapitzlist"/>
         <w:rPr>
           <w:b/>
           <w:bCs/>
-          <w:sz w:val="22"/>
-          <w:lang w:val="en-GB"/>
-        </w:rPr>
-        <w:t>or 60 days only.</w:t>
-      </w:r>
+          <w:szCs w:val="20"/>
+          <w:lang w:val="en-GB"/>
+        </w:rPr>
+      </w:pPr>
     </w:p>
     <w:p>
       <w:pPr>
+        <w:pStyle w:val="Akapitzlist"/>
+        <w:rPr>
+          <w:b/>
+          <w:bCs/>
+          <w:szCs w:val="20"/>
+          <w:lang w:val="en-GB"/>
+        </w:rPr>
+      </w:pPr>
+    </w:p>
+    <w:p>
+      <w:pPr>
+        <w:spacing w:before="100" w:beforeAutospacing="1" w:after="0"/>
+        <w:jc w:val="both"/>
+        <w:rPr>
+          <w:rFonts w:eastAsia="Times New Roman" w:cs="Times New Roman"/>
+          <w:i/>
+          <w:iCs/>
+          <w:szCs w:val="20"/>
+          <w:lang w:val="en-GB" w:eastAsia="pl-PL"/>
+        </w:rPr>
+      </w:pPr>
+      <w:r>
+        <w:rPr>
+          <w:rFonts w:eastAsia="Times New Roman" w:cs="Times New Roman"/>
+          <w:i/>
+          <w:iCs/>
+          <w:szCs w:val="20"/>
+          <w:lang w:val="en-GB" w:eastAsia="pl-PL"/>
+        </w:rPr>
+        <w:t xml:space="preserve">This offer is intended only for the person or entity to whom it is addressed and contains content covered by trade secrets and trade secrets within the meaning of the Act on Combating Unfair Competition, as well as other content of a confidential nature. The </w:t>
+      </w:r>
+      <w:proofErr w:type="spellStart"/>
+      <w:r>
+        <w:rPr>
+          <w:rFonts w:eastAsia="Times New Roman" w:cs="Times New Roman"/>
+          <w:i/>
+          <w:iCs/>
+          <w:szCs w:val="20"/>
+          <w:lang w:val="en-GB" w:eastAsia="pl-PL"/>
+        </w:rPr>
+        <w:t>Offerer</w:t>
+      </w:r>
+      <w:proofErr w:type="spellEnd"/>
+      <w:r>
+        <w:rPr>
+          <w:rFonts w:eastAsia="Times New Roman" w:cs="Times New Roman"/>
+          <w:i/>
+          <w:iCs/>
+          <w:szCs w:val="20"/>
+          <w:lang w:val="en-GB" w:eastAsia="pl-PL"/>
+        </w:rPr>
+        <w:t xml:space="preserve"> does not agree to the dissemination of its content, but the terms and conditions of the offer are not publicly available, because the </w:t>
+      </w:r>
+      <w:proofErr w:type="spellStart"/>
+      <w:r>
+        <w:rPr>
+          <w:rFonts w:eastAsia="Times New Roman" w:cs="Times New Roman"/>
+          <w:i/>
+          <w:iCs/>
+          <w:szCs w:val="20"/>
+          <w:lang w:val="en-GB" w:eastAsia="pl-PL"/>
+        </w:rPr>
+        <w:t>Offerer</w:t>
+      </w:r>
+      <w:proofErr w:type="spellEnd"/>
+      <w:r>
+        <w:rPr>
+          <w:rFonts w:eastAsia="Times New Roman" w:cs="Times New Roman"/>
+          <w:i/>
+          <w:iCs/>
+          <w:szCs w:val="20"/>
+          <w:lang w:val="en-GB" w:eastAsia="pl-PL"/>
+        </w:rPr>
+        <w:t xml:space="preserve"> has taken steps to prevent the public from making the prices and other commercial terms and conditions available to the public. </w:t>
+      </w:r>
+    </w:p>
+    <w:p>
+      <w:pPr>
+        <w:spacing w:before="100" w:beforeAutospacing="1" w:after="0"/>
+        <w:jc w:val="both"/>
+        <w:rPr>
+          <w:rFonts w:eastAsia="Times New Roman" w:cs="Times New Roman"/>
+          <w:i/>
+          <w:iCs/>
+          <w:szCs w:val="20"/>
+          <w:lang w:val="en-GB" w:eastAsia="pl-PL"/>
+        </w:rPr>
+      </w:pPr>
+      <w:r>
+        <w:rPr>
+          <w:rFonts w:eastAsia="Times New Roman" w:cs="Times New Roman"/>
+          <w:i/>
+          <w:iCs/>
+          <w:szCs w:val="20"/>
+          <w:lang w:val="en-GB" w:eastAsia="pl-PL"/>
+        </w:rPr>
+        <w:t>Acceptance of this offer is tantamount to acceptance of the General Terms and Conditions of Sale of Optimal System Sławomir Więsyk available on the website: www.optimalpoland.pl</w:t>
+      </w:r>
+    </w:p>
+    <w:p>
+      <w:pPr>
         <w:pStyle w:val="Zawartoramki"/>
         <w:spacing w:after="0"/>
         <w:rPr>
@@ -2146,11 +3400,21 @@
         </w:rPr>
       </w:pPr>
     </w:p>
+    <w:p>
+      <w:pPr>
+        <w:pStyle w:val="Zawartoramki"/>
+        <w:spacing w:after="0"/>
+        <w:rPr>
+          <w:lang w:val="en-GB"/>
+        </w:rPr>
+      </w:pPr>
+    </w:p>
     <w:sectPr>
-      <w:headerReference w:type="default" r:id="rId10"/>
+      <w:footerReference w:type="first" r:id="rId15"/>
       <w:pgSz w:w="11906" w:h="16838"/>
-      <w:pgMar w:top="1417" w:right="1417" w:bottom="1417" w:left="1417" w:header="708" w:footer="708" w:gutter="0"/>
+      <w:pgMar w:top="1418" w:right="737" w:bottom="2835" w:left="737" w:header="709" w:footer="709" w:gutter="0"/>
       <w:cols w:space="708"/>
+      <w:titlePg/>
       <w:docGrid w:linePitch="360"/>
     </w:sectPr>
   </w:body>
@@ -2180,6 +3444,176 @@
     </w:p>
   </w:endnote>
 </w:endnotes>
+</file>
+
+<file path=word/footer1.xml><?xml version="1.0" encoding="utf-8"?>
+<w:ftr xmlns:wpc="http://schemas.microsoft.com/office/word/2010/wordprocessingCanvas" xmlns:cx="http://schemas.microsoft.com/office/drawing/2014/chartex" xmlns:cx1="http://schemas.microsoft.com/office/drawing/2015/9/8/chartex" xmlns:cx2="http://schemas.microsoft.com/office/drawing/2015/10/21/chartex" xmlns:cx3="http://schemas.microsoft.com/office/drawing/2016/5/9/chartex" xmlns:cx4="http://schemas.microsoft.com/office/drawing/2016/5/10/chartex" xmlns:cx5="http://schemas.microsoft.com/office/drawing/2016/5/11/chartex" xmlns:cx6="http://schemas.microsoft.com/office/drawing/2016/5/12/chartex" xmlns:cx7="http://schemas.microsoft.com/office/drawing/2016/5/13/chartex" xmlns:cx8="http://schemas.microsoft.com/office/drawing/2016/5/14/chartex" xmlns:mc="http://schemas.openxmlformats.org/markup-compatibility/2006" xmlns:aink="http://schemas.microsoft.com/office/drawing/2016/ink" xmlns:am3d="http://schemas.microsoft.com/office/drawing/2017/model3d" xmlns:o="urn:schemas-microsoft-com:office:office" xmlns:oel="http://schemas.microsoft.com/office/2019/extlst" xmlns:r="http://schemas.openxmlformats.org/officeDocument/2006/relationships" xmlns:m="http://schemas.openxmlformats.org/officeDocument/2006/math" xmlns:v="urn:schemas-microsoft-com:vml" xmlns:wp14="http://schemas.microsoft.com/office/word/2010/wordprocessingDrawing" xmlns:wp="http://schemas.openxmlformats.org/drawingml/2006/wordprocessingDrawing" xmlns:w10="urn:schemas-microsoft-com:office:word" xmlns:w="http://schemas.openxmlformats.org/wordprocessingml/2006/main" xmlns:w14="http://schemas.microsoft.com/office/word/2010/wordml" xmlns:w15="http://schemas.microsoft.com/office/word/2012/wordml" xmlns:w16cex="http://schemas.microsoft.com/office/word/2018/wordml/cex" xmlns:w16cid="http://schemas.microsoft.com/office/word/2016/wordml/cid" xmlns:w16="http://schemas.microsoft.com/office/word/2018/wordml" xmlns:w16du="http://schemas.microsoft.com/office/word/2023/wordml/word16du" xmlns:w16sdtdh="http://schemas.microsoft.com/office/word/2020/wordml/sdtdatahash" xmlns:w16sdtfl="http://schemas.microsoft.com/office/word/2024/wordml/sdtformatlock" xmlns:w16se="http://schemas.microsoft.com/office/word/2015/wordml/symex" xmlns:wpg="http://schemas.microsoft.com/office/word/2010/wordprocessingGroup" xmlns:wpi="http://schemas.microsoft.com/office/word/2010/wordprocessingInk" xmlns:wne="http://schemas.microsoft.com/office/word/2006/wordml" xmlns:wps="http://schemas.microsoft.com/office/word/2010/wordprocessingShape" mc:Ignorable="w14 w15 w16se w16cid w16 w16cex w16sdtdh w16sdtfl w16du wp14">
+  <w:p>
+    <w:pPr>
+      <w:pStyle w:val="Stopka"/>
+    </w:pPr>
+    <w:r>
+      <w:rPr>
+        <w:noProof/>
+      </w:rPr>
+      <w:drawing>
+        <wp:anchor distT="0" distB="0" distL="114300" distR="114300" simplePos="0" relativeHeight="251661312" behindDoc="1" locked="0" layoutInCell="1" allowOverlap="1" wp14:anchorId="7F3C1F2C" wp14:editId="4D23C5CC">
+          <wp:simplePos x="0" y="0"/>
+          <wp:positionH relativeFrom="margin">
+            <wp:align>center</wp:align>
+          </wp:positionH>
+          <wp:positionV relativeFrom="paragraph">
+            <wp:posOffset>-1005840</wp:posOffset>
+          </wp:positionV>
+          <wp:extent cx="7124700" cy="1445622"/>
+          <wp:effectExtent l="0" t="0" r="0" b="2540"/>
+          <wp:wrapNone/>
+          <wp:docPr id="1188666288" name="Obraz 1"/>
+          <wp:cNvGraphicFramePr>
+            <a:graphicFrameLocks xmlns:a="http://schemas.openxmlformats.org/drawingml/2006/main" noChangeAspect="1"/>
+          </wp:cNvGraphicFramePr>
+          <a:graphic xmlns:a="http://schemas.openxmlformats.org/drawingml/2006/main">
+            <a:graphicData uri="http://schemas.openxmlformats.org/drawingml/2006/picture">
+              <pic:pic xmlns:pic="http://schemas.openxmlformats.org/drawingml/2006/picture">
+                <pic:nvPicPr>
+                  <pic:cNvPr id="4" name="Obraz 4"/>
+                  <pic:cNvPicPr>
+                    <a:picLocks noChangeAspect="1"/>
+                  </pic:cNvPicPr>
+                </pic:nvPicPr>
+                <pic:blipFill>
+                  <a:blip r:embed="rId1">
+                    <a:extLst>
+                      <a:ext uri="{28A0092B-C50C-407E-A947-70E740481C1C}">
+                        <a14:useLocalDpi xmlns:a14="http://schemas.microsoft.com/office/drawing/2010/main" val="0"/>
+                      </a:ext>
+                    </a:extLst>
+                  </a:blip>
+                  <a:stretch>
+                    <a:fillRect/>
+                  </a:stretch>
+                </pic:blipFill>
+                <pic:spPr>
+                  <a:xfrm>
+                    <a:off x="0" y="0"/>
+                    <a:ext cx="7124700" cy="1445622"/>
+                  </a:xfrm>
+                  <a:prstGeom prst="rect">
+                    <a:avLst/>
+                  </a:prstGeom>
+                </pic:spPr>
+              </pic:pic>
+            </a:graphicData>
+          </a:graphic>
+          <wp14:sizeRelH relativeFrom="margin">
+            <wp14:pctWidth>0</wp14:pctWidth>
+          </wp14:sizeRelH>
+          <wp14:sizeRelV relativeFrom="margin">
+            <wp14:pctHeight>0</wp14:pctHeight>
+          </wp14:sizeRelV>
+        </wp:anchor>
+      </w:drawing>
+    </w:r>
+  </w:p>
+</w:ftr>
+</file>
+
+<file path=word/footer2.xml><?xml version="1.0" encoding="utf-8"?>
+<w:ftr xmlns:wpc="http://schemas.microsoft.com/office/word/2010/wordprocessingCanvas" xmlns:cx="http://schemas.microsoft.com/office/drawing/2014/chartex" xmlns:cx1="http://schemas.microsoft.com/office/drawing/2015/9/8/chartex" xmlns:cx2="http://schemas.microsoft.com/office/drawing/2015/10/21/chartex" xmlns:cx3="http://schemas.microsoft.com/office/drawing/2016/5/9/chartex" xmlns:cx4="http://schemas.microsoft.com/office/drawing/2016/5/10/chartex" xmlns:cx5="http://schemas.microsoft.com/office/drawing/2016/5/11/chartex" xmlns:cx6="http://schemas.microsoft.com/office/drawing/2016/5/12/chartex" xmlns:cx7="http://schemas.microsoft.com/office/drawing/2016/5/13/chartex" xmlns:cx8="http://schemas.microsoft.com/office/drawing/2016/5/14/chartex" xmlns:mc="http://schemas.openxmlformats.org/markup-compatibility/2006" xmlns:aink="http://schemas.microsoft.com/office/drawing/2016/ink" xmlns:am3d="http://schemas.microsoft.com/office/drawing/2017/model3d" xmlns:o="urn:schemas-microsoft-com:office:office" xmlns:oel="http://schemas.microsoft.com/office/2019/extlst" xmlns:r="http://schemas.openxmlformats.org/officeDocument/2006/relationships" xmlns:m="http://schemas.openxmlformats.org/officeDocument/2006/math" xmlns:v="urn:schemas-microsoft-com:vml" xmlns:wp14="http://schemas.microsoft.com/office/word/2010/wordprocessingDrawing" xmlns:wp="http://schemas.openxmlformats.org/drawingml/2006/wordprocessingDrawing" xmlns:w10="urn:schemas-microsoft-com:office:word" xmlns:w="http://schemas.openxmlformats.org/wordprocessingml/2006/main" xmlns:w14="http://schemas.microsoft.com/office/word/2010/wordml" xmlns:w15="http://schemas.microsoft.com/office/word/2012/wordml" xmlns:w16cex="http://schemas.microsoft.com/office/word/2018/wordml/cex" xmlns:w16cid="http://schemas.microsoft.com/office/word/2016/wordml/cid" xmlns:w16="http://schemas.microsoft.com/office/word/2018/wordml" xmlns:w16du="http://schemas.microsoft.com/office/word/2023/wordml/word16du" xmlns:w16sdtdh="http://schemas.microsoft.com/office/word/2020/wordml/sdtdatahash" xmlns:w16sdtfl="http://schemas.microsoft.com/office/word/2024/wordml/sdtformatlock" xmlns:w16se="http://schemas.microsoft.com/office/word/2015/wordml/symex" xmlns:wpg="http://schemas.microsoft.com/office/word/2010/wordprocessingGroup" xmlns:wpi="http://schemas.microsoft.com/office/word/2010/wordprocessingInk" xmlns:wne="http://schemas.microsoft.com/office/word/2006/wordml" xmlns:wps="http://schemas.microsoft.com/office/word/2010/wordprocessingShape" mc:Ignorable="w14 w15 w16se w16cid w16 w16cex w16sdtdh w16sdtfl w16du wp14">
+  <w:p>
+    <w:pPr>
+      <w:pStyle w:val="Stopka"/>
+      <w:tabs>
+        <w:tab w:val="clear" w:pos="4536"/>
+        <w:tab w:val="clear" w:pos="9072"/>
+        <w:tab w:val="left" w:pos="3516"/>
+      </w:tabs>
+    </w:pPr>
+    <w:r>
+      <w:tab/>
+    </w:r>
+  </w:p>
+</w:ftr>
+</file>
+
+<file path=word/footer3.xml><?xml version="1.0" encoding="utf-8"?>
+<w:ftr xmlns:wpc="http://schemas.microsoft.com/office/word/2010/wordprocessingCanvas" xmlns:cx="http://schemas.microsoft.com/office/drawing/2014/chartex" xmlns:cx1="http://schemas.microsoft.com/office/drawing/2015/9/8/chartex" xmlns:cx2="http://schemas.microsoft.com/office/drawing/2015/10/21/chartex" xmlns:cx3="http://schemas.microsoft.com/office/drawing/2016/5/9/chartex" xmlns:cx4="http://schemas.microsoft.com/office/drawing/2016/5/10/chartex" xmlns:cx5="http://schemas.microsoft.com/office/drawing/2016/5/11/chartex" xmlns:cx6="http://schemas.microsoft.com/office/drawing/2016/5/12/chartex" xmlns:cx7="http://schemas.microsoft.com/office/drawing/2016/5/13/chartex" xmlns:cx8="http://schemas.microsoft.com/office/drawing/2016/5/14/chartex" xmlns:mc="http://schemas.openxmlformats.org/markup-compatibility/2006" xmlns:aink="http://schemas.microsoft.com/office/drawing/2016/ink" xmlns:am3d="http://schemas.microsoft.com/office/drawing/2017/model3d" xmlns:o="urn:schemas-microsoft-com:office:office" xmlns:oel="http://schemas.microsoft.com/office/2019/extlst" xmlns:r="http://schemas.openxmlformats.org/officeDocument/2006/relationships" xmlns:m="http://schemas.openxmlformats.org/officeDocument/2006/math" xmlns:v="urn:schemas-microsoft-com:vml" xmlns:wp14="http://schemas.microsoft.com/office/word/2010/wordprocessingDrawing" xmlns:wp="http://schemas.openxmlformats.org/drawingml/2006/wordprocessingDrawing" xmlns:w10="urn:schemas-microsoft-com:office:word" xmlns:w="http://schemas.openxmlformats.org/wordprocessingml/2006/main" xmlns:w14="http://schemas.microsoft.com/office/word/2010/wordml" xmlns:w15="http://schemas.microsoft.com/office/word/2012/wordml" xmlns:w16cex="http://schemas.microsoft.com/office/word/2018/wordml/cex" xmlns:w16cid="http://schemas.microsoft.com/office/word/2016/wordml/cid" xmlns:w16="http://schemas.microsoft.com/office/word/2018/wordml" xmlns:w16du="http://schemas.microsoft.com/office/word/2023/wordml/word16du" xmlns:w16sdtdh="http://schemas.microsoft.com/office/word/2020/wordml/sdtdatahash" xmlns:w16sdtfl="http://schemas.microsoft.com/office/word/2024/wordml/sdtformatlock" xmlns:w16se="http://schemas.microsoft.com/office/word/2015/wordml/symex" xmlns:wpg="http://schemas.microsoft.com/office/word/2010/wordprocessingGroup" xmlns:wpi="http://schemas.microsoft.com/office/word/2010/wordprocessingInk" xmlns:wne="http://schemas.microsoft.com/office/word/2006/wordml" xmlns:wps="http://schemas.microsoft.com/office/word/2010/wordprocessingShape" mc:Ignorable="w14 w15 w16se w16cid w16 w16cex w16sdtdh w16sdtfl w16du wp14">
+  <w:p>
+    <w:pPr>
+      <w:pStyle w:val="Stopka"/>
+      <w:tabs>
+        <w:tab w:val="clear" w:pos="4536"/>
+        <w:tab w:val="clear" w:pos="9072"/>
+        <w:tab w:val="left" w:pos="3516"/>
+      </w:tabs>
+    </w:pPr>
+    <w:r>
+      <w:rPr>
+        <w:noProof/>
+      </w:rPr>
+      <w:drawing>
+        <wp:anchor distT="0" distB="0" distL="114300" distR="114300" simplePos="0" relativeHeight="251665408" behindDoc="1" locked="0" layoutInCell="1" allowOverlap="1" wp14:anchorId="7AFAA796" wp14:editId="4758F503">
+          <wp:simplePos x="0" y="0"/>
+          <wp:positionH relativeFrom="margin">
+            <wp:align>center</wp:align>
+          </wp:positionH>
+          <wp:positionV relativeFrom="paragraph">
+            <wp:posOffset>-982980</wp:posOffset>
+          </wp:positionV>
+          <wp:extent cx="7124700" cy="1445622"/>
+          <wp:effectExtent l="0" t="0" r="0" b="2540"/>
+          <wp:wrapNone/>
+          <wp:docPr id="4" name="Obraz 1"/>
+          <wp:cNvGraphicFramePr>
+            <a:graphicFrameLocks xmlns:a="http://schemas.openxmlformats.org/drawingml/2006/main" noChangeAspect="1"/>
+          </wp:cNvGraphicFramePr>
+          <a:graphic xmlns:a="http://schemas.openxmlformats.org/drawingml/2006/main">
+            <a:graphicData uri="http://schemas.openxmlformats.org/drawingml/2006/picture">
+              <pic:pic xmlns:pic="http://schemas.openxmlformats.org/drawingml/2006/picture">
+                <pic:nvPicPr>
+                  <pic:cNvPr id="4" name="Obraz 4"/>
+                  <pic:cNvPicPr>
+                    <a:picLocks noChangeAspect="1"/>
+                  </pic:cNvPicPr>
+                </pic:nvPicPr>
+                <pic:blipFill>
+                  <a:blip r:embed="rId1">
+                    <a:extLst>
+                      <a:ext uri="{28A0092B-C50C-407E-A947-70E740481C1C}">
+                        <a14:useLocalDpi xmlns:a14="http://schemas.microsoft.com/office/drawing/2010/main" val="0"/>
+                      </a:ext>
+                    </a:extLst>
+                  </a:blip>
+                  <a:stretch>
+                    <a:fillRect/>
+                  </a:stretch>
+                </pic:blipFill>
+                <pic:spPr>
+                  <a:xfrm>
+                    <a:off x="0" y="0"/>
+                    <a:ext cx="7124700" cy="1445622"/>
+                  </a:xfrm>
+                  <a:prstGeom prst="rect">
+                    <a:avLst/>
+                  </a:prstGeom>
+                </pic:spPr>
+              </pic:pic>
+            </a:graphicData>
+          </a:graphic>
+          <wp14:sizeRelH relativeFrom="margin">
+            <wp14:pctWidth>0</wp14:pctWidth>
+          </wp14:sizeRelH>
+          <wp14:sizeRelV relativeFrom="margin">
+            <wp14:pctHeight>0</wp14:pctHeight>
+          </wp14:sizeRelV>
+        </wp:anchor>
+      </w:drawing>
+    </w:r>
+    <w:r>
+      <w:tab/>
+    </w:r>
+  </w:p>
+</w:ftr>
 </file>
 
 <file path=word/footnotes.xml><?xml version="1.0" encoding="utf-8"?>
@@ -2214,8 +3648,6 @@
       <w:pStyle w:val="Nagwek"/>
       <w:rPr>
         <w:rFonts w:ascii="Lato" w:hAnsi="Lato"/>
-        <w:b/>
-        <w:bCs/>
         <w:sz w:val="18"/>
         <w:szCs w:val="18"/>
       </w:rPr>
@@ -2227,7 +3659,7 @@
         <w:noProof/>
       </w:rPr>
       <w:drawing>
-        <wp:anchor distT="0" distB="0" distL="114300" distR="114300" simplePos="0" relativeHeight="251659264" behindDoc="0" locked="0" layoutInCell="1" allowOverlap="1" wp14:anchorId="1CBD669E" wp14:editId="2C7384A8">
+        <wp:anchor distT="0" distB="0" distL="114300" distR="114300" simplePos="0" relativeHeight="251659264" behindDoc="0" locked="0" layoutInCell="1" allowOverlap="1" wp14:anchorId="1CBD669E" wp14:editId="4501C790">
           <wp:simplePos x="0" y="0"/>
           <wp:positionH relativeFrom="margin">
             <wp:posOffset>-451485</wp:posOffset>
@@ -2238,7 +3670,7 @@
           <wp:extent cx="2867025" cy="516065"/>
           <wp:effectExtent l="0" t="0" r="0" b="0"/>
           <wp:wrapNone/>
-          <wp:docPr id="1787138775" name="Obraz 8" descr="Obraz zawierający tekst, Czcionka, biały, Grafika&#10;&#10;Opis wygenerowany automatycznie"/>
+          <wp:docPr id="114511367" name="Obraz 8" descr="Obraz zawierający tekst, Czcionka, biały, Grafika&#10;&#10;Opis wygenerowany automatycznie"/>
           <wp:cNvGraphicFramePr>
             <a:graphicFrameLocks xmlns:a="http://schemas.openxmlformats.org/drawingml/2006/main" noChangeAspect="1"/>
           </wp:cNvGraphicFramePr>
@@ -2297,7 +3729,93 @@
         <w:sz w:val="18"/>
         <w:szCs w:val="18"/>
       </w:rPr>
-      <w:t>14.</w:t>
+      <w:t>09.06.2026</w:t>
+    </w:r>
+  </w:p>
+</w:hdr>
+</file>
+
+<file path=word/header2.xml><?xml version="1.0" encoding="utf-8"?>
+<w:hdr xmlns:wpc="http://schemas.microsoft.com/office/word/2010/wordprocessingCanvas" xmlns:cx="http://schemas.microsoft.com/office/drawing/2014/chartex" xmlns:cx1="http://schemas.microsoft.com/office/drawing/2015/9/8/chartex" xmlns:cx2="http://schemas.microsoft.com/office/drawing/2015/10/21/chartex" xmlns:cx3="http://schemas.microsoft.com/office/drawing/2016/5/9/chartex" xmlns:cx4="http://schemas.microsoft.com/office/drawing/2016/5/10/chartex" xmlns:cx5="http://schemas.microsoft.com/office/drawing/2016/5/11/chartex" xmlns:cx6="http://schemas.microsoft.com/office/drawing/2016/5/12/chartex" xmlns:cx7="http://schemas.microsoft.com/office/drawing/2016/5/13/chartex" xmlns:cx8="http://schemas.microsoft.com/office/drawing/2016/5/14/chartex" xmlns:mc="http://schemas.openxmlformats.org/markup-compatibility/2006" xmlns:aink="http://schemas.microsoft.com/office/drawing/2016/ink" xmlns:am3d="http://schemas.microsoft.com/office/drawing/2017/model3d" xmlns:o="urn:schemas-microsoft-com:office:office" xmlns:oel="http://schemas.microsoft.com/office/2019/extlst" xmlns:r="http://schemas.openxmlformats.org/officeDocument/2006/relationships" xmlns:m="http://schemas.openxmlformats.org/officeDocument/2006/math" xmlns:v="urn:schemas-microsoft-com:vml" xmlns:wp14="http://schemas.microsoft.com/office/word/2010/wordprocessingDrawing" xmlns:wp="http://schemas.openxmlformats.org/drawingml/2006/wordprocessingDrawing" xmlns:w10="urn:schemas-microsoft-com:office:word" xmlns:w="http://schemas.openxmlformats.org/wordprocessingml/2006/main" xmlns:w14="http://schemas.microsoft.com/office/word/2010/wordml" xmlns:w15="http://schemas.microsoft.com/office/word/2012/wordml" xmlns:w16cex="http://schemas.microsoft.com/office/word/2018/wordml/cex" xmlns:w16cid="http://schemas.microsoft.com/office/word/2016/wordml/cid" xmlns:w16="http://schemas.microsoft.com/office/word/2018/wordml" xmlns:w16du="http://schemas.microsoft.com/office/word/2023/wordml/word16du" xmlns:w16sdtdh="http://schemas.microsoft.com/office/word/2020/wordml/sdtdatahash" xmlns:w16sdtfl="http://schemas.microsoft.com/office/word/2024/wordml/sdtformatlock" xmlns:w16se="http://schemas.microsoft.com/office/word/2015/wordml/symex" xmlns:wpg="http://schemas.microsoft.com/office/word/2010/wordprocessingGroup" xmlns:wpi="http://schemas.microsoft.com/office/word/2010/wordprocessingInk" xmlns:wne="http://schemas.microsoft.com/office/word/2006/wordml" xmlns:wps="http://schemas.microsoft.com/office/word/2010/wordprocessingShape" mc:Ignorable="w14 w15 w16se w16cid w16 w16cex w16sdtdh w16sdtfl w16du wp14">
+  <w:p>
+    <w:pPr>
+      <w:pStyle w:val="Nagwek"/>
+      <w:jc w:val="right"/>
+      <w:rPr>
+        <w:rFonts w:ascii="Lato" w:hAnsi="Lato"/>
+        <w:b/>
+        <w:bCs/>
+        <w:sz w:val="18"/>
+        <w:szCs w:val="18"/>
+      </w:rPr>
+    </w:pPr>
+    <w:r>
+      <w:rPr>
+        <w:rFonts w:ascii="Lato" w:hAnsi="Lato"/>
+        <w:b/>
+        <w:bCs/>
+        <w:i/>
+        <w:iCs/>
+        <w:noProof/>
+        <w:sz w:val="18"/>
+        <w:szCs w:val="18"/>
+      </w:rPr>
+      <w:drawing>
+        <wp:anchor distT="0" distB="0" distL="114300" distR="114300" simplePos="0" relativeHeight="251663360" behindDoc="0" locked="0" layoutInCell="1" allowOverlap="1" wp14:anchorId="00E90BD6" wp14:editId="0A4A3233">
+          <wp:simplePos x="0" y="0"/>
+          <wp:positionH relativeFrom="margin">
+            <wp:posOffset>-276860</wp:posOffset>
+          </wp:positionH>
+          <wp:positionV relativeFrom="paragraph">
+            <wp:posOffset>-227965</wp:posOffset>
+          </wp:positionV>
+          <wp:extent cx="2867025" cy="516065"/>
+          <wp:effectExtent l="0" t="0" r="0" b="0"/>
+          <wp:wrapNone/>
+          <wp:docPr id="230218762" name="Obraz 8" descr="Obraz zawierający tekst, Czcionka, biały, Grafika&#10;&#10;Opis wygenerowany automatycznie"/>
+          <wp:cNvGraphicFramePr>
+            <a:graphicFrameLocks xmlns:a="http://schemas.openxmlformats.org/drawingml/2006/main" noChangeAspect="1"/>
+          </wp:cNvGraphicFramePr>
+          <a:graphic xmlns:a="http://schemas.openxmlformats.org/drawingml/2006/main">
+            <a:graphicData uri="http://schemas.openxmlformats.org/drawingml/2006/picture">
+              <pic:pic xmlns:pic="http://schemas.openxmlformats.org/drawingml/2006/picture">
+                <pic:nvPicPr>
+                  <pic:cNvPr id="1787138775" name="Obraz 8" descr="Obraz zawierający tekst, Czcionka, biały, Grafika&#10;&#10;Opis wygenerowany automatycznie"/>
+                  <pic:cNvPicPr>
+                    <a:picLocks noChangeAspect="1" noChangeArrowheads="1"/>
+                  </pic:cNvPicPr>
+                </pic:nvPicPr>
+                <pic:blipFill>
+                  <a:blip r:embed="rId1">
+                    <a:extLst>
+                      <a:ext uri="{28A0092B-C50C-407E-A947-70E740481C1C}">
+                        <a14:useLocalDpi xmlns:a14="http://schemas.microsoft.com/office/drawing/2010/main" val="0"/>
+                      </a:ext>
+                    </a:extLst>
+                  </a:blip>
+                  <a:srcRect/>
+                  <a:stretch>
+                    <a:fillRect/>
+                  </a:stretch>
+                </pic:blipFill>
+                <pic:spPr bwMode="auto">
+                  <a:xfrm>
+                    <a:off x="0" y="0"/>
+                    <a:ext cx="2867025" cy="516065"/>
+                  </a:xfrm>
+                  <a:prstGeom prst="rect">
+                    <a:avLst/>
+                  </a:prstGeom>
+                  <a:noFill/>
+                  <a:ln>
+                    <a:noFill/>
+                  </a:ln>
+                </pic:spPr>
+              </pic:pic>
+            </a:graphicData>
+          </a:graphic>
+        </wp:anchor>
+      </w:drawing>
     </w:r>
     <w:r>
       <w:rPr>
@@ -2307,30 +3825,247 @@
         <w:sz w:val="18"/>
         <w:szCs w:val="18"/>
       </w:rPr>
-      <w:t>0</w:t>
-    </w:r>
-    <w:r>
-      <w:rPr>
-        <w:rFonts w:ascii="Lato" w:hAnsi="Lato"/>
-        <w:b/>
-        <w:bCs/>
-        <w:sz w:val="18"/>
-        <w:szCs w:val="18"/>
-      </w:rPr>
-      <w:t>5.2026</w:t>
+      <w:t>09.06.2026</w:t>
     </w:r>
   </w:p>
-  <w:p>
-    <w:pPr>
-      <w:pStyle w:val="Nagwek"/>
-      <w:rPr>
-        <w:rFonts w:ascii="Lato" w:hAnsi="Lato"/>
-        <w:sz w:val="18"/>
-        <w:szCs w:val="18"/>
-      </w:rPr>
-    </w:pPr>
-  </w:p>
 </w:hdr>
+</file>
+
+<file path=word/numbering.xml><?xml version="1.0" encoding="utf-8"?>
+<w:numbering xmlns:wpc="http://schemas.microsoft.com/office/word/2010/wordprocessingCanvas" xmlns:cx="http://schemas.microsoft.com/office/drawing/2014/chartex" xmlns:cx1="http://schemas.microsoft.com/office/drawing/2015/9/8/chartex" xmlns:cx2="http://schemas.microsoft.com/office/drawing/2015/10/21/chartex" xmlns:cx3="http://schemas.microsoft.com/office/drawing/2016/5/9/chartex" xmlns:cx4="http://schemas.microsoft.com/office/drawing/2016/5/10/chartex" xmlns:cx5="http://schemas.microsoft.com/office/drawing/2016/5/11/chartex" xmlns:cx6="http://schemas.microsoft.com/office/drawing/2016/5/12/chartex" xmlns:cx7="http://schemas.microsoft.com/office/drawing/2016/5/13/chartex" xmlns:cx8="http://schemas.microsoft.com/office/drawing/2016/5/14/chartex" xmlns:mc="http://schemas.openxmlformats.org/markup-compatibility/2006" xmlns:aink="http://schemas.microsoft.com/office/drawing/2016/ink" xmlns:am3d="http://schemas.microsoft.com/office/drawing/2017/model3d" xmlns:o="urn:schemas-microsoft-com:office:office" xmlns:oel="http://schemas.microsoft.com/office/2019/extlst" xmlns:r="http://schemas.openxmlformats.org/officeDocument/2006/relationships" xmlns:m="http://schemas.openxmlformats.org/officeDocument/2006/math" xmlns:v="urn:schemas-microsoft-com:vml" xmlns:wp14="http://schemas.microsoft.com/office/word/2010/wordprocessingDrawing" xmlns:wp="http://schemas.openxmlformats.org/drawingml/2006/wordprocessingDrawing" xmlns:w10="urn:schemas-microsoft-com:office:word" xmlns:w="http://schemas.openxmlformats.org/wordprocessingml/2006/main" xmlns:w14="http://schemas.microsoft.com/office/word/2010/wordml" xmlns:w15="http://schemas.microsoft.com/office/word/2012/wordml" xmlns:w16cex="http://schemas.microsoft.com/office/word/2018/wordml/cex" xmlns:w16cid="http://schemas.microsoft.com/office/word/2016/wordml/cid" xmlns:w16="http://schemas.microsoft.com/office/word/2018/wordml" xmlns:w16du="http://schemas.microsoft.com/office/word/2023/wordml/word16du" xmlns:w16sdtdh="http://schemas.microsoft.com/office/word/2020/wordml/sdtdatahash" xmlns:w16sdtfl="http://schemas.microsoft.com/office/word/2024/wordml/sdtformatlock" xmlns:w16se="http://schemas.microsoft.com/office/word/2015/wordml/symex" xmlns:wpg="http://schemas.microsoft.com/office/word/2010/wordprocessingGroup" xmlns:wpi="http://schemas.microsoft.com/office/word/2010/wordprocessingInk" xmlns:wne="http://schemas.microsoft.com/office/word/2006/wordml" xmlns:wps="http://schemas.microsoft.com/office/word/2010/wordprocessingShape" mc:Ignorable="w14 w15 w16se w16cid w16 w16cex w16sdtdh w16sdtfl w16du wp14">
+  <w:abstractNum w:abstractNumId="0" w15:restartNumberingAfterBreak="0">
+    <w:nsid w:val="1B316F14"/>
+    <w:multiLevelType w:val="multilevel"/>
+    <w:tmpl w:val="2E80563E"/>
+    <w:lvl w:ilvl="0">
+      <w:start w:val="1"/>
+      <w:numFmt w:val="decimal"/>
+      <w:lvlText w:val="%1."/>
+      <w:lvlJc w:val="left"/>
+      <w:pPr>
+        <w:tabs>
+          <w:tab w:val="num" w:pos="720"/>
+        </w:tabs>
+        <w:ind w:left="720" w:hanging="720"/>
+      </w:pPr>
+    </w:lvl>
+    <w:lvl w:ilvl="1">
+      <w:start w:val="1"/>
+      <w:numFmt w:val="decimal"/>
+      <w:lvlText w:val="%2."/>
+      <w:lvlJc w:val="left"/>
+      <w:pPr>
+        <w:tabs>
+          <w:tab w:val="num" w:pos="1440"/>
+        </w:tabs>
+        <w:ind w:left="1440" w:hanging="720"/>
+      </w:pPr>
+    </w:lvl>
+    <w:lvl w:ilvl="2">
+      <w:start w:val="1"/>
+      <w:numFmt w:val="decimal"/>
+      <w:lvlText w:val="%3."/>
+      <w:lvlJc w:val="left"/>
+      <w:pPr>
+        <w:tabs>
+          <w:tab w:val="num" w:pos="2160"/>
+        </w:tabs>
+        <w:ind w:left="2160" w:hanging="720"/>
+      </w:pPr>
+    </w:lvl>
+    <w:lvl w:ilvl="3">
+      <w:start w:val="1"/>
+      <w:numFmt w:val="decimal"/>
+      <w:lvlText w:val="%4."/>
+      <w:lvlJc w:val="left"/>
+      <w:pPr>
+        <w:tabs>
+          <w:tab w:val="num" w:pos="2880"/>
+        </w:tabs>
+        <w:ind w:left="2880" w:hanging="720"/>
+      </w:pPr>
+    </w:lvl>
+    <w:lvl w:ilvl="4">
+      <w:start w:val="1"/>
+      <w:numFmt w:val="decimal"/>
+      <w:lvlText w:val="%5."/>
+      <w:lvlJc w:val="left"/>
+      <w:pPr>
+        <w:tabs>
+          <w:tab w:val="num" w:pos="3600"/>
+        </w:tabs>
+        <w:ind w:left="3600" w:hanging="720"/>
+      </w:pPr>
+    </w:lvl>
+    <w:lvl w:ilvl="5">
+      <w:start w:val="1"/>
+      <w:numFmt w:val="decimal"/>
+      <w:lvlText w:val="%6."/>
+      <w:lvlJc w:val="left"/>
+      <w:pPr>
+        <w:tabs>
+          <w:tab w:val="num" w:pos="4320"/>
+        </w:tabs>
+        <w:ind w:left="4320" w:hanging="720"/>
+      </w:pPr>
+    </w:lvl>
+    <w:lvl w:ilvl="6">
+      <w:start w:val="1"/>
+      <w:numFmt w:val="decimal"/>
+      <w:lvlText w:val="%7."/>
+      <w:lvlJc w:val="left"/>
+      <w:pPr>
+        <w:tabs>
+          <w:tab w:val="num" w:pos="5040"/>
+        </w:tabs>
+        <w:ind w:left="5040" w:hanging="720"/>
+      </w:pPr>
+    </w:lvl>
+    <w:lvl w:ilvl="7">
+      <w:start w:val="1"/>
+      <w:numFmt w:val="decimal"/>
+      <w:lvlText w:val="%8."/>
+      <w:lvlJc w:val="left"/>
+      <w:pPr>
+        <w:tabs>
+          <w:tab w:val="num" w:pos="5760"/>
+        </w:tabs>
+        <w:ind w:left="5760" w:hanging="720"/>
+      </w:pPr>
+    </w:lvl>
+    <w:lvl w:ilvl="8">
+      <w:start w:val="1"/>
+      <w:numFmt w:val="decimal"/>
+      <w:lvlText w:val="%9."/>
+      <w:lvlJc w:val="left"/>
+      <w:pPr>
+        <w:tabs>
+          <w:tab w:val="num" w:pos="6480"/>
+        </w:tabs>
+        <w:ind w:left="6480" w:hanging="720"/>
+      </w:pPr>
+    </w:lvl>
+  </w:abstractNum>
+  <w:abstractNum w:abstractNumId="1" w15:restartNumberingAfterBreak="0">
+    <w:nsid w:val="21EB6D73"/>
+    <w:multiLevelType w:val="multilevel"/>
+    <w:tmpl w:val="40BA9534"/>
+    <w:lvl w:ilvl="0">
+      <w:start w:val="1"/>
+      <w:numFmt w:val="decimal"/>
+      <w:lvlText w:val="%1."/>
+      <w:lvlJc w:val="left"/>
+      <w:pPr>
+        <w:tabs>
+          <w:tab w:val="num" w:pos="720"/>
+        </w:tabs>
+        <w:ind w:left="720" w:hanging="720"/>
+      </w:pPr>
+    </w:lvl>
+    <w:lvl w:ilvl="1">
+      <w:start w:val="1"/>
+      <w:numFmt w:val="decimal"/>
+      <w:lvlText w:val="%2."/>
+      <w:lvlJc w:val="left"/>
+      <w:pPr>
+        <w:tabs>
+          <w:tab w:val="num" w:pos="1440"/>
+        </w:tabs>
+        <w:ind w:left="1440" w:hanging="720"/>
+      </w:pPr>
+    </w:lvl>
+    <w:lvl w:ilvl="2">
+      <w:start w:val="1"/>
+      <w:numFmt w:val="decimal"/>
+      <w:lvlText w:val="%3."/>
+      <w:lvlJc w:val="left"/>
+      <w:pPr>
+        <w:tabs>
+          <w:tab w:val="num" w:pos="2160"/>
+        </w:tabs>
+        <w:ind w:left="2160" w:hanging="720"/>
+      </w:pPr>
+    </w:lvl>
+    <w:lvl w:ilvl="3">
+      <w:start w:val="1"/>
+      <w:numFmt w:val="decimal"/>
+      <w:lvlText w:val="%4."/>
+      <w:lvlJc w:val="left"/>
+      <w:pPr>
+        <w:tabs>
+          <w:tab w:val="num" w:pos="2880"/>
+        </w:tabs>
+        <w:ind w:left="2880" w:hanging="720"/>
+      </w:pPr>
+    </w:lvl>
+    <w:lvl w:ilvl="4">
+      <w:start w:val="1"/>
+      <w:numFmt w:val="decimal"/>
+      <w:lvlText w:val="%5."/>
+      <w:lvlJc w:val="left"/>
+      <w:pPr>
+        <w:tabs>
+          <w:tab w:val="num" w:pos="3600"/>
+        </w:tabs>
+        <w:ind w:left="3600" w:hanging="720"/>
+      </w:pPr>
+    </w:lvl>
+    <w:lvl w:ilvl="5">
+      <w:start w:val="1"/>
+      <w:numFmt w:val="decimal"/>
+      <w:lvlText w:val="%6."/>
+      <w:lvlJc w:val="left"/>
+      <w:pPr>
+        <w:tabs>
+          <w:tab w:val="num" w:pos="4320"/>
+        </w:tabs>
+        <w:ind w:left="4320" w:hanging="720"/>
+      </w:pPr>
+    </w:lvl>
+    <w:lvl w:ilvl="6">
+      <w:start w:val="1"/>
+      <w:numFmt w:val="decimal"/>
+      <w:lvlText w:val="%7."/>
+      <w:lvlJc w:val="left"/>
+      <w:pPr>
+        <w:tabs>
+          <w:tab w:val="num" w:pos="5040"/>
+        </w:tabs>
+        <w:ind w:left="5040" w:hanging="720"/>
+      </w:pPr>
+    </w:lvl>
+    <w:lvl w:ilvl="7">
+      <w:start w:val="1"/>
+      <w:numFmt w:val="decimal"/>
+      <w:lvlText w:val="%8."/>
+      <w:lvlJc w:val="left"/>
+      <w:pPr>
+        <w:tabs>
+          <w:tab w:val="num" w:pos="5760"/>
+        </w:tabs>
+        <w:ind w:left="5760" w:hanging="720"/>
+      </w:pPr>
+    </w:lvl>
+    <w:lvl w:ilvl="8">
+      <w:start w:val="1"/>
+      <w:numFmt w:val="decimal"/>
+      <w:lvlText w:val="%9."/>
+      <w:lvlJc w:val="left"/>
+      <w:pPr>
+        <w:tabs>
+          <w:tab w:val="num" w:pos="6480"/>
+        </w:tabs>
+        <w:ind w:left="6480" w:hanging="720"/>
+      </w:pPr>
+    </w:lvl>
+  </w:abstractNum>
+  <w:num w:numId="1" w16cid:durableId="891426963">
+    <w:abstractNumId w:val="1"/>
+  </w:num>
+  <w:num w:numId="2" w16cid:durableId="1896164761">
+    <w:abstractNumId w:val="0"/>
+  </w:num>
+</w:numbering>
 </file>
 
 <file path=word/styles.xml><?xml version="1.0" encoding="utf-8"?>
@@ -2532,7 +4267,7 @@
     <w:lsdException w:name="Medium Shading 2 Accent 1" w:uiPriority="64"/>
     <w:lsdException w:name="Medium List 1 Accent 1" w:uiPriority="65"/>
     <w:lsdException w:name="Revision" w:semiHidden="1"/>
-    <w:lsdException w:name="List Paragraph" w:uiPriority="34" w:qFormat="1"/>
+    <w:lsdException w:name="List Paragraph" w:uiPriority="0" w:qFormat="1"/>
     <w:lsdException w:name="Quote" w:uiPriority="29" w:qFormat="1"/>
     <w:lsdException w:name="Intense Quote" w:uiPriority="30" w:qFormat="1"/>
     <w:lsdException w:name="Medium List 2 Accent 1" w:uiPriority="66"/>
@@ -3181,7 +4916,6 @@
   <w:style w:type="paragraph" w:styleId="Akapitzlist">
     <w:name w:val="List Paragraph"/>
     <w:basedOn w:val="Normalny"/>
-    <w:uiPriority w:val="34"/>
     <w:qFormat/>
     <w:rsid w:val="008A2297"/>
     <w:pPr>
@@ -3378,6 +5112,29 @@
     <w:uiPriority w:val="1"/>
     <w:rsid w:val="00C645D9"/>
   </w:style>
+  <w:style w:type="character" w:styleId="Hipercze">
+    <w:name w:val="Hyperlink"/>
+    <w:basedOn w:val="Domylnaczcionkaakapitu"/>
+    <w:uiPriority w:val="99"/>
+    <w:unhideWhenUsed/>
+    <w:rsid w:val="00FF079E"/>
+    <w:rPr>
+      <w:color w:val="467886" w:themeColor="hyperlink"/>
+      <w:u w:val="single"/>
+    </w:rPr>
+  </w:style>
+  <w:style w:type="character" w:styleId="Nierozpoznanawzmianka">
+    <w:name w:val="Unresolved Mention"/>
+    <w:basedOn w:val="Domylnaczcionkaakapitu"/>
+    <w:uiPriority w:val="99"/>
+    <w:semiHidden/>
+    <w:unhideWhenUsed/>
+    <w:rsid w:val="00FF079E"/>
+    <w:rPr>
+      <w:color w:val="605E5C"/>
+      <w:shd w:val="clear" w:color="auto" w:fill="E1DFDD"/>
+    </w:rPr>
+  </w:style>
 </w:styles>
 </file>
 
@@ -3425,6 +5182,103 @@
         </w:p>
       </w:docPartBody>
     </w:docPart>
+    <w:docPart>
+      <w:docPartPr>
+        <w:name w:val="F2D8582A4D50444BA1BCBAFA6EF41B86"/>
+        <w:category>
+          <w:name w:val="Ogólne"/>
+          <w:gallery w:val="placeholder"/>
+        </w:category>
+        <w:types>
+          <w:type w:val="bbPlcHdr"/>
+        </w:types>
+        <w:behaviors>
+          <w:behavior w:val="content"/>
+        </w:behaviors>
+        <w:guid w:val="{114D7EFF-9436-49FD-9896-8BAC5EAD12FD}"/>
+      </w:docPartPr>
+      <w:docPartBody>
+        <w:p>
+          <w:pPr>
+            <w:pStyle w:val="F2D8582A4D50444BA1BCBAFA6EF41B86"/>
+          </w:pPr>
+          <w:r>
+            <w:rPr>
+              <w:rStyle w:val="Tekstzastpczy"/>
+            </w:rPr>
+            <w:t xml:space="preserve">Wybierz </w:t>
+          </w:r>
+          <w:r>
+            <w:rPr>
+              <w:rStyle w:val="Tekstzastpczy"/>
+            </w:rPr>
+            <w:t>kolor toru</w:t>
+          </w:r>
+        </w:p>
+      </w:docPartBody>
+    </w:docPart>
+    <w:docPart>
+      <w:docPartPr>
+        <w:name w:val="52A659DDF8B34231B94ABD37CE182CCE"/>
+        <w:category>
+          <w:name w:val="Ogólne"/>
+          <w:gallery w:val="placeholder"/>
+        </w:category>
+        <w:types>
+          <w:type w:val="bbPlcHdr"/>
+        </w:types>
+        <w:behaviors>
+          <w:behavior w:val="content"/>
+        </w:behaviors>
+        <w:guid w:val="{F70EF702-6429-4051-97B8-421570B15459}"/>
+      </w:docPartPr>
+      <w:docPartBody>
+        <w:p>
+          <w:pPr>
+            <w:pStyle w:val="52A659DDF8B34231B94ABD37CE182CCE1"/>
+          </w:pPr>
+          <w:r>
+            <w:rPr>
+              <w:rStyle w:val="Tekstzastpczy"/>
+              <w:rFonts w:ascii="Lato" w:hAnsi="Lato"/>
+              <w:sz w:val="20"/>
+              <w:szCs w:val="20"/>
+              <w:lang w:val="en-GB"/>
+            </w:rPr>
+            <w:t>Cena transportu</w:t>
+          </w:r>
+        </w:p>
+      </w:docPartBody>
+    </w:docPart>
+    <w:docPart>
+      <w:docPartPr>
+        <w:name w:val="631B74F7A4104B66B4FE428300330972"/>
+        <w:category>
+          <w:name w:val="Ogólne"/>
+          <w:gallery w:val="placeholder"/>
+        </w:category>
+        <w:types>
+          <w:type w:val="bbPlcHdr"/>
+        </w:types>
+        <w:behaviors>
+          <w:behavior w:val="content"/>
+        </w:behaviors>
+        <w:guid w:val="{8696B35C-E414-4134-825F-9A90E3AC80C4}"/>
+      </w:docPartPr>
+      <w:docPartBody>
+        <w:p>
+          <w:pPr>
+            <w:pStyle w:val="631B74F7A4104B66B4FE4283003309721"/>
+          </w:pPr>
+          <w:r>
+            <w:rPr>
+              <w:rStyle w:val="Tekstzastpczy"/>
+            </w:rPr>
+            <w:t>Wartość</w:t>
+          </w:r>
+        </w:p>
+      </w:docPartBody>
+    </w:docPart>
   </w:docParts>
 </w:glossaryDocument>
 </file>
@@ -3465,7 +5319,7 @@
   </w:font>
   <w:font w:name="Tahoma">
     <w:panose1 w:val="020B0604030504040204"/>
-    <w:charset w:val="EE"/>
+    <w:charset w:val="00"/>
     <w:family w:val="swiss"/>
     <w:pitch w:val="variable"/>
     <w:sig w:usb0="E1002EFF" w:usb1="C000605B" w:usb2="00000029" w:usb3="00000000" w:csb0="000101FF" w:csb1="00000000"/>
@@ -3476,6 +5330,12 @@
     <w:family w:val="swiss"/>
     <w:pitch w:val="variable"/>
     <w:sig w:usb0="E0002EFF" w:usb1="C000785B" w:usb2="00000009" w:usb3="00000000" w:csb0="000001FF" w:csb1="00000000"/>
+  </w:font>
+  <w:font w:name="Lato Black">
+    <w:charset w:val="00"/>
+    <w:family w:val="swiss"/>
+    <w:pitch w:val="variable"/>
+    <w:sig w:usb0="E10002FF" w:usb1="5000ECFF" w:usb2="00000021" w:usb3="00000000" w:csb0="0000019F" w:csb1="00000000"/>
   </w:font>
 </w:fonts>
 </file>
@@ -3503,6 +5363,10 @@
     <w:rsid w:val="000B36AD"/>
     <w:rsid w:val="0011521F"/>
     <w:rsid w:val="0011660A"/>
+    <w:rsid w:val="001E339C"/>
+    <w:rsid w:val="002163AA"/>
+    <w:rsid w:val="00225A8E"/>
+    <w:rsid w:val="0027338B"/>
     <w:rsid w:val="00274E42"/>
     <w:rsid w:val="002A4B89"/>
     <w:rsid w:val="002C53A2"/>
@@ -3520,6 +5384,7 @@
     <w:rsid w:val="0052362D"/>
     <w:rsid w:val="005278D1"/>
     <w:rsid w:val="00544658"/>
+    <w:rsid w:val="00555EFB"/>
     <w:rsid w:val="0057081F"/>
     <w:rsid w:val="005A089D"/>
     <w:rsid w:val="005A1CBC"/>
@@ -3538,6 +5403,7 @@
     <w:rsid w:val="00816FCC"/>
     <w:rsid w:val="00827012"/>
     <w:rsid w:val="008A140A"/>
+    <w:rsid w:val="008F2101"/>
     <w:rsid w:val="00910631"/>
     <w:rsid w:val="00924ABD"/>
     <w:rsid w:val="0093601B"/>
@@ -3551,6 +5417,7 @@
     <w:rsid w:val="00AD061D"/>
     <w:rsid w:val="00AD7DCB"/>
     <w:rsid w:val="00B345B2"/>
+    <w:rsid w:val="00B7297A"/>
     <w:rsid w:val="00B8134A"/>
     <w:rsid w:val="00B9467B"/>
     <w:rsid w:val="00BD3585"/>
@@ -3560,9 +5427,11 @@
     <w:rsid w:val="00C73640"/>
     <w:rsid w:val="00C84558"/>
     <w:rsid w:val="00C976A1"/>
+    <w:rsid w:val="00CD0DBB"/>
     <w:rsid w:val="00CE4786"/>
     <w:rsid w:val="00CF03DA"/>
     <w:rsid w:val="00D60EA5"/>
+    <w:rsid w:val="00D62362"/>
     <w:rsid w:val="00D85957"/>
     <w:rsid w:val="00DC092A"/>
     <w:rsid w:val="00E81563"/>
@@ -4025,11 +5894,42 @@
     <w:basedOn w:val="Domylnaczcionkaakapitu"/>
     <w:uiPriority w:val="99"/>
     <w:semiHidden/>
-    <w:rsid w:val="00636A3D"/>
+    <w:rsid w:val="0027338B"/>
+    <w:rPr>
+      <w:color w:val="808080"/>
+    </w:rPr>
   </w:style>
   <w:style w:type="paragraph" w:customStyle="1" w:styleId="EAB7688BF63C4764B3086C9F2BC2A37C">
     <w:name w:val="EAB7688BF63C4764B3086C9F2BC2A37C"/>
     <w:rsid w:val="007B2028"/>
+  </w:style>
+  <w:style w:type="paragraph" w:customStyle="1" w:styleId="F2D8582A4D50444BA1BCBAFA6EF41B86">
+    <w:name w:val="F2D8582A4D50444BA1BCBAFA6EF41B86"/>
+    <w:rsid w:val="0027338B"/>
+  </w:style>
+  <w:style w:type="paragraph" w:customStyle="1" w:styleId="52A659DDF8B34231B94ABD37CE182CCE">
+    <w:name w:val="52A659DDF8B34231B94ABD37CE182CCE"/>
+    <w:rsid w:val="0027338B"/>
+  </w:style>
+  <w:style w:type="paragraph" w:customStyle="1" w:styleId="631B74F7A4104B66B4FE428300330972">
+    <w:name w:val="631B74F7A4104B66B4FE428300330972"/>
+    <w:rsid w:val="0027338B"/>
+  </w:style>
+  <w:style w:type="paragraph" w:customStyle="1" w:styleId="52A659DDF8B34231B94ABD37CE182CCE1">
+    <w:name w:val="52A659DDF8B34231B94ABD37CE182CCE1"/>
+    <w:rsid w:val="0027338B"/>
+    <w:rPr>
+      <w:rFonts w:eastAsiaTheme="minorHAnsi"/>
+      <w:lang w:eastAsia="en-US"/>
+    </w:rPr>
+  </w:style>
+  <w:style w:type="paragraph" w:customStyle="1" w:styleId="631B74F7A4104B66B4FE4283003309721">
+    <w:name w:val="631B74F7A4104B66B4FE4283003309721"/>
+    <w:rsid w:val="0027338B"/>
+    <w:rPr>
+      <w:rFonts w:eastAsiaTheme="minorHAnsi"/>
+      <w:lang w:eastAsia="en-US"/>
+    </w:rPr>
   </w:style>
 </w:styles>
 </file>

</xml_diff>

<commit_message>
More or less working additional calculations. No additional panel change yet. Semi-auto in OP50 bug to be fixed.
</commit_message>
<xml_diff>
--- a/krolik_doswiadczalny.docx
+++ b/krolik_doswiadczalny.docx
@@ -1,6 +1,6 @@
 
 <file path=word/document.xml><?xml version="1.0" encoding="utf-8"?>
-<w:document xmlns:wpc="http://schemas.microsoft.com/office/word/2010/wordprocessingCanvas" xmlns:cx="http://schemas.microsoft.com/office/drawing/2014/chartex" xmlns:cx1="http://schemas.microsoft.com/office/drawing/2015/9/8/chartex" xmlns:cx2="http://schemas.microsoft.com/office/drawing/2015/10/21/chartex" xmlns:cx3="http://schemas.microsoft.com/office/drawing/2016/5/9/chartex" xmlns:cx4="http://schemas.microsoft.com/office/drawing/2016/5/10/chartex" xmlns:cx5="http://schemas.microsoft.com/office/drawing/2016/5/11/chartex" xmlns:cx6="http://schemas.microsoft.com/office/drawing/2016/5/12/chartex" xmlns:cx7="http://schemas.microsoft.com/office/drawing/2016/5/13/chartex" xmlns:cx8="http://schemas.microsoft.com/office/drawing/2016/5/14/chartex" xmlns:mc="http://schemas.openxmlformats.org/markup-compatibility/2006" xmlns:aink="http://schemas.microsoft.com/office/drawing/2016/ink" xmlns:am3d="http://schemas.microsoft.com/office/drawing/2017/model3d" xmlns:o="urn:schemas-microsoft-com:office:office" xmlns:oel="http://schemas.microsoft.com/office/2019/extlst" xmlns:r="http://schemas.openxmlformats.org/officeDocument/2006/relationships" xmlns:m="http://schemas.openxmlformats.org/officeDocument/2006/math" xmlns:v="urn:schemas-microsoft-com:vml" xmlns:wp14="http://schemas.microsoft.com/office/word/2010/wordprocessingDrawing" xmlns:wp="http://schemas.openxmlformats.org/drawingml/2006/wordprocessingDrawing" xmlns:w10="urn:schemas-microsoft-com:office:word" xmlns:w="http://schemas.openxmlformats.org/wordprocessingml/2006/main" xmlns:w14="http://schemas.microsoft.com/office/word/2010/wordml" xmlns:w15="http://schemas.microsoft.com/office/word/2012/wordml" xmlns:w16cex="http://schemas.microsoft.com/office/word/2018/wordml/cex" xmlns:w16cid="http://schemas.microsoft.com/office/word/2016/wordml/cid" xmlns:w16="http://schemas.microsoft.com/office/word/2018/wordml" xmlns:w16du="http://schemas.microsoft.com/office/word/2023/wordml/word16du" xmlns:w16sdtdh="http://schemas.microsoft.com/office/word/2020/wordml/sdtdatahash" xmlns:w16sdtfl="http://schemas.microsoft.com/office/word/2024/wordml/sdtformatlock" xmlns:w16se="http://schemas.microsoft.com/office/word/2015/wordml/symex" xmlns:wpg="http://schemas.microsoft.com/office/word/2010/wordprocessingGroup" xmlns:wpi="http://schemas.microsoft.com/office/word/2010/wordprocessingInk" xmlns:wne="http://schemas.microsoft.com/office/word/2006/wordml" xmlns:wps="http://schemas.microsoft.com/office/word/2010/wordprocessingShape" mc:Ignorable="w14 w15 w16se w16cid w16 w16cex w16sdtdh w16sdtfl w16du wp14">
+<w:document xmlns:wpc="http://schemas.microsoft.com/office/word/2010/wordprocessingCanvas" xmlns:cx="http://schemas.microsoft.com/office/drawing/2014/chartex" xmlns:cx1="http://schemas.microsoft.com/office/drawing/2015/9/8/chartex" xmlns:cx2="http://schemas.microsoft.com/office/drawing/2015/10/21/chartex" xmlns:cx3="http://schemas.microsoft.com/office/drawing/2016/5/9/chartex" xmlns:cx4="http://schemas.microsoft.com/office/drawing/2016/5/10/chartex" xmlns:cx5="http://schemas.microsoft.com/office/drawing/2016/5/11/chartex" xmlns:cx6="http://schemas.microsoft.com/office/drawing/2016/5/12/chartex" xmlns:cx7="http://schemas.microsoft.com/office/drawing/2016/5/13/chartex" xmlns:cx8="http://schemas.microsoft.com/office/drawing/2016/5/14/chartex" xmlns:mc="http://schemas.openxmlformats.org/markup-compatibility/2006" xmlns:aink="http://schemas.microsoft.com/office/drawing/2016/ink" xmlns:am3d="http://schemas.microsoft.com/office/drawing/2017/model3d" xmlns:o="urn:schemas-microsoft-com:office:office" xmlns:oel="http://schemas.microsoft.com/office/2019/extlst" xmlns:r="http://schemas.openxmlformats.org/officeDocument/2006/relationships" xmlns:m="http://schemas.openxmlformats.org/officeDocument/2006/math" xmlns:v="urn:schemas-microsoft-com:vml" xmlns:wp14="http://schemas.microsoft.com/office/word/2010/wordprocessingDrawing" xmlns:wp="http://schemas.openxmlformats.org/drawingml/2006/wordprocessingDrawing" xmlns:w10="urn:schemas-microsoft-com:office:word" xmlns:w="http://schemas.openxmlformats.org/wordprocessingml/2006/main" xmlns:w14="http://schemas.microsoft.com/office/word/2010/wordml" xmlns:w15="http://schemas.microsoft.com/office/word/2012/wordml" xmlns:w16cei="http://schemas.microsoft.com/office/word/2026/wordml/cei" xmlns:w16cex="http://schemas.microsoft.com/office/word/2018/wordml/cex" xmlns:w16cid="http://schemas.microsoft.com/office/word/2016/wordml/cid" xmlns:w16="http://schemas.microsoft.com/office/word/2018/wordml" xmlns:w16du="http://schemas.microsoft.com/office/word/2023/wordml/word16du" xmlns:w16sdtdh="http://schemas.microsoft.com/office/word/2020/wordml/sdtdatahash" xmlns:w16sdtfl="http://schemas.microsoft.com/office/word/2024/wordml/sdtformatlock" xmlns:w16se="http://schemas.microsoft.com/office/word/2015/wordml/symex" xmlns:wpg="http://schemas.microsoft.com/office/word/2010/wordprocessingGroup" xmlns:wpi="http://schemas.microsoft.com/office/word/2010/wordprocessingInk" xmlns:wne="http://schemas.microsoft.com/office/word/2006/wordml" xmlns:wps="http://schemas.microsoft.com/office/word/2010/wordprocessingShape" mc:Ignorable="w14 w15 w16se w16cid w16 w16cex w16sdtdh w16sdtfl w16du wp14">
   <w:body>
     <w:p>
       <w:pPr>
@@ -74,6 +74,7 @@
                                 <w:szCs w:val="51"/>
                               </w:rPr>
                             </w:pPr>
+                            <w:proofErr w:type="spellStart"/>
                             <w:r>
                               <w:rPr>
                                 <w:b/>
@@ -81,7 +82,17 @@
                                 <w:sz w:val="51"/>
                                 <w:szCs w:val="51"/>
                               </w:rPr>
-                              <w:t xml:space="preserve">Creating </w:t>
+                              <w:t>Creating</w:t>
+                            </w:r>
+                            <w:proofErr w:type="spellEnd"/>
+                            <w:r>
+                              <w:rPr>
+                                <w:b/>
+                                <w:color w:val="FFFFFF" w:themeColor="background1"/>
+                                <w:sz w:val="51"/>
+                                <w:szCs w:val="51"/>
+                              </w:rPr>
+                              <w:t xml:space="preserve"> </w:t>
                             </w:r>
                           </w:p>
                           <w:p>
@@ -94,6 +105,7 @@
                                 <w:szCs w:val="51"/>
                               </w:rPr>
                             </w:pPr>
+                            <w:proofErr w:type="spellStart"/>
                             <w:r>
                               <w:rPr>
                                 <w:rFonts w:ascii="Lato Light" w:hAnsi="Lato Light"/>
@@ -104,6 +116,7 @@
                               </w:rPr>
                               <w:t>new</w:t>
                             </w:r>
+                            <w:proofErr w:type="spellEnd"/>
                             <w:r>
                               <w:rPr>
                                 <w:b/>
@@ -123,6 +136,7 @@
                                 <w:szCs w:val="51"/>
                               </w:rPr>
                             </w:pPr>
+                            <w:proofErr w:type="spellStart"/>
                             <w:r>
                               <w:rPr>
                                 <w:b/>
@@ -132,6 +146,7 @@
                               </w:rPr>
                               <w:t>spaces</w:t>
                             </w:r>
+                            <w:proofErr w:type="spellEnd"/>
                           </w:p>
                           <w:p>
                             <w:pPr>
@@ -689,6 +704,7 @@
                 <w:szCs w:val="24"/>
               </w:rPr>
             </w:pPr>
+            <w:proofErr w:type="spellStart"/>
             <w:r>
               <w:rPr>
                 <w:rFonts w:ascii="Lato" w:hAnsi="Lato"/>
@@ -698,7 +714,19 @@
                 <w:sz w:val="24"/>
                 <w:szCs w:val="24"/>
               </w:rPr>
-              <w:t>Facility:</w:t>
+              <w:t>Facility</w:t>
+            </w:r>
+            <w:proofErr w:type="spellEnd"/>
+            <w:r>
+              <w:rPr>
+                <w:rFonts w:ascii="Lato" w:hAnsi="Lato"/>
+                <w:b/>
+                <w:bCs/>
+                <w:color w:val="FFFFFF" w:themeColor="background1"/>
+                <w:sz w:val="24"/>
+                <w:szCs w:val="24"/>
+              </w:rPr>
+              <w:t>:</w:t>
             </w:r>
           </w:p>
         </w:tc>
@@ -826,8 +854,19 @@
                 <w:sz w:val="28"/>
                 <w:szCs w:val="28"/>
               </w:rPr>
-              <w:t>Project Quotation</w:t>
-            </w:r>
+              <w:t xml:space="preserve">Project </w:t>
+            </w:r>
+            <w:proofErr w:type="spellStart"/>
+            <w:r>
+              <w:rPr>
+                <w:b/>
+                <w:bCs/>
+                <w:sz w:val="28"/>
+                <w:szCs w:val="28"/>
+              </w:rPr>
+              <w:t>Quotation</w:t>
+            </w:r>
+            <w:proofErr w:type="spellEnd"/>
             <w:r>
               <w:rPr>
                 <w:b/>
@@ -880,6 +919,7 @@
                 <w:szCs w:val="24"/>
               </w:rPr>
             </w:pPr>
+            <w:proofErr w:type="spellStart"/>
             <w:r>
               <w:rPr>
                 <w:rFonts w:ascii="Lato" w:hAnsi="Lato"/>
@@ -888,7 +928,18 @@
                 <w:sz w:val="24"/>
                 <w:szCs w:val="24"/>
               </w:rPr>
-              <w:t>Wx:</w:t>
+              <w:t>Wx</w:t>
+            </w:r>
+            <w:proofErr w:type="spellEnd"/>
+            <w:r>
+              <w:rPr>
+                <w:rFonts w:ascii="Lato" w:hAnsi="Lato"/>
+                <w:b/>
+                <w:bCs/>
+                <w:sz w:val="24"/>
+                <w:szCs w:val="24"/>
+              </w:rPr>
+              <w:t>:</w:t>
             </w:r>
           </w:p>
         </w:tc>
@@ -1009,13 +1060,23 @@
                 <w:szCs w:val="20"/>
               </w:rPr>
             </w:pPr>
-            <w:r>
-              <w:rPr>
-                <w:rFonts w:ascii="Lato" w:hAnsi="Lato"/>
-                <w:sz w:val="20"/>
-                <w:szCs w:val="20"/>
-              </w:rPr>
-              <w:t xml:space="preserve">Dimensions: </w:t>
+            <w:proofErr w:type="spellStart"/>
+            <w:r>
+              <w:rPr>
+                <w:rFonts w:ascii="Lato" w:hAnsi="Lato"/>
+                <w:sz w:val="20"/>
+                <w:szCs w:val="20"/>
+              </w:rPr>
+              <w:t>Dimensions</w:t>
+            </w:r>
+            <w:proofErr w:type="spellEnd"/>
+            <w:r>
+              <w:rPr>
+                <w:rFonts w:ascii="Lato" w:hAnsi="Lato"/>
+                <w:sz w:val="20"/>
+                <w:szCs w:val="20"/>
+              </w:rPr>
+              <w:t xml:space="preserve">: </w:t>
             </w:r>
           </w:p>
           <w:p>
@@ -1171,7 +1232,25 @@
                 <w:sz w:val="20"/>
                 <w:szCs w:val="20"/>
               </w:rPr>
-              <w:t>Parking / Suspension type:</w:t>
+              <w:t xml:space="preserve">Parking / Suspension </w:t>
+            </w:r>
+            <w:proofErr w:type="spellStart"/>
+            <w:r>
+              <w:rPr>
+                <w:rFonts w:ascii="Lato" w:hAnsi="Lato"/>
+                <w:sz w:val="20"/>
+                <w:szCs w:val="20"/>
+              </w:rPr>
+              <w:t>type</w:t>
+            </w:r>
+            <w:proofErr w:type="spellEnd"/>
+            <w:r>
+              <w:rPr>
+                <w:rFonts w:ascii="Lato" w:hAnsi="Lato"/>
+                <w:sz w:val="20"/>
+                <w:szCs w:val="20"/>
+              </w:rPr>
+              <w:t>:</w:t>
             </w:r>
           </w:p>
         </w:tc>
@@ -1229,13 +1308,59 @@
                 <w:szCs w:val="20"/>
               </w:rPr>
             </w:pPr>
-            <w:r>
-              <w:rPr>
-                <w:rFonts w:ascii="Lato" w:hAnsi="Lato"/>
-                <w:sz w:val="20"/>
-                <w:szCs w:val="20"/>
-              </w:rPr>
-              <w:t>Sugested number of modules:</w:t>
+            <w:proofErr w:type="spellStart"/>
+            <w:r>
+              <w:rPr>
+                <w:rFonts w:ascii="Lato" w:hAnsi="Lato"/>
+                <w:sz w:val="20"/>
+                <w:szCs w:val="20"/>
+              </w:rPr>
+              <w:t>Sugested</w:t>
+            </w:r>
+            <w:proofErr w:type="spellEnd"/>
+            <w:r>
+              <w:rPr>
+                <w:rFonts w:ascii="Lato" w:hAnsi="Lato"/>
+                <w:sz w:val="20"/>
+                <w:szCs w:val="20"/>
+              </w:rPr>
+              <w:t xml:space="preserve"> </w:t>
+            </w:r>
+            <w:proofErr w:type="spellStart"/>
+            <w:r>
+              <w:rPr>
+                <w:rFonts w:ascii="Lato" w:hAnsi="Lato"/>
+                <w:sz w:val="20"/>
+                <w:szCs w:val="20"/>
+              </w:rPr>
+              <w:t>number</w:t>
+            </w:r>
+            <w:proofErr w:type="spellEnd"/>
+            <w:r>
+              <w:rPr>
+                <w:rFonts w:ascii="Lato" w:hAnsi="Lato"/>
+                <w:sz w:val="20"/>
+                <w:szCs w:val="20"/>
+              </w:rPr>
+              <w:t xml:space="preserve"> of </w:t>
+            </w:r>
+            <w:proofErr w:type="spellStart"/>
+            <w:r>
+              <w:rPr>
+                <w:rFonts w:ascii="Lato" w:hAnsi="Lato"/>
+                <w:sz w:val="20"/>
+                <w:szCs w:val="20"/>
+              </w:rPr>
+              <w:t>modules</w:t>
+            </w:r>
+            <w:proofErr w:type="spellEnd"/>
+            <w:r>
+              <w:rPr>
+                <w:rFonts w:ascii="Lato" w:hAnsi="Lato"/>
+                <w:sz w:val="20"/>
+                <w:szCs w:val="20"/>
+              </w:rPr>
+              <w:t>:</w:t>
             </w:r>
           </w:p>
         </w:tc>
@@ -1301,8 +1426,9 @@
                 <w:szCs w:val="20"/>
                 <w:lang w:val="en-GB"/>
               </w:rPr>
-              <w:t>Acoustic value</w:t>
-            </w:r>
+              <w:t xml:space="preserve">Acoustic </w:t>
+            </w:r>
+            <w:proofErr w:type="spellStart"/>
             <w:r>
               <w:rPr>
                 <w:rFonts w:ascii="Lato" w:hAnsi="Lato"/>
@@ -1310,8 +1436,18 @@
                 <w:szCs w:val="20"/>
                 <w:lang w:val="en-GB"/>
               </w:rPr>
+              <w:t>value</w:t>
+            </w:r>
+            <w:r>
+              <w:rPr>
+                <w:rFonts w:ascii="Lato" w:hAnsi="Lato"/>
+                <w:sz w:val="20"/>
+                <w:szCs w:val="20"/>
+                <w:lang w:val="en-GB"/>
+              </w:rPr>
               <w:t>certyfikacja</w:t>
             </w:r>
+            <w:proofErr w:type="spellEnd"/>
             <w:r>
               <w:rPr>
                 <w:rFonts w:ascii="Lato" w:hAnsi="Lato"/>
@@ -1337,6 +1473,7 @@
                 <w:lang w:val="en-US"/>
               </w:rPr>
             </w:pPr>
+            <w:proofErr w:type="spellStart"/>
             <w:r>
               <w:rPr>
                 <w:rFonts w:ascii="Lato" w:hAnsi="Lato"/>
@@ -1346,6 +1483,7 @@
               </w:rPr>
               <w:t>akustyka</w:t>
             </w:r>
+            <w:proofErr w:type="spellEnd"/>
           </w:p>
         </w:tc>
         <w:tc>
@@ -1381,13 +1519,23 @@
                 <w:lang w:val="en-US"/>
               </w:rPr>
             </w:pPr>
-            <w:r>
-              <w:rPr>
-                <w:rFonts w:ascii="Lato" w:hAnsi="Lato"/>
-                <w:sz w:val="20"/>
-                <w:szCs w:val="20"/>
-              </w:rPr>
-              <w:t xml:space="preserve">Covered with: </w:t>
+            <w:proofErr w:type="spellStart"/>
+            <w:r>
+              <w:rPr>
+                <w:rFonts w:ascii="Lato" w:hAnsi="Lato"/>
+                <w:sz w:val="20"/>
+                <w:szCs w:val="20"/>
+              </w:rPr>
+              <w:t>Covered</w:t>
+            </w:r>
+            <w:proofErr w:type="spellEnd"/>
+            <w:r>
+              <w:rPr>
+                <w:rFonts w:ascii="Lato" w:hAnsi="Lato"/>
+                <w:sz w:val="20"/>
+                <w:szCs w:val="20"/>
+              </w:rPr>
+              <w:t xml:space="preserve"> with: </w:t>
             </w:r>
           </w:p>
         </w:tc>
@@ -1405,6 +1553,7 @@
                 <w:lang w:val="en-US"/>
               </w:rPr>
             </w:pPr>
+            <w:proofErr w:type="spellStart"/>
             <w:r>
               <w:rPr>
                 <w:rFonts w:ascii="Lato" w:hAnsi="Lato"/>
@@ -1414,6 +1563,7 @@
               </w:rPr>
               <w:t>pyta</w:t>
             </w:r>
+            <w:proofErr w:type="spellEnd"/>
           </w:p>
         </w:tc>
         <w:tc>
@@ -1448,13 +1598,23 @@
                 <w:szCs w:val="20"/>
               </w:rPr>
             </w:pPr>
-            <w:r>
-              <w:rPr>
-                <w:rFonts w:ascii="Lato" w:hAnsi="Lato"/>
-                <w:sz w:val="20"/>
-                <w:szCs w:val="20"/>
-              </w:rPr>
-              <w:t>Operation:</w:t>
+            <w:proofErr w:type="spellStart"/>
+            <w:r>
+              <w:rPr>
+                <w:rFonts w:ascii="Lato" w:hAnsi="Lato"/>
+                <w:sz w:val="20"/>
+                <w:szCs w:val="20"/>
+              </w:rPr>
+              <w:t>Operation</w:t>
+            </w:r>
+            <w:proofErr w:type="spellEnd"/>
+            <w:r>
+              <w:rPr>
+                <w:rFonts w:ascii="Lato" w:hAnsi="Lato"/>
+                <w:sz w:val="20"/>
+                <w:szCs w:val="20"/>
+              </w:rPr>
+              <w:t>:</w:t>
             </w:r>
           </w:p>
         </w:tc>
@@ -1512,13 +1672,23 @@
                 <w:szCs w:val="20"/>
               </w:rPr>
             </w:pPr>
-            <w:r>
-              <w:rPr>
-                <w:rFonts w:ascii="Lato" w:hAnsi="Lato"/>
-                <w:sz w:val="20"/>
-                <w:szCs w:val="20"/>
-              </w:rPr>
-              <w:t xml:space="preserve">Rail: </w:t>
+            <w:proofErr w:type="spellStart"/>
+            <w:r>
+              <w:rPr>
+                <w:rFonts w:ascii="Lato" w:hAnsi="Lato"/>
+                <w:sz w:val="20"/>
+                <w:szCs w:val="20"/>
+              </w:rPr>
+              <w:t>Rail</w:t>
+            </w:r>
+            <w:proofErr w:type="spellEnd"/>
+            <w:r>
+              <w:rPr>
+                <w:rFonts w:ascii="Lato" w:hAnsi="Lato"/>
+                <w:sz w:val="20"/>
+                <w:szCs w:val="20"/>
+              </w:rPr>
+              <w:t xml:space="preserve">: </w:t>
             </w:r>
           </w:p>
         </w:tc>
@@ -1576,13 +1746,23 @@
                 <w:szCs w:val="20"/>
               </w:rPr>
             </w:pPr>
-            <w:r>
-              <w:rPr>
-                <w:rFonts w:ascii="Lato" w:hAnsi="Lato"/>
-                <w:sz w:val="20"/>
-                <w:szCs w:val="20"/>
-              </w:rPr>
-              <w:t xml:space="preserve">Doors: </w:t>
+            <w:proofErr w:type="spellStart"/>
+            <w:r>
+              <w:rPr>
+                <w:rFonts w:ascii="Lato" w:hAnsi="Lato"/>
+                <w:sz w:val="20"/>
+                <w:szCs w:val="20"/>
+              </w:rPr>
+              <w:t>Doors</w:t>
+            </w:r>
+            <w:proofErr w:type="spellEnd"/>
+            <w:r>
+              <w:rPr>
+                <w:rFonts w:ascii="Lato" w:hAnsi="Lato"/>
+                <w:sz w:val="20"/>
+                <w:szCs w:val="20"/>
+              </w:rPr>
+              <w:t xml:space="preserve">: </w:t>
             </w:r>
           </w:p>
         </w:tc>
@@ -1646,7 +1826,25 @@
                 <w:sz w:val="20"/>
                 <w:szCs w:val="20"/>
               </w:rPr>
-              <w:t xml:space="preserve">Glass Modules: </w:t>
+              <w:t xml:space="preserve">Glass </w:t>
+            </w:r>
+            <w:proofErr w:type="spellStart"/>
+            <w:r>
+              <w:rPr>
+                <w:rFonts w:ascii="Lato" w:hAnsi="Lato"/>
+                <w:sz w:val="20"/>
+                <w:szCs w:val="20"/>
+              </w:rPr>
+              <w:t>Modules</w:t>
+            </w:r>
+            <w:proofErr w:type="spellEnd"/>
+            <w:r>
+              <w:rPr>
+                <w:rFonts w:ascii="Lato" w:hAnsi="Lato"/>
+                <w:sz w:val="20"/>
+                <w:szCs w:val="20"/>
+              </w:rPr>
+              <w:t xml:space="preserve">: </w:t>
             </w:r>
           </w:p>
         </w:tc>
@@ -1705,13 +1903,23 @@
                 <w:szCs w:val="20"/>
               </w:rPr>
             </w:pPr>
-            <w:r>
-              <w:rPr>
-                <w:rFonts w:ascii="Lato" w:hAnsi="Lato"/>
-                <w:sz w:val="20"/>
-                <w:szCs w:val="20"/>
-              </w:rPr>
-              <w:t xml:space="preserve">Profiles: </w:t>
+            <w:proofErr w:type="spellStart"/>
+            <w:r>
+              <w:rPr>
+                <w:rFonts w:ascii="Lato" w:hAnsi="Lato"/>
+                <w:sz w:val="20"/>
+                <w:szCs w:val="20"/>
+              </w:rPr>
+              <w:t>Profiles</w:t>
+            </w:r>
+            <w:proofErr w:type="spellEnd"/>
+            <w:r>
+              <w:rPr>
+                <w:rFonts w:ascii="Lato" w:hAnsi="Lato"/>
+                <w:sz w:val="20"/>
+                <w:szCs w:val="20"/>
+              </w:rPr>
+              <w:t xml:space="preserve">: </w:t>
             </w:r>
           </w:p>
         </w:tc>
@@ -1770,13 +1978,41 @@
                 <w:szCs w:val="20"/>
               </w:rPr>
             </w:pPr>
-            <w:r>
-              <w:rPr>
-                <w:rFonts w:ascii="Lato" w:hAnsi="Lato"/>
-                <w:sz w:val="20"/>
-                <w:szCs w:val="20"/>
-              </w:rPr>
-              <w:t>Additional Equipment:</w:t>
+            <w:proofErr w:type="spellStart"/>
+            <w:r>
+              <w:rPr>
+                <w:rFonts w:ascii="Lato" w:hAnsi="Lato"/>
+                <w:sz w:val="20"/>
+                <w:szCs w:val="20"/>
+              </w:rPr>
+              <w:t>Additional</w:t>
+            </w:r>
+            <w:proofErr w:type="spellEnd"/>
+            <w:r>
+              <w:rPr>
+                <w:rFonts w:ascii="Lato" w:hAnsi="Lato"/>
+                <w:sz w:val="20"/>
+                <w:szCs w:val="20"/>
+              </w:rPr>
+              <w:t xml:space="preserve"> </w:t>
+            </w:r>
+            <w:proofErr w:type="spellStart"/>
+            <w:r>
+              <w:rPr>
+                <w:rFonts w:ascii="Lato" w:hAnsi="Lato"/>
+                <w:sz w:val="20"/>
+                <w:szCs w:val="20"/>
+              </w:rPr>
+              <w:t>Equipment</w:t>
+            </w:r>
+            <w:proofErr w:type="spellEnd"/>
+            <w:r>
+              <w:rPr>
+                <w:rFonts w:ascii="Lato" w:hAnsi="Lato"/>
+                <w:sz w:val="20"/>
+                <w:szCs w:val="20"/>
+              </w:rPr>
+              <w:t>:</w:t>
             </w:r>
           </w:p>
         </w:tc>
@@ -1793,6 +2029,7 @@
                 <w:szCs w:val="20"/>
               </w:rPr>
             </w:pPr>
+            <w:proofErr w:type="spellStart"/>
             <w:r>
               <w:rPr>
                 <w:rFonts w:ascii="Lato" w:hAnsi="Lato"/>
@@ -1801,6 +2038,7 @@
               </w:rPr>
               <w:t>adyszynal</w:t>
             </w:r>
+            <w:proofErr w:type="spellEnd"/>
           </w:p>
         </w:tc>
         <w:tc>
@@ -1837,9 +2075,9 @@
         <w:tblLook w:val="04A0" w:firstRow="1" w:lastRow="0" w:firstColumn="1" w:lastColumn="0" w:noHBand="0" w:noVBand="1"/>
       </w:tblPr>
       <w:tblGrid>
-        <w:gridCol w:w="8198"/>
-        <w:gridCol w:w="24"/>
-        <w:gridCol w:w="2410"/>
+        <w:gridCol w:w="8080"/>
+        <w:gridCol w:w="118"/>
+        <w:gridCol w:w="2434"/>
       </w:tblGrid>
       <w:tr>
         <w:trPr>
@@ -1848,6 +2086,7 @@
         <w:tc>
           <w:tcPr>
             <w:tcW w:w="8198" w:type="dxa"/>
+            <w:gridSpan w:val="2"/>
             <w:tcBorders>
               <w:top w:val="nil"/>
               <w:left w:val="nil"/>
@@ -1869,6 +2108,7 @@
                 <w:szCs w:val="20"/>
               </w:rPr>
             </w:pPr>
+            <w:proofErr w:type="spellStart"/>
             <w:r>
               <w:rPr>
                 <w:b/>
@@ -1876,14 +2116,23 @@
                 <w:color w:val="FFFFFF" w:themeColor="background1"/>
                 <w:szCs w:val="20"/>
               </w:rPr>
-              <w:t>Additional notes:</w:t>
+              <w:t>Additional</w:t>
+            </w:r>
+            <w:proofErr w:type="spellEnd"/>
+            <w:r>
+              <w:rPr>
+                <w:b/>
+                <w:bCs/>
+                <w:color w:val="FFFFFF" w:themeColor="background1"/>
+                <w:szCs w:val="20"/>
+              </w:rPr>
+              <w:t xml:space="preserve"> notes:</w:t>
             </w:r>
           </w:p>
         </w:tc>
         <w:tc>
           <w:tcPr>
             <w:tcW w:w="2434" w:type="dxa"/>
-            <w:gridSpan w:val="2"/>
             <w:tcBorders>
               <w:top w:val="nil"/>
               <w:left w:val="nil"/>
@@ -1913,7 +2162,36 @@
         </w:trPr>
         <w:tc>
           <w:tcPr>
-            <w:tcW w:w="8222" w:type="dxa"/>
+            <w:tcW w:w="8080" w:type="dxa"/>
+            <w:tcBorders>
+              <w:top w:val="single" w:sz="4" w:space="0" w:color="auto"/>
+              <w:left w:val="single" w:sz="4" w:space="0" w:color="auto"/>
+              <w:bottom w:val="single" w:sz="4" w:space="0" w:color="auto"/>
+              <w:right w:val="single" w:sz="4" w:space="0" w:color="auto"/>
+            </w:tcBorders>
+            <w:vAlign w:val="center"/>
+          </w:tcPr>
+          <w:p>
+            <w:pPr>
+              <w:rPr>
+                <w:rFonts w:ascii="Lato" w:hAnsi="Lato"/>
+                <w:sz w:val="20"/>
+                <w:szCs w:val="20"/>
+              </w:rPr>
+            </w:pPr>
+            <w:r>
+              <w:rPr>
+                <w:rFonts w:ascii="Lato" w:hAnsi="Lato"/>
+                <w:sz w:val="20"/>
+                <w:szCs w:val="20"/>
+              </w:rPr>
+              <w:t>Cena wszystkich:</w:t>
+            </w:r>
+          </w:p>
+        </w:tc>
+        <w:tc>
+          <w:tcPr>
+            <w:tcW w:w="2552" w:type="dxa"/>
             <w:gridSpan w:val="2"/>
             <w:tcBorders>
               <w:top w:val="single" w:sz="4" w:space="0" w:color="auto"/>
@@ -1925,35 +2203,6 @@
           </w:tcPr>
           <w:p>
             <w:pPr>
-              <w:rPr>
-                <w:rFonts w:ascii="Lato" w:hAnsi="Lato"/>
-                <w:sz w:val="20"/>
-                <w:szCs w:val="20"/>
-              </w:rPr>
-            </w:pPr>
-            <w:r>
-              <w:rPr>
-                <w:rFonts w:ascii="Lato" w:hAnsi="Lato"/>
-                <w:sz w:val="20"/>
-                <w:szCs w:val="20"/>
-              </w:rPr>
-              <w:t>Cena wszystkich:</w:t>
-            </w:r>
-          </w:p>
-        </w:tc>
-        <w:tc>
-          <w:tcPr>
-            <w:tcW w:w="2410" w:type="dxa"/>
-            <w:tcBorders>
-              <w:top w:val="single" w:sz="4" w:space="0" w:color="auto"/>
-              <w:left w:val="single" w:sz="4" w:space="0" w:color="auto"/>
-              <w:bottom w:val="single" w:sz="4" w:space="0" w:color="auto"/>
-              <w:right w:val="single" w:sz="4" w:space="0" w:color="auto"/>
-            </w:tcBorders>
-            <w:vAlign w:val="center"/>
-          </w:tcPr>
-          <w:p>
-            <w:pPr>
               <w:jc w:val="center"/>
               <w:rPr>
                 <w:rFonts w:ascii="Lato" w:hAnsi="Lato"/>
@@ -1963,6 +2212,7 @@
                 <w:szCs w:val="20"/>
               </w:rPr>
             </w:pPr>
+            <w:proofErr w:type="spellStart"/>
             <w:r>
               <w:rPr>
                 <w:rFonts w:ascii="Lato" w:hAnsi="Lato"/>
@@ -1973,6 +2223,7 @@
               </w:rPr>
               <w:t>ewro</w:t>
             </w:r>
+            <w:proofErr w:type="spellEnd"/>
             <w:r>
               <w:rPr>
                 <w:rFonts w:ascii="Lato" w:hAnsi="Lato"/>
@@ -2043,7 +2294,27 @@
                 <w:color w:val="FFFFFF" w:themeColor="background1"/>
                 <w:szCs w:val="20"/>
               </w:rPr>
-              <w:t>Transport rates:</w:t>
+              <w:t xml:space="preserve">Transport </w:t>
+            </w:r>
+            <w:proofErr w:type="spellStart"/>
+            <w:r>
+              <w:rPr>
+                <w:b/>
+                <w:bCs/>
+                <w:color w:val="FFFFFF" w:themeColor="background1"/>
+                <w:szCs w:val="20"/>
+              </w:rPr>
+              <w:t>rates</w:t>
+            </w:r>
+            <w:proofErr w:type="spellEnd"/>
+            <w:r>
+              <w:rPr>
+                <w:b/>
+                <w:bCs/>
+                <w:color w:val="FFFFFF" w:themeColor="background1"/>
+                <w:szCs w:val="20"/>
+              </w:rPr>
+              <w:t>:</w:t>
             </w:r>
           </w:p>
         </w:tc>
@@ -2103,7 +2374,31 @@
                 <w:szCs w:val="20"/>
                 <w:lang w:val="en-GB"/>
               </w:rPr>
-              <w:t>Transport cost (miejscowość)</w:t>
+              <w:t>Transport cost (</w:t>
+            </w:r>
+            <w:proofErr w:type="spellStart"/>
+            <w:r>
+              <w:rPr>
+                <w:rFonts w:ascii="Lato" w:hAnsi="Lato"/>
+                <w:b/>
+                <w:bCs/>
+                <w:sz w:val="20"/>
+                <w:szCs w:val="20"/>
+                <w:lang w:val="en-GB"/>
+              </w:rPr>
+              <w:t>miejscowość</w:t>
+            </w:r>
+            <w:proofErr w:type="spellEnd"/>
+            <w:r>
+              <w:rPr>
+                <w:rFonts w:ascii="Lato" w:hAnsi="Lato"/>
+                <w:b/>
+                <w:bCs/>
+                <w:sz w:val="20"/>
+                <w:szCs w:val="20"/>
+                <w:lang w:val="en-GB"/>
+              </w:rPr>
+              <w:t>)</w:t>
             </w:r>
             <w:r>
               <w:rPr>
@@ -2325,8 +2620,18 @@
                 <w:bCs/>
                 <w:sz w:val="24"/>
               </w:rPr>
-              <w:t>Grand total</w:t>
-            </w:r>
+              <w:t xml:space="preserve">Grand </w:t>
+            </w:r>
+            <w:proofErr w:type="spellStart"/>
+            <w:r>
+              <w:rPr>
+                <w:b/>
+                <w:bCs/>
+                <w:sz w:val="24"/>
+              </w:rPr>
+              <w:t>total</w:t>
+            </w:r>
+            <w:proofErr w:type="spellEnd"/>
             <w:r>
               <w:rPr>
                 <w:b/>
@@ -2604,7 +2909,25 @@
           <w:sz w:val="20"/>
           <w:szCs w:val="20"/>
         </w:rPr>
-        <w:t xml:space="preserve">Technical advice </w:t>
+        <w:t xml:space="preserve">Technical </w:t>
+      </w:r>
+      <w:proofErr w:type="spellStart"/>
+      <w:r>
+        <w:rPr>
+          <w:rFonts w:ascii="Lato" w:hAnsi="Lato"/>
+          <w:sz w:val="20"/>
+          <w:szCs w:val="20"/>
+        </w:rPr>
+        <w:t>advice</w:t>
+      </w:r>
+      <w:proofErr w:type="spellEnd"/>
+      <w:r>
+        <w:rPr>
+          <w:rFonts w:ascii="Lato" w:hAnsi="Lato"/>
+          <w:sz w:val="20"/>
+          <w:szCs w:val="20"/>
+        </w:rPr>
+        <w:t xml:space="preserve"> </w:t>
       </w:r>
     </w:p>
     <w:p>
@@ -2628,7 +2951,25 @@
           <w:szCs w:val="20"/>
         </w:rPr>
         <w:lastRenderedPageBreak/>
-        <w:t>Mobile wall design.</w:t>
+        <w:t xml:space="preserve">Mobile </w:t>
+      </w:r>
+      <w:proofErr w:type="spellStart"/>
+      <w:r>
+        <w:rPr>
+          <w:rFonts w:ascii="Lato" w:hAnsi="Lato"/>
+          <w:sz w:val="20"/>
+          <w:szCs w:val="20"/>
+        </w:rPr>
+        <w:t>wall</w:t>
+      </w:r>
+      <w:proofErr w:type="spellEnd"/>
+      <w:r>
+        <w:rPr>
+          <w:rFonts w:ascii="Lato" w:hAnsi="Lato"/>
+          <w:sz w:val="20"/>
+          <w:szCs w:val="20"/>
+        </w:rPr>
+        <w:t xml:space="preserve"> design.</w:t>
       </w:r>
     </w:p>
     <w:p>
@@ -2881,7 +3222,47 @@
           <w:szCs w:val="20"/>
           <w:lang w:val="en-GB"/>
         </w:rPr>
-        <w:t>Availability of the full range of melamine manufacturers: Egger, SwissKrono, Finsa, Kronospan</w:t>
+        <w:t xml:space="preserve">Availability of the full range of melamine manufacturers: Egger, </w:t>
+      </w:r>
+      <w:proofErr w:type="spellStart"/>
+      <w:r>
+        <w:rPr>
+          <w:rFonts w:ascii="Lato" w:hAnsi="Lato"/>
+          <w:sz w:val="20"/>
+          <w:szCs w:val="20"/>
+          <w:lang w:val="en-GB"/>
+        </w:rPr>
+        <w:t>SwissKrono</w:t>
+      </w:r>
+      <w:proofErr w:type="spellEnd"/>
+      <w:r>
+        <w:rPr>
+          <w:rFonts w:ascii="Lato" w:hAnsi="Lato"/>
+          <w:sz w:val="20"/>
+          <w:szCs w:val="20"/>
+          <w:lang w:val="en-GB"/>
+        </w:rPr>
+        <w:t xml:space="preserve">, </w:t>
+      </w:r>
+      <w:proofErr w:type="spellStart"/>
+      <w:r>
+        <w:rPr>
+          <w:rFonts w:ascii="Lato" w:hAnsi="Lato"/>
+          <w:sz w:val="20"/>
+          <w:szCs w:val="20"/>
+          <w:lang w:val="en-GB"/>
+        </w:rPr>
+        <w:t>Finsa</w:t>
+      </w:r>
+      <w:proofErr w:type="spellEnd"/>
+      <w:r>
+        <w:rPr>
+          <w:rFonts w:ascii="Lato" w:hAnsi="Lato"/>
+          <w:sz w:val="20"/>
+          <w:szCs w:val="20"/>
+          <w:lang w:val="en-GB"/>
+        </w:rPr>
+        <w:t>, Kronospan</w:t>
       </w:r>
     </w:p>
     <w:p>
@@ -2982,7 +3363,63 @@
           <w:lang w:val="en-GB" w:eastAsia="pl-PL"/>
           <w14:ligatures w14:val="none"/>
         </w:rPr>
-        <w:t xml:space="preserve">This offer is intended only for the person or entity to whom it is addressed and contains content covered by trade secrets and trade secrets within the meaning of the Act on Combating Unfair Competition, as well as other content of a confidential nature. The Offerer does not agree to the dissemination of its content, but the terms and conditions of the offer are not publicly available, because the Offerer has taken steps to prevent the public from making the prices and other commercial terms and conditions available to the public. </w:t>
+        <w:t xml:space="preserve">This offer is intended only for the person or entity to whom it is addressed and contains content covered by trade secrets and trade secrets within the meaning of the Act on Combating Unfair Competition, as well as other content of a confidential nature. The </w:t>
+      </w:r>
+      <w:proofErr w:type="spellStart"/>
+      <w:r>
+        <w:rPr>
+          <w:rFonts w:ascii="Lato" w:eastAsia="Times New Roman" w:hAnsi="Lato" w:cs="Times New Roman"/>
+          <w:i/>
+          <w:iCs/>
+          <w:kern w:val="0"/>
+          <w:sz w:val="20"/>
+          <w:szCs w:val="20"/>
+          <w:lang w:val="en-GB" w:eastAsia="pl-PL"/>
+          <w14:ligatures w14:val="none"/>
+        </w:rPr>
+        <w:t>Offerer</w:t>
+      </w:r>
+      <w:proofErr w:type="spellEnd"/>
+      <w:r>
+        <w:rPr>
+          <w:rFonts w:ascii="Lato" w:eastAsia="Times New Roman" w:hAnsi="Lato" w:cs="Times New Roman"/>
+          <w:i/>
+          <w:iCs/>
+          <w:kern w:val="0"/>
+          <w:sz w:val="20"/>
+          <w:szCs w:val="20"/>
+          <w:lang w:val="en-GB" w:eastAsia="pl-PL"/>
+          <w14:ligatures w14:val="none"/>
+        </w:rPr>
+        <w:t xml:space="preserve"> does not agree to the dissemination of its content, but the terms and conditions of the offer are not publicly available, because the </w:t>
+      </w:r>
+      <w:proofErr w:type="spellStart"/>
+      <w:r>
+        <w:rPr>
+          <w:rFonts w:ascii="Lato" w:eastAsia="Times New Roman" w:hAnsi="Lato" w:cs="Times New Roman"/>
+          <w:i/>
+          <w:iCs/>
+          <w:kern w:val="0"/>
+          <w:sz w:val="20"/>
+          <w:szCs w:val="20"/>
+          <w:lang w:val="en-GB" w:eastAsia="pl-PL"/>
+          <w14:ligatures w14:val="none"/>
+        </w:rPr>
+        <w:t>Offerer</w:t>
+      </w:r>
+      <w:proofErr w:type="spellEnd"/>
+      <w:r>
+        <w:rPr>
+          <w:rFonts w:ascii="Lato" w:eastAsia="Times New Roman" w:hAnsi="Lato" w:cs="Times New Roman"/>
+          <w:i/>
+          <w:iCs/>
+          <w:kern w:val="0"/>
+          <w:sz w:val="20"/>
+          <w:szCs w:val="20"/>
+          <w:lang w:val="en-GB" w:eastAsia="pl-PL"/>
+          <w14:ligatures w14:val="none"/>
+        </w:rPr>
+        <w:t xml:space="preserve"> has taken steps to prevent the public from making the prices and other commercial terms and conditions available to the public. </w:t>
       </w:r>
     </w:p>
     <w:p>
@@ -3154,7 +3591,7 @@
 </file>
 
 <file path=word/endnotes.xml><?xml version="1.0" encoding="utf-8"?>
-<w:endnotes xmlns:wpc="http://schemas.microsoft.com/office/word/2010/wordprocessingCanvas" xmlns:cx="http://schemas.microsoft.com/office/drawing/2014/chartex" xmlns:cx1="http://schemas.microsoft.com/office/drawing/2015/9/8/chartex" xmlns:cx2="http://schemas.microsoft.com/office/drawing/2015/10/21/chartex" xmlns:cx3="http://schemas.microsoft.com/office/drawing/2016/5/9/chartex" xmlns:cx4="http://schemas.microsoft.com/office/drawing/2016/5/10/chartex" xmlns:cx5="http://schemas.microsoft.com/office/drawing/2016/5/11/chartex" xmlns:cx6="http://schemas.microsoft.com/office/drawing/2016/5/12/chartex" xmlns:cx7="http://schemas.microsoft.com/office/drawing/2016/5/13/chartex" xmlns:cx8="http://schemas.microsoft.com/office/drawing/2016/5/14/chartex" xmlns:mc="http://schemas.openxmlformats.org/markup-compatibility/2006" xmlns:aink="http://schemas.microsoft.com/office/drawing/2016/ink" xmlns:am3d="http://schemas.microsoft.com/office/drawing/2017/model3d" xmlns:o="urn:schemas-microsoft-com:office:office" xmlns:oel="http://schemas.microsoft.com/office/2019/extlst" xmlns:r="http://schemas.openxmlformats.org/officeDocument/2006/relationships" xmlns:m="http://schemas.openxmlformats.org/officeDocument/2006/math" xmlns:v="urn:schemas-microsoft-com:vml" xmlns:wp14="http://schemas.microsoft.com/office/word/2010/wordprocessingDrawing" xmlns:wp="http://schemas.openxmlformats.org/drawingml/2006/wordprocessingDrawing" xmlns:w10="urn:schemas-microsoft-com:office:word" xmlns:w="http://schemas.openxmlformats.org/wordprocessingml/2006/main" xmlns:w14="http://schemas.microsoft.com/office/word/2010/wordml" xmlns:w15="http://schemas.microsoft.com/office/word/2012/wordml" xmlns:w16cex="http://schemas.microsoft.com/office/word/2018/wordml/cex" xmlns:w16cid="http://schemas.microsoft.com/office/word/2016/wordml/cid" xmlns:w16="http://schemas.microsoft.com/office/word/2018/wordml" xmlns:w16du="http://schemas.microsoft.com/office/word/2023/wordml/word16du" xmlns:w16sdtdh="http://schemas.microsoft.com/office/word/2020/wordml/sdtdatahash" xmlns:w16sdtfl="http://schemas.microsoft.com/office/word/2024/wordml/sdtformatlock" xmlns:w16se="http://schemas.microsoft.com/office/word/2015/wordml/symex" xmlns:wpg="http://schemas.microsoft.com/office/word/2010/wordprocessingGroup" xmlns:wpi="http://schemas.microsoft.com/office/word/2010/wordprocessingInk" xmlns:wne="http://schemas.microsoft.com/office/word/2006/wordml" xmlns:wps="http://schemas.microsoft.com/office/word/2010/wordprocessingShape" mc:Ignorable="w14 w15 w16se w16cid w16 w16cex w16sdtdh w16sdtfl w16du wp14">
+<w:endnotes xmlns:wpc="http://schemas.microsoft.com/office/word/2010/wordprocessingCanvas" xmlns:cx="http://schemas.microsoft.com/office/drawing/2014/chartex" xmlns:cx1="http://schemas.microsoft.com/office/drawing/2015/9/8/chartex" xmlns:cx2="http://schemas.microsoft.com/office/drawing/2015/10/21/chartex" xmlns:cx3="http://schemas.microsoft.com/office/drawing/2016/5/9/chartex" xmlns:cx4="http://schemas.microsoft.com/office/drawing/2016/5/10/chartex" xmlns:cx5="http://schemas.microsoft.com/office/drawing/2016/5/11/chartex" xmlns:cx6="http://schemas.microsoft.com/office/drawing/2016/5/12/chartex" xmlns:cx7="http://schemas.microsoft.com/office/drawing/2016/5/13/chartex" xmlns:cx8="http://schemas.microsoft.com/office/drawing/2016/5/14/chartex" xmlns:mc="http://schemas.openxmlformats.org/markup-compatibility/2006" xmlns:aink="http://schemas.microsoft.com/office/drawing/2016/ink" xmlns:am3d="http://schemas.microsoft.com/office/drawing/2017/model3d" xmlns:o="urn:schemas-microsoft-com:office:office" xmlns:oel="http://schemas.microsoft.com/office/2019/extlst" xmlns:r="http://schemas.openxmlformats.org/officeDocument/2006/relationships" xmlns:m="http://schemas.openxmlformats.org/officeDocument/2006/math" xmlns:v="urn:schemas-microsoft-com:vml" xmlns:wp14="http://schemas.microsoft.com/office/word/2010/wordprocessingDrawing" xmlns:wp="http://schemas.openxmlformats.org/drawingml/2006/wordprocessingDrawing" xmlns:w10="urn:schemas-microsoft-com:office:word" xmlns:w="http://schemas.openxmlformats.org/wordprocessingml/2006/main" xmlns:w14="http://schemas.microsoft.com/office/word/2010/wordml" xmlns:w15="http://schemas.microsoft.com/office/word/2012/wordml" xmlns:w16cei="http://schemas.microsoft.com/office/word/2026/wordml/cei" xmlns:w16cex="http://schemas.microsoft.com/office/word/2018/wordml/cex" xmlns:w16cid="http://schemas.microsoft.com/office/word/2016/wordml/cid" xmlns:w16="http://schemas.microsoft.com/office/word/2018/wordml" xmlns:w16du="http://schemas.microsoft.com/office/word/2023/wordml/word16du" xmlns:w16sdtdh="http://schemas.microsoft.com/office/word/2020/wordml/sdtdatahash" xmlns:w16sdtfl="http://schemas.microsoft.com/office/word/2024/wordml/sdtformatlock" xmlns:w16se="http://schemas.microsoft.com/office/word/2015/wordml/symex" xmlns:wpg="http://schemas.microsoft.com/office/word/2010/wordprocessingGroup" xmlns:wpi="http://schemas.microsoft.com/office/word/2010/wordprocessingInk" xmlns:wne="http://schemas.microsoft.com/office/word/2006/wordml" xmlns:wps="http://schemas.microsoft.com/office/word/2010/wordprocessingShape" mc:Ignorable="w14 w15 w16se w16cid w16 w16cex w16sdtdh w16sdtfl w16du wp14">
   <w:endnote w:type="separator" w:id="-1">
     <w:p>
       <w:pPr>
@@ -3179,7 +3616,7 @@
 </file>
 
 <file path=word/footer1.xml><?xml version="1.0" encoding="utf-8"?>
-<w:ftr xmlns:wpc="http://schemas.microsoft.com/office/word/2010/wordprocessingCanvas" xmlns:cx="http://schemas.microsoft.com/office/drawing/2014/chartex" xmlns:cx1="http://schemas.microsoft.com/office/drawing/2015/9/8/chartex" xmlns:cx2="http://schemas.microsoft.com/office/drawing/2015/10/21/chartex" xmlns:cx3="http://schemas.microsoft.com/office/drawing/2016/5/9/chartex" xmlns:cx4="http://schemas.microsoft.com/office/drawing/2016/5/10/chartex" xmlns:cx5="http://schemas.microsoft.com/office/drawing/2016/5/11/chartex" xmlns:cx6="http://schemas.microsoft.com/office/drawing/2016/5/12/chartex" xmlns:cx7="http://schemas.microsoft.com/office/drawing/2016/5/13/chartex" xmlns:cx8="http://schemas.microsoft.com/office/drawing/2016/5/14/chartex" xmlns:mc="http://schemas.openxmlformats.org/markup-compatibility/2006" xmlns:aink="http://schemas.microsoft.com/office/drawing/2016/ink" xmlns:am3d="http://schemas.microsoft.com/office/drawing/2017/model3d" xmlns:o="urn:schemas-microsoft-com:office:office" xmlns:oel="http://schemas.microsoft.com/office/2019/extlst" xmlns:r="http://schemas.openxmlformats.org/officeDocument/2006/relationships" xmlns:m="http://schemas.openxmlformats.org/officeDocument/2006/math" xmlns:v="urn:schemas-microsoft-com:vml" xmlns:wp14="http://schemas.microsoft.com/office/word/2010/wordprocessingDrawing" xmlns:wp="http://schemas.openxmlformats.org/drawingml/2006/wordprocessingDrawing" xmlns:w10="urn:schemas-microsoft-com:office:word" xmlns:w="http://schemas.openxmlformats.org/wordprocessingml/2006/main" xmlns:w14="http://schemas.microsoft.com/office/word/2010/wordml" xmlns:w15="http://schemas.microsoft.com/office/word/2012/wordml" xmlns:w16cex="http://schemas.microsoft.com/office/word/2018/wordml/cex" xmlns:w16cid="http://schemas.microsoft.com/office/word/2016/wordml/cid" xmlns:w16="http://schemas.microsoft.com/office/word/2018/wordml" xmlns:w16du="http://schemas.microsoft.com/office/word/2023/wordml/word16du" xmlns:w16sdtdh="http://schemas.microsoft.com/office/word/2020/wordml/sdtdatahash" xmlns:w16sdtfl="http://schemas.microsoft.com/office/word/2024/wordml/sdtformatlock" xmlns:w16se="http://schemas.microsoft.com/office/word/2015/wordml/symex" xmlns:wpg="http://schemas.microsoft.com/office/word/2010/wordprocessingGroup" xmlns:wpi="http://schemas.microsoft.com/office/word/2010/wordprocessingInk" xmlns:wne="http://schemas.microsoft.com/office/word/2006/wordml" xmlns:wps="http://schemas.microsoft.com/office/word/2010/wordprocessingShape" mc:Ignorable="w14 w15 w16se w16cid w16 w16cex w16sdtdh w16sdtfl w16du wp14">
+<w:ftr xmlns:wpc="http://schemas.microsoft.com/office/word/2010/wordprocessingCanvas" xmlns:cx="http://schemas.microsoft.com/office/drawing/2014/chartex" xmlns:cx1="http://schemas.microsoft.com/office/drawing/2015/9/8/chartex" xmlns:cx2="http://schemas.microsoft.com/office/drawing/2015/10/21/chartex" xmlns:cx3="http://schemas.microsoft.com/office/drawing/2016/5/9/chartex" xmlns:cx4="http://schemas.microsoft.com/office/drawing/2016/5/10/chartex" xmlns:cx5="http://schemas.microsoft.com/office/drawing/2016/5/11/chartex" xmlns:cx6="http://schemas.microsoft.com/office/drawing/2016/5/12/chartex" xmlns:cx7="http://schemas.microsoft.com/office/drawing/2016/5/13/chartex" xmlns:cx8="http://schemas.microsoft.com/office/drawing/2016/5/14/chartex" xmlns:mc="http://schemas.openxmlformats.org/markup-compatibility/2006" xmlns:aink="http://schemas.microsoft.com/office/drawing/2016/ink" xmlns:am3d="http://schemas.microsoft.com/office/drawing/2017/model3d" xmlns:o="urn:schemas-microsoft-com:office:office" xmlns:oel="http://schemas.microsoft.com/office/2019/extlst" xmlns:r="http://schemas.openxmlformats.org/officeDocument/2006/relationships" xmlns:m="http://schemas.openxmlformats.org/officeDocument/2006/math" xmlns:v="urn:schemas-microsoft-com:vml" xmlns:wp14="http://schemas.microsoft.com/office/word/2010/wordprocessingDrawing" xmlns:wp="http://schemas.openxmlformats.org/drawingml/2006/wordprocessingDrawing" xmlns:w10="urn:schemas-microsoft-com:office:word" xmlns:w="http://schemas.openxmlformats.org/wordprocessingml/2006/main" xmlns:w14="http://schemas.microsoft.com/office/word/2010/wordml" xmlns:w15="http://schemas.microsoft.com/office/word/2012/wordml" xmlns:w16cei="http://schemas.microsoft.com/office/word/2026/wordml/cei" xmlns:w16cex="http://schemas.microsoft.com/office/word/2018/wordml/cex" xmlns:w16cid="http://schemas.microsoft.com/office/word/2016/wordml/cid" xmlns:w16="http://schemas.microsoft.com/office/word/2018/wordml" xmlns:w16du="http://schemas.microsoft.com/office/word/2023/wordml/word16du" xmlns:w16sdtdh="http://schemas.microsoft.com/office/word/2020/wordml/sdtdatahash" xmlns:w16sdtfl="http://schemas.microsoft.com/office/word/2024/wordml/sdtformatlock" xmlns:w16se="http://schemas.microsoft.com/office/word/2015/wordml/symex" xmlns:wpg="http://schemas.microsoft.com/office/word/2010/wordprocessingGroup" xmlns:wpi="http://schemas.microsoft.com/office/word/2010/wordprocessingInk" xmlns:wne="http://schemas.microsoft.com/office/word/2006/wordml" xmlns:wps="http://schemas.microsoft.com/office/word/2010/wordprocessingShape" mc:Ignorable="w14 w15 w16se w16cid w16 w16cex w16sdtdh w16sdtfl w16du wp14">
   <w:p>
     <w:pPr>
       <w:pStyle w:val="Stopka"/>
@@ -3189,7 +3626,7 @@
 </file>
 
 <file path=word/footer2.xml><?xml version="1.0" encoding="utf-8"?>
-<w:ftr xmlns:wpc="http://schemas.microsoft.com/office/word/2010/wordprocessingCanvas" xmlns:cx="http://schemas.microsoft.com/office/drawing/2014/chartex" xmlns:cx1="http://schemas.microsoft.com/office/drawing/2015/9/8/chartex" xmlns:cx2="http://schemas.microsoft.com/office/drawing/2015/10/21/chartex" xmlns:cx3="http://schemas.microsoft.com/office/drawing/2016/5/9/chartex" xmlns:cx4="http://schemas.microsoft.com/office/drawing/2016/5/10/chartex" xmlns:cx5="http://schemas.microsoft.com/office/drawing/2016/5/11/chartex" xmlns:cx6="http://schemas.microsoft.com/office/drawing/2016/5/12/chartex" xmlns:cx7="http://schemas.microsoft.com/office/drawing/2016/5/13/chartex" xmlns:cx8="http://schemas.microsoft.com/office/drawing/2016/5/14/chartex" xmlns:mc="http://schemas.openxmlformats.org/markup-compatibility/2006" xmlns:aink="http://schemas.microsoft.com/office/drawing/2016/ink" xmlns:am3d="http://schemas.microsoft.com/office/drawing/2017/model3d" xmlns:o="urn:schemas-microsoft-com:office:office" xmlns:oel="http://schemas.microsoft.com/office/2019/extlst" xmlns:r="http://schemas.openxmlformats.org/officeDocument/2006/relationships" xmlns:m="http://schemas.openxmlformats.org/officeDocument/2006/math" xmlns:v="urn:schemas-microsoft-com:vml" xmlns:wp14="http://schemas.microsoft.com/office/word/2010/wordprocessingDrawing" xmlns:wp="http://schemas.openxmlformats.org/drawingml/2006/wordprocessingDrawing" xmlns:w10="urn:schemas-microsoft-com:office:word" xmlns:w="http://schemas.openxmlformats.org/wordprocessingml/2006/main" xmlns:w14="http://schemas.microsoft.com/office/word/2010/wordml" xmlns:w15="http://schemas.microsoft.com/office/word/2012/wordml" xmlns:w16cex="http://schemas.microsoft.com/office/word/2018/wordml/cex" xmlns:w16cid="http://schemas.microsoft.com/office/word/2016/wordml/cid" xmlns:w16="http://schemas.microsoft.com/office/word/2018/wordml" xmlns:w16du="http://schemas.microsoft.com/office/word/2023/wordml/word16du" xmlns:w16sdtdh="http://schemas.microsoft.com/office/word/2020/wordml/sdtdatahash" xmlns:w16sdtfl="http://schemas.microsoft.com/office/word/2024/wordml/sdtformatlock" xmlns:w16se="http://schemas.microsoft.com/office/word/2015/wordml/symex" xmlns:wpg="http://schemas.microsoft.com/office/word/2010/wordprocessingGroup" xmlns:wpi="http://schemas.microsoft.com/office/word/2010/wordprocessingInk" xmlns:wne="http://schemas.microsoft.com/office/word/2006/wordml" xmlns:wps="http://schemas.microsoft.com/office/word/2010/wordprocessingShape" mc:Ignorable="w14 w15 w16se w16cid w16 w16cex w16sdtdh w16sdtfl w16du wp14">
+<w:ftr xmlns:wpc="http://schemas.microsoft.com/office/word/2010/wordprocessingCanvas" xmlns:cx="http://schemas.microsoft.com/office/drawing/2014/chartex" xmlns:cx1="http://schemas.microsoft.com/office/drawing/2015/9/8/chartex" xmlns:cx2="http://schemas.microsoft.com/office/drawing/2015/10/21/chartex" xmlns:cx3="http://schemas.microsoft.com/office/drawing/2016/5/9/chartex" xmlns:cx4="http://schemas.microsoft.com/office/drawing/2016/5/10/chartex" xmlns:cx5="http://schemas.microsoft.com/office/drawing/2016/5/11/chartex" xmlns:cx6="http://schemas.microsoft.com/office/drawing/2016/5/12/chartex" xmlns:cx7="http://schemas.microsoft.com/office/drawing/2016/5/13/chartex" xmlns:cx8="http://schemas.microsoft.com/office/drawing/2016/5/14/chartex" xmlns:mc="http://schemas.openxmlformats.org/markup-compatibility/2006" xmlns:aink="http://schemas.microsoft.com/office/drawing/2016/ink" xmlns:am3d="http://schemas.microsoft.com/office/drawing/2017/model3d" xmlns:o="urn:schemas-microsoft-com:office:office" xmlns:oel="http://schemas.microsoft.com/office/2019/extlst" xmlns:r="http://schemas.openxmlformats.org/officeDocument/2006/relationships" xmlns:m="http://schemas.openxmlformats.org/officeDocument/2006/math" xmlns:v="urn:schemas-microsoft-com:vml" xmlns:wp14="http://schemas.microsoft.com/office/word/2010/wordprocessingDrawing" xmlns:wp="http://schemas.openxmlformats.org/drawingml/2006/wordprocessingDrawing" xmlns:w10="urn:schemas-microsoft-com:office:word" xmlns:w="http://schemas.openxmlformats.org/wordprocessingml/2006/main" xmlns:w14="http://schemas.microsoft.com/office/word/2010/wordml" xmlns:w15="http://schemas.microsoft.com/office/word/2012/wordml" xmlns:w16cei="http://schemas.microsoft.com/office/word/2026/wordml/cei" xmlns:w16cex="http://schemas.microsoft.com/office/word/2018/wordml/cex" xmlns:w16cid="http://schemas.microsoft.com/office/word/2016/wordml/cid" xmlns:w16="http://schemas.microsoft.com/office/word/2018/wordml" xmlns:w16du="http://schemas.microsoft.com/office/word/2023/wordml/word16du" xmlns:w16sdtdh="http://schemas.microsoft.com/office/word/2020/wordml/sdtdatahash" xmlns:w16sdtfl="http://schemas.microsoft.com/office/word/2024/wordml/sdtformatlock" xmlns:w16se="http://schemas.microsoft.com/office/word/2015/wordml/symex" xmlns:wpg="http://schemas.microsoft.com/office/word/2010/wordprocessingGroup" xmlns:wpi="http://schemas.microsoft.com/office/word/2010/wordprocessingInk" xmlns:wne="http://schemas.microsoft.com/office/word/2006/wordml" xmlns:wps="http://schemas.microsoft.com/office/word/2010/wordprocessingShape" mc:Ignorable="w14 w15 w16se w16cid w16 w16cex w16sdtdh w16sdtfl w16du wp14">
   <w:p>
     <w:pPr>
       <w:pStyle w:val="Stopka"/>
@@ -3261,7 +3698,7 @@
 </file>
 
 <file path=word/footer3.xml><?xml version="1.0" encoding="utf-8"?>
-<w:ftr xmlns:wpc="http://schemas.microsoft.com/office/word/2010/wordprocessingCanvas" xmlns:cx="http://schemas.microsoft.com/office/drawing/2014/chartex" xmlns:cx1="http://schemas.microsoft.com/office/drawing/2015/9/8/chartex" xmlns:cx2="http://schemas.microsoft.com/office/drawing/2015/10/21/chartex" xmlns:cx3="http://schemas.microsoft.com/office/drawing/2016/5/9/chartex" xmlns:cx4="http://schemas.microsoft.com/office/drawing/2016/5/10/chartex" xmlns:cx5="http://schemas.microsoft.com/office/drawing/2016/5/11/chartex" xmlns:cx6="http://schemas.microsoft.com/office/drawing/2016/5/12/chartex" xmlns:cx7="http://schemas.microsoft.com/office/drawing/2016/5/13/chartex" xmlns:cx8="http://schemas.microsoft.com/office/drawing/2016/5/14/chartex" xmlns:mc="http://schemas.openxmlformats.org/markup-compatibility/2006" xmlns:aink="http://schemas.microsoft.com/office/drawing/2016/ink" xmlns:am3d="http://schemas.microsoft.com/office/drawing/2017/model3d" xmlns:o="urn:schemas-microsoft-com:office:office" xmlns:oel="http://schemas.microsoft.com/office/2019/extlst" xmlns:r="http://schemas.openxmlformats.org/officeDocument/2006/relationships" xmlns:m="http://schemas.openxmlformats.org/officeDocument/2006/math" xmlns:v="urn:schemas-microsoft-com:vml" xmlns:wp14="http://schemas.microsoft.com/office/word/2010/wordprocessingDrawing" xmlns:wp="http://schemas.openxmlformats.org/drawingml/2006/wordprocessingDrawing" xmlns:w10="urn:schemas-microsoft-com:office:word" xmlns:w="http://schemas.openxmlformats.org/wordprocessingml/2006/main" xmlns:w14="http://schemas.microsoft.com/office/word/2010/wordml" xmlns:w15="http://schemas.microsoft.com/office/word/2012/wordml" xmlns:w16cex="http://schemas.microsoft.com/office/word/2018/wordml/cex" xmlns:w16cid="http://schemas.microsoft.com/office/word/2016/wordml/cid" xmlns:w16="http://schemas.microsoft.com/office/word/2018/wordml" xmlns:w16du="http://schemas.microsoft.com/office/word/2023/wordml/word16du" xmlns:w16sdtdh="http://schemas.microsoft.com/office/word/2020/wordml/sdtdatahash" xmlns:w16sdtfl="http://schemas.microsoft.com/office/word/2024/wordml/sdtformatlock" xmlns:w16se="http://schemas.microsoft.com/office/word/2015/wordml/symex" xmlns:wpg="http://schemas.microsoft.com/office/word/2010/wordprocessingGroup" xmlns:wpi="http://schemas.microsoft.com/office/word/2010/wordprocessingInk" xmlns:wne="http://schemas.microsoft.com/office/word/2006/wordml" xmlns:wps="http://schemas.microsoft.com/office/word/2010/wordprocessingShape" mc:Ignorable="w14 w15 w16se w16cid w16 w16cex w16sdtdh w16sdtfl w16du wp14">
+<w:ftr xmlns:wpc="http://schemas.microsoft.com/office/word/2010/wordprocessingCanvas" xmlns:cx="http://schemas.microsoft.com/office/drawing/2014/chartex" xmlns:cx1="http://schemas.microsoft.com/office/drawing/2015/9/8/chartex" xmlns:cx2="http://schemas.microsoft.com/office/drawing/2015/10/21/chartex" xmlns:cx3="http://schemas.microsoft.com/office/drawing/2016/5/9/chartex" xmlns:cx4="http://schemas.microsoft.com/office/drawing/2016/5/10/chartex" xmlns:cx5="http://schemas.microsoft.com/office/drawing/2016/5/11/chartex" xmlns:cx6="http://schemas.microsoft.com/office/drawing/2016/5/12/chartex" xmlns:cx7="http://schemas.microsoft.com/office/drawing/2016/5/13/chartex" xmlns:cx8="http://schemas.microsoft.com/office/drawing/2016/5/14/chartex" xmlns:mc="http://schemas.openxmlformats.org/markup-compatibility/2006" xmlns:aink="http://schemas.microsoft.com/office/drawing/2016/ink" xmlns:am3d="http://schemas.microsoft.com/office/drawing/2017/model3d" xmlns:o="urn:schemas-microsoft-com:office:office" xmlns:oel="http://schemas.microsoft.com/office/2019/extlst" xmlns:r="http://schemas.openxmlformats.org/officeDocument/2006/relationships" xmlns:m="http://schemas.openxmlformats.org/officeDocument/2006/math" xmlns:v="urn:schemas-microsoft-com:vml" xmlns:wp14="http://schemas.microsoft.com/office/word/2010/wordprocessingDrawing" xmlns:wp="http://schemas.openxmlformats.org/drawingml/2006/wordprocessingDrawing" xmlns:w10="urn:schemas-microsoft-com:office:word" xmlns:w="http://schemas.openxmlformats.org/wordprocessingml/2006/main" xmlns:w14="http://schemas.microsoft.com/office/word/2010/wordml" xmlns:w15="http://schemas.microsoft.com/office/word/2012/wordml" xmlns:w16cei="http://schemas.microsoft.com/office/word/2026/wordml/cei" xmlns:w16cex="http://schemas.microsoft.com/office/word/2018/wordml/cex" xmlns:w16cid="http://schemas.microsoft.com/office/word/2016/wordml/cid" xmlns:w16="http://schemas.microsoft.com/office/word/2018/wordml" xmlns:w16du="http://schemas.microsoft.com/office/word/2023/wordml/word16du" xmlns:w16sdtdh="http://schemas.microsoft.com/office/word/2020/wordml/sdtdatahash" xmlns:w16sdtfl="http://schemas.microsoft.com/office/word/2024/wordml/sdtformatlock" xmlns:w16se="http://schemas.microsoft.com/office/word/2015/wordml/symex" xmlns:wpg="http://schemas.microsoft.com/office/word/2010/wordprocessingGroup" xmlns:wpi="http://schemas.microsoft.com/office/word/2010/wordprocessingInk" xmlns:wne="http://schemas.microsoft.com/office/word/2006/wordml" xmlns:wps="http://schemas.microsoft.com/office/word/2010/wordprocessingShape" mc:Ignorable="w14 w15 w16se w16cid w16 w16cex w16sdtdh w16sdtfl w16du wp14">
   <w:p>
     <w:pPr>
       <w:pStyle w:val="Stopka"/>
@@ -3279,7 +3716,7 @@
 </file>
 
 <file path=word/footer4.xml><?xml version="1.0" encoding="utf-8"?>
-<w:ftr xmlns:wpc="http://schemas.microsoft.com/office/word/2010/wordprocessingCanvas" xmlns:cx="http://schemas.microsoft.com/office/drawing/2014/chartex" xmlns:cx1="http://schemas.microsoft.com/office/drawing/2015/9/8/chartex" xmlns:cx2="http://schemas.microsoft.com/office/drawing/2015/10/21/chartex" xmlns:cx3="http://schemas.microsoft.com/office/drawing/2016/5/9/chartex" xmlns:cx4="http://schemas.microsoft.com/office/drawing/2016/5/10/chartex" xmlns:cx5="http://schemas.microsoft.com/office/drawing/2016/5/11/chartex" xmlns:cx6="http://schemas.microsoft.com/office/drawing/2016/5/12/chartex" xmlns:cx7="http://schemas.microsoft.com/office/drawing/2016/5/13/chartex" xmlns:cx8="http://schemas.microsoft.com/office/drawing/2016/5/14/chartex" xmlns:mc="http://schemas.openxmlformats.org/markup-compatibility/2006" xmlns:aink="http://schemas.microsoft.com/office/drawing/2016/ink" xmlns:am3d="http://schemas.microsoft.com/office/drawing/2017/model3d" xmlns:o="urn:schemas-microsoft-com:office:office" xmlns:oel="http://schemas.microsoft.com/office/2019/extlst" xmlns:r="http://schemas.openxmlformats.org/officeDocument/2006/relationships" xmlns:m="http://schemas.openxmlformats.org/officeDocument/2006/math" xmlns:v="urn:schemas-microsoft-com:vml" xmlns:wp14="http://schemas.microsoft.com/office/word/2010/wordprocessingDrawing" xmlns:wp="http://schemas.openxmlformats.org/drawingml/2006/wordprocessingDrawing" xmlns:w10="urn:schemas-microsoft-com:office:word" xmlns:w="http://schemas.openxmlformats.org/wordprocessingml/2006/main" xmlns:w14="http://schemas.microsoft.com/office/word/2010/wordml" xmlns:w15="http://schemas.microsoft.com/office/word/2012/wordml" xmlns:w16cex="http://schemas.microsoft.com/office/word/2018/wordml/cex" xmlns:w16cid="http://schemas.microsoft.com/office/word/2016/wordml/cid" xmlns:w16="http://schemas.microsoft.com/office/word/2018/wordml" xmlns:w16du="http://schemas.microsoft.com/office/word/2023/wordml/word16du" xmlns:w16sdtdh="http://schemas.microsoft.com/office/word/2020/wordml/sdtdatahash" xmlns:w16sdtfl="http://schemas.microsoft.com/office/word/2024/wordml/sdtformatlock" xmlns:w16se="http://schemas.microsoft.com/office/word/2015/wordml/symex" xmlns:wpg="http://schemas.microsoft.com/office/word/2010/wordprocessingGroup" xmlns:wpi="http://schemas.microsoft.com/office/word/2010/wordprocessingInk" xmlns:wne="http://schemas.microsoft.com/office/word/2006/wordml" xmlns:wps="http://schemas.microsoft.com/office/word/2010/wordprocessingShape" mc:Ignorable="w14 w15 w16se w16cid w16 w16cex w16sdtdh w16sdtfl w16du wp14">
+<w:ftr xmlns:wpc="http://schemas.microsoft.com/office/word/2010/wordprocessingCanvas" xmlns:cx="http://schemas.microsoft.com/office/drawing/2014/chartex" xmlns:cx1="http://schemas.microsoft.com/office/drawing/2015/9/8/chartex" xmlns:cx2="http://schemas.microsoft.com/office/drawing/2015/10/21/chartex" xmlns:cx3="http://schemas.microsoft.com/office/drawing/2016/5/9/chartex" xmlns:cx4="http://schemas.microsoft.com/office/drawing/2016/5/10/chartex" xmlns:cx5="http://schemas.microsoft.com/office/drawing/2016/5/11/chartex" xmlns:cx6="http://schemas.microsoft.com/office/drawing/2016/5/12/chartex" xmlns:cx7="http://schemas.microsoft.com/office/drawing/2016/5/13/chartex" xmlns:cx8="http://schemas.microsoft.com/office/drawing/2016/5/14/chartex" xmlns:mc="http://schemas.openxmlformats.org/markup-compatibility/2006" xmlns:aink="http://schemas.microsoft.com/office/drawing/2016/ink" xmlns:am3d="http://schemas.microsoft.com/office/drawing/2017/model3d" xmlns:o="urn:schemas-microsoft-com:office:office" xmlns:oel="http://schemas.microsoft.com/office/2019/extlst" xmlns:r="http://schemas.openxmlformats.org/officeDocument/2006/relationships" xmlns:m="http://schemas.openxmlformats.org/officeDocument/2006/math" xmlns:v="urn:schemas-microsoft-com:vml" xmlns:wp14="http://schemas.microsoft.com/office/word/2010/wordprocessingDrawing" xmlns:wp="http://schemas.openxmlformats.org/drawingml/2006/wordprocessingDrawing" xmlns:w10="urn:schemas-microsoft-com:office:word" xmlns:w="http://schemas.openxmlformats.org/wordprocessingml/2006/main" xmlns:w14="http://schemas.microsoft.com/office/word/2010/wordml" xmlns:w15="http://schemas.microsoft.com/office/word/2012/wordml" xmlns:w16cei="http://schemas.microsoft.com/office/word/2026/wordml/cei" xmlns:w16cex="http://schemas.microsoft.com/office/word/2018/wordml/cex" xmlns:w16cid="http://schemas.microsoft.com/office/word/2016/wordml/cid" xmlns:w16="http://schemas.microsoft.com/office/word/2018/wordml" xmlns:w16du="http://schemas.microsoft.com/office/word/2023/wordml/word16du" xmlns:w16sdtdh="http://schemas.microsoft.com/office/word/2020/wordml/sdtdatahash" xmlns:w16sdtfl="http://schemas.microsoft.com/office/word/2024/wordml/sdtformatlock" xmlns:w16se="http://schemas.microsoft.com/office/word/2015/wordml/symex" xmlns:wpg="http://schemas.microsoft.com/office/word/2010/wordprocessingGroup" xmlns:wpi="http://schemas.microsoft.com/office/word/2010/wordprocessingInk" xmlns:wne="http://schemas.microsoft.com/office/word/2006/wordml" xmlns:wps="http://schemas.microsoft.com/office/word/2010/wordprocessingShape" mc:Ignorable="w14 w15 w16se w16cid w16 w16cex w16sdtdh w16sdtfl w16du wp14">
   <w:p>
     <w:pPr>
       <w:pStyle w:val="Stopka"/>
@@ -3359,7 +3796,7 @@
 </file>
 
 <file path=word/footnotes.xml><?xml version="1.0" encoding="utf-8"?>
-<w:footnotes xmlns:wpc="http://schemas.microsoft.com/office/word/2010/wordprocessingCanvas" xmlns:cx="http://schemas.microsoft.com/office/drawing/2014/chartex" xmlns:cx1="http://schemas.microsoft.com/office/drawing/2015/9/8/chartex" xmlns:cx2="http://schemas.microsoft.com/office/drawing/2015/10/21/chartex" xmlns:cx3="http://schemas.microsoft.com/office/drawing/2016/5/9/chartex" xmlns:cx4="http://schemas.microsoft.com/office/drawing/2016/5/10/chartex" xmlns:cx5="http://schemas.microsoft.com/office/drawing/2016/5/11/chartex" xmlns:cx6="http://schemas.microsoft.com/office/drawing/2016/5/12/chartex" xmlns:cx7="http://schemas.microsoft.com/office/drawing/2016/5/13/chartex" xmlns:cx8="http://schemas.microsoft.com/office/drawing/2016/5/14/chartex" xmlns:mc="http://schemas.openxmlformats.org/markup-compatibility/2006" xmlns:aink="http://schemas.microsoft.com/office/drawing/2016/ink" xmlns:am3d="http://schemas.microsoft.com/office/drawing/2017/model3d" xmlns:o="urn:schemas-microsoft-com:office:office" xmlns:oel="http://schemas.microsoft.com/office/2019/extlst" xmlns:r="http://schemas.openxmlformats.org/officeDocument/2006/relationships" xmlns:m="http://schemas.openxmlformats.org/officeDocument/2006/math" xmlns:v="urn:schemas-microsoft-com:vml" xmlns:wp14="http://schemas.microsoft.com/office/word/2010/wordprocessingDrawing" xmlns:wp="http://schemas.openxmlformats.org/drawingml/2006/wordprocessingDrawing" xmlns:w10="urn:schemas-microsoft-com:office:word" xmlns:w="http://schemas.openxmlformats.org/wordprocessingml/2006/main" xmlns:w14="http://schemas.microsoft.com/office/word/2010/wordml" xmlns:w15="http://schemas.microsoft.com/office/word/2012/wordml" xmlns:w16cex="http://schemas.microsoft.com/office/word/2018/wordml/cex" xmlns:w16cid="http://schemas.microsoft.com/office/word/2016/wordml/cid" xmlns:w16="http://schemas.microsoft.com/office/word/2018/wordml" xmlns:w16du="http://schemas.microsoft.com/office/word/2023/wordml/word16du" xmlns:w16sdtdh="http://schemas.microsoft.com/office/word/2020/wordml/sdtdatahash" xmlns:w16sdtfl="http://schemas.microsoft.com/office/word/2024/wordml/sdtformatlock" xmlns:w16se="http://schemas.microsoft.com/office/word/2015/wordml/symex" xmlns:wpg="http://schemas.microsoft.com/office/word/2010/wordprocessingGroup" xmlns:wpi="http://schemas.microsoft.com/office/word/2010/wordprocessingInk" xmlns:wne="http://schemas.microsoft.com/office/word/2006/wordml" xmlns:wps="http://schemas.microsoft.com/office/word/2010/wordprocessingShape" mc:Ignorable="w14 w15 w16se w16cid w16 w16cex w16sdtdh w16sdtfl w16du wp14">
+<w:footnotes xmlns:wpc="http://schemas.microsoft.com/office/word/2010/wordprocessingCanvas" xmlns:cx="http://schemas.microsoft.com/office/drawing/2014/chartex" xmlns:cx1="http://schemas.microsoft.com/office/drawing/2015/9/8/chartex" xmlns:cx2="http://schemas.microsoft.com/office/drawing/2015/10/21/chartex" xmlns:cx3="http://schemas.microsoft.com/office/drawing/2016/5/9/chartex" xmlns:cx4="http://schemas.microsoft.com/office/drawing/2016/5/10/chartex" xmlns:cx5="http://schemas.microsoft.com/office/drawing/2016/5/11/chartex" xmlns:cx6="http://schemas.microsoft.com/office/drawing/2016/5/12/chartex" xmlns:cx7="http://schemas.microsoft.com/office/drawing/2016/5/13/chartex" xmlns:cx8="http://schemas.microsoft.com/office/drawing/2016/5/14/chartex" xmlns:mc="http://schemas.openxmlformats.org/markup-compatibility/2006" xmlns:aink="http://schemas.microsoft.com/office/drawing/2016/ink" xmlns:am3d="http://schemas.microsoft.com/office/drawing/2017/model3d" xmlns:o="urn:schemas-microsoft-com:office:office" xmlns:oel="http://schemas.microsoft.com/office/2019/extlst" xmlns:r="http://schemas.openxmlformats.org/officeDocument/2006/relationships" xmlns:m="http://schemas.openxmlformats.org/officeDocument/2006/math" xmlns:v="urn:schemas-microsoft-com:vml" xmlns:wp14="http://schemas.microsoft.com/office/word/2010/wordprocessingDrawing" xmlns:wp="http://schemas.openxmlformats.org/drawingml/2006/wordprocessingDrawing" xmlns:w10="urn:schemas-microsoft-com:office:word" xmlns:w="http://schemas.openxmlformats.org/wordprocessingml/2006/main" xmlns:w14="http://schemas.microsoft.com/office/word/2010/wordml" xmlns:w15="http://schemas.microsoft.com/office/word/2012/wordml" xmlns:w16cei="http://schemas.microsoft.com/office/word/2026/wordml/cei" xmlns:w16cex="http://schemas.microsoft.com/office/word/2018/wordml/cex" xmlns:w16cid="http://schemas.microsoft.com/office/word/2016/wordml/cid" xmlns:w16="http://schemas.microsoft.com/office/word/2018/wordml" xmlns:w16du="http://schemas.microsoft.com/office/word/2023/wordml/word16du" xmlns:w16sdtdh="http://schemas.microsoft.com/office/word/2020/wordml/sdtdatahash" xmlns:w16sdtfl="http://schemas.microsoft.com/office/word/2024/wordml/sdtformatlock" xmlns:w16se="http://schemas.microsoft.com/office/word/2015/wordml/symex" xmlns:wpg="http://schemas.microsoft.com/office/word/2010/wordprocessingGroup" xmlns:wpi="http://schemas.microsoft.com/office/word/2010/wordprocessingInk" xmlns:wne="http://schemas.microsoft.com/office/word/2006/wordml" xmlns:wps="http://schemas.microsoft.com/office/word/2010/wordprocessingShape" mc:Ignorable="w14 w15 w16se w16cid w16 w16cex w16sdtdh w16sdtfl w16du wp14">
   <w:footnote w:type="separator" w:id="-1">
     <w:p>
       <w:pPr>
@@ -3384,7 +3821,7 @@
 </file>
 
 <file path=word/header1.xml><?xml version="1.0" encoding="utf-8"?>
-<w:hdr xmlns:wpc="http://schemas.microsoft.com/office/word/2010/wordprocessingCanvas" xmlns:cx="http://schemas.microsoft.com/office/drawing/2014/chartex" xmlns:cx1="http://schemas.microsoft.com/office/drawing/2015/9/8/chartex" xmlns:cx2="http://schemas.microsoft.com/office/drawing/2015/10/21/chartex" xmlns:cx3="http://schemas.microsoft.com/office/drawing/2016/5/9/chartex" xmlns:cx4="http://schemas.microsoft.com/office/drawing/2016/5/10/chartex" xmlns:cx5="http://schemas.microsoft.com/office/drawing/2016/5/11/chartex" xmlns:cx6="http://schemas.microsoft.com/office/drawing/2016/5/12/chartex" xmlns:cx7="http://schemas.microsoft.com/office/drawing/2016/5/13/chartex" xmlns:cx8="http://schemas.microsoft.com/office/drawing/2016/5/14/chartex" xmlns:mc="http://schemas.openxmlformats.org/markup-compatibility/2006" xmlns:aink="http://schemas.microsoft.com/office/drawing/2016/ink" xmlns:am3d="http://schemas.microsoft.com/office/drawing/2017/model3d" xmlns:o="urn:schemas-microsoft-com:office:office" xmlns:oel="http://schemas.microsoft.com/office/2019/extlst" xmlns:r="http://schemas.openxmlformats.org/officeDocument/2006/relationships" xmlns:m="http://schemas.openxmlformats.org/officeDocument/2006/math" xmlns:v="urn:schemas-microsoft-com:vml" xmlns:wp14="http://schemas.microsoft.com/office/word/2010/wordprocessingDrawing" xmlns:wp="http://schemas.openxmlformats.org/drawingml/2006/wordprocessingDrawing" xmlns:w10="urn:schemas-microsoft-com:office:word" xmlns:w="http://schemas.openxmlformats.org/wordprocessingml/2006/main" xmlns:w14="http://schemas.microsoft.com/office/word/2010/wordml" xmlns:w15="http://schemas.microsoft.com/office/word/2012/wordml" xmlns:w16cex="http://schemas.microsoft.com/office/word/2018/wordml/cex" xmlns:w16cid="http://schemas.microsoft.com/office/word/2016/wordml/cid" xmlns:w16="http://schemas.microsoft.com/office/word/2018/wordml" xmlns:w16du="http://schemas.microsoft.com/office/word/2023/wordml/word16du" xmlns:w16sdtdh="http://schemas.microsoft.com/office/word/2020/wordml/sdtdatahash" xmlns:w16sdtfl="http://schemas.microsoft.com/office/word/2024/wordml/sdtformatlock" xmlns:w16se="http://schemas.microsoft.com/office/word/2015/wordml/symex" xmlns:wpg="http://schemas.microsoft.com/office/word/2010/wordprocessingGroup" xmlns:wpi="http://schemas.microsoft.com/office/word/2010/wordprocessingInk" xmlns:wne="http://schemas.microsoft.com/office/word/2006/wordml" xmlns:wps="http://schemas.microsoft.com/office/word/2010/wordprocessingShape" mc:Ignorable="w14 w15 w16se w16cid w16 w16cex w16sdtdh w16sdtfl w16du wp14">
+<w:hdr xmlns:wpc="http://schemas.microsoft.com/office/word/2010/wordprocessingCanvas" xmlns:cx="http://schemas.microsoft.com/office/drawing/2014/chartex" xmlns:cx1="http://schemas.microsoft.com/office/drawing/2015/9/8/chartex" xmlns:cx2="http://schemas.microsoft.com/office/drawing/2015/10/21/chartex" xmlns:cx3="http://schemas.microsoft.com/office/drawing/2016/5/9/chartex" xmlns:cx4="http://schemas.microsoft.com/office/drawing/2016/5/10/chartex" xmlns:cx5="http://schemas.microsoft.com/office/drawing/2016/5/11/chartex" xmlns:cx6="http://schemas.microsoft.com/office/drawing/2016/5/12/chartex" xmlns:cx7="http://schemas.microsoft.com/office/drawing/2016/5/13/chartex" xmlns:cx8="http://schemas.microsoft.com/office/drawing/2016/5/14/chartex" xmlns:mc="http://schemas.openxmlformats.org/markup-compatibility/2006" xmlns:aink="http://schemas.microsoft.com/office/drawing/2016/ink" xmlns:am3d="http://schemas.microsoft.com/office/drawing/2017/model3d" xmlns:o="urn:schemas-microsoft-com:office:office" xmlns:oel="http://schemas.microsoft.com/office/2019/extlst" xmlns:r="http://schemas.openxmlformats.org/officeDocument/2006/relationships" xmlns:m="http://schemas.openxmlformats.org/officeDocument/2006/math" xmlns:v="urn:schemas-microsoft-com:vml" xmlns:wp14="http://schemas.microsoft.com/office/word/2010/wordprocessingDrawing" xmlns:wp="http://schemas.openxmlformats.org/drawingml/2006/wordprocessingDrawing" xmlns:w10="urn:schemas-microsoft-com:office:word" xmlns:w="http://schemas.openxmlformats.org/wordprocessingml/2006/main" xmlns:w14="http://schemas.microsoft.com/office/word/2010/wordml" xmlns:w15="http://schemas.microsoft.com/office/word/2012/wordml" xmlns:w16cei="http://schemas.microsoft.com/office/word/2026/wordml/cei" xmlns:w16cex="http://schemas.microsoft.com/office/word/2018/wordml/cex" xmlns:w16cid="http://schemas.microsoft.com/office/word/2016/wordml/cid" xmlns:w16="http://schemas.microsoft.com/office/word/2018/wordml" xmlns:w16du="http://schemas.microsoft.com/office/word/2023/wordml/word16du" xmlns:w16sdtdh="http://schemas.microsoft.com/office/word/2020/wordml/sdtdatahash" xmlns:w16sdtfl="http://schemas.microsoft.com/office/word/2024/wordml/sdtformatlock" xmlns:w16se="http://schemas.microsoft.com/office/word/2015/wordml/symex" xmlns:wpg="http://schemas.microsoft.com/office/word/2010/wordprocessingGroup" xmlns:wpi="http://schemas.microsoft.com/office/word/2010/wordprocessingInk" xmlns:wne="http://schemas.microsoft.com/office/word/2006/wordml" xmlns:wps="http://schemas.microsoft.com/office/word/2010/wordprocessingShape" mc:Ignorable="w14 w15 w16se w16cid w16 w16cex w16sdtdh w16sdtfl w16du wp14">
   <w:p>
     <w:pPr>
       <w:pStyle w:val="Nagwek"/>
@@ -3394,7 +3831,7 @@
 </file>
 
 <file path=word/header2.xml><?xml version="1.0" encoding="utf-8"?>
-<w:hdr xmlns:wpc="http://schemas.microsoft.com/office/word/2010/wordprocessingCanvas" xmlns:cx="http://schemas.microsoft.com/office/drawing/2014/chartex" xmlns:cx1="http://schemas.microsoft.com/office/drawing/2015/9/8/chartex" xmlns:cx2="http://schemas.microsoft.com/office/drawing/2015/10/21/chartex" xmlns:cx3="http://schemas.microsoft.com/office/drawing/2016/5/9/chartex" xmlns:cx4="http://schemas.microsoft.com/office/drawing/2016/5/10/chartex" xmlns:cx5="http://schemas.microsoft.com/office/drawing/2016/5/11/chartex" xmlns:cx6="http://schemas.microsoft.com/office/drawing/2016/5/12/chartex" xmlns:cx7="http://schemas.microsoft.com/office/drawing/2016/5/13/chartex" xmlns:cx8="http://schemas.microsoft.com/office/drawing/2016/5/14/chartex" xmlns:mc="http://schemas.openxmlformats.org/markup-compatibility/2006" xmlns:aink="http://schemas.microsoft.com/office/drawing/2016/ink" xmlns:am3d="http://schemas.microsoft.com/office/drawing/2017/model3d" xmlns:o="urn:schemas-microsoft-com:office:office" xmlns:oel="http://schemas.microsoft.com/office/2019/extlst" xmlns:r="http://schemas.openxmlformats.org/officeDocument/2006/relationships" xmlns:m="http://schemas.openxmlformats.org/officeDocument/2006/math" xmlns:v="urn:schemas-microsoft-com:vml" xmlns:wp14="http://schemas.microsoft.com/office/word/2010/wordprocessingDrawing" xmlns:wp="http://schemas.openxmlformats.org/drawingml/2006/wordprocessingDrawing" xmlns:w10="urn:schemas-microsoft-com:office:word" xmlns:w="http://schemas.openxmlformats.org/wordprocessingml/2006/main" xmlns:w14="http://schemas.microsoft.com/office/word/2010/wordml" xmlns:w15="http://schemas.microsoft.com/office/word/2012/wordml" xmlns:w16cex="http://schemas.microsoft.com/office/word/2018/wordml/cex" xmlns:w16cid="http://schemas.microsoft.com/office/word/2016/wordml/cid" xmlns:w16="http://schemas.microsoft.com/office/word/2018/wordml" xmlns:w16du="http://schemas.microsoft.com/office/word/2023/wordml/word16du" xmlns:w16sdtdh="http://schemas.microsoft.com/office/word/2020/wordml/sdtdatahash" xmlns:w16sdtfl="http://schemas.microsoft.com/office/word/2024/wordml/sdtformatlock" xmlns:w16se="http://schemas.microsoft.com/office/word/2015/wordml/symex" xmlns:wpg="http://schemas.microsoft.com/office/word/2010/wordprocessingGroup" xmlns:wpi="http://schemas.microsoft.com/office/word/2010/wordprocessingInk" xmlns:wne="http://schemas.microsoft.com/office/word/2006/wordml" xmlns:wps="http://schemas.microsoft.com/office/word/2010/wordprocessingShape" mc:Ignorable="w14 w15 w16se w16cid w16 w16cex w16sdtdh w16sdtfl w16du wp14">
+<w:hdr xmlns:wpc="http://schemas.microsoft.com/office/word/2010/wordprocessingCanvas" xmlns:cx="http://schemas.microsoft.com/office/drawing/2014/chartex" xmlns:cx1="http://schemas.microsoft.com/office/drawing/2015/9/8/chartex" xmlns:cx2="http://schemas.microsoft.com/office/drawing/2015/10/21/chartex" xmlns:cx3="http://schemas.microsoft.com/office/drawing/2016/5/9/chartex" xmlns:cx4="http://schemas.microsoft.com/office/drawing/2016/5/10/chartex" xmlns:cx5="http://schemas.microsoft.com/office/drawing/2016/5/11/chartex" xmlns:cx6="http://schemas.microsoft.com/office/drawing/2016/5/12/chartex" xmlns:cx7="http://schemas.microsoft.com/office/drawing/2016/5/13/chartex" xmlns:cx8="http://schemas.microsoft.com/office/drawing/2016/5/14/chartex" xmlns:mc="http://schemas.openxmlformats.org/markup-compatibility/2006" xmlns:aink="http://schemas.microsoft.com/office/drawing/2016/ink" xmlns:am3d="http://schemas.microsoft.com/office/drawing/2017/model3d" xmlns:o="urn:schemas-microsoft-com:office:office" xmlns:oel="http://schemas.microsoft.com/office/2019/extlst" xmlns:r="http://schemas.openxmlformats.org/officeDocument/2006/relationships" xmlns:m="http://schemas.openxmlformats.org/officeDocument/2006/math" xmlns:v="urn:schemas-microsoft-com:vml" xmlns:wp14="http://schemas.microsoft.com/office/word/2010/wordprocessingDrawing" xmlns:wp="http://schemas.openxmlformats.org/drawingml/2006/wordprocessingDrawing" xmlns:w10="urn:schemas-microsoft-com:office:word" xmlns:w="http://schemas.openxmlformats.org/wordprocessingml/2006/main" xmlns:w14="http://schemas.microsoft.com/office/word/2010/wordml" xmlns:w15="http://schemas.microsoft.com/office/word/2012/wordml" xmlns:w16cei="http://schemas.microsoft.com/office/word/2026/wordml/cei" xmlns:w16cex="http://schemas.microsoft.com/office/word/2018/wordml/cex" xmlns:w16cid="http://schemas.microsoft.com/office/word/2016/wordml/cid" xmlns:w16="http://schemas.microsoft.com/office/word/2018/wordml" xmlns:w16du="http://schemas.microsoft.com/office/word/2023/wordml/word16du" xmlns:w16sdtdh="http://schemas.microsoft.com/office/word/2020/wordml/sdtdatahash" xmlns:w16sdtfl="http://schemas.microsoft.com/office/word/2024/wordml/sdtformatlock" xmlns:w16se="http://schemas.microsoft.com/office/word/2015/wordml/symex" xmlns:wpg="http://schemas.microsoft.com/office/word/2010/wordprocessingGroup" xmlns:wpi="http://schemas.microsoft.com/office/word/2010/wordprocessingInk" xmlns:wne="http://schemas.microsoft.com/office/word/2006/wordml" xmlns:wps="http://schemas.microsoft.com/office/word/2010/wordprocessingShape" mc:Ignorable="w14 w15 w16se w16cid w16 w16cex w16sdtdh w16sdtfl w16du wp14">
   <w:p>
     <w:pPr>
       <w:pStyle w:val="Nagwek"/>
@@ -3513,7 +3950,7 @@
         <w:sz w:val="18"/>
         <w:szCs w:val="18"/>
       </w:rPr>
-      <w:t>27.07.2026</w:t>
+      <w:t>12.08.2026</w:t>
     </w:r>
     <w:r>
       <w:rPr>
@@ -3530,7 +3967,7 @@
 </file>
 
 <file path=word/header3.xml><?xml version="1.0" encoding="utf-8"?>
-<w:hdr xmlns:wpc="http://schemas.microsoft.com/office/word/2010/wordprocessingCanvas" xmlns:cx="http://schemas.microsoft.com/office/drawing/2014/chartex" xmlns:cx1="http://schemas.microsoft.com/office/drawing/2015/9/8/chartex" xmlns:cx2="http://schemas.microsoft.com/office/drawing/2015/10/21/chartex" xmlns:cx3="http://schemas.microsoft.com/office/drawing/2016/5/9/chartex" xmlns:cx4="http://schemas.microsoft.com/office/drawing/2016/5/10/chartex" xmlns:cx5="http://schemas.microsoft.com/office/drawing/2016/5/11/chartex" xmlns:cx6="http://schemas.microsoft.com/office/drawing/2016/5/12/chartex" xmlns:cx7="http://schemas.microsoft.com/office/drawing/2016/5/13/chartex" xmlns:cx8="http://schemas.microsoft.com/office/drawing/2016/5/14/chartex" xmlns:mc="http://schemas.openxmlformats.org/markup-compatibility/2006" xmlns:aink="http://schemas.microsoft.com/office/drawing/2016/ink" xmlns:am3d="http://schemas.microsoft.com/office/drawing/2017/model3d" xmlns:o="urn:schemas-microsoft-com:office:office" xmlns:oel="http://schemas.microsoft.com/office/2019/extlst" xmlns:r="http://schemas.openxmlformats.org/officeDocument/2006/relationships" xmlns:m="http://schemas.openxmlformats.org/officeDocument/2006/math" xmlns:v="urn:schemas-microsoft-com:vml" xmlns:wp14="http://schemas.microsoft.com/office/word/2010/wordprocessingDrawing" xmlns:wp="http://schemas.openxmlformats.org/drawingml/2006/wordprocessingDrawing" xmlns:w10="urn:schemas-microsoft-com:office:word" xmlns:w="http://schemas.openxmlformats.org/wordprocessingml/2006/main" xmlns:w14="http://schemas.microsoft.com/office/word/2010/wordml" xmlns:w15="http://schemas.microsoft.com/office/word/2012/wordml" xmlns:w16cex="http://schemas.microsoft.com/office/word/2018/wordml/cex" xmlns:w16cid="http://schemas.microsoft.com/office/word/2016/wordml/cid" xmlns:w16="http://schemas.microsoft.com/office/word/2018/wordml" xmlns:w16du="http://schemas.microsoft.com/office/word/2023/wordml/word16du" xmlns:w16sdtdh="http://schemas.microsoft.com/office/word/2020/wordml/sdtdatahash" xmlns:w16sdtfl="http://schemas.microsoft.com/office/word/2024/wordml/sdtformatlock" xmlns:w16se="http://schemas.microsoft.com/office/word/2015/wordml/symex" xmlns:wpg="http://schemas.microsoft.com/office/word/2010/wordprocessingGroup" xmlns:wpi="http://schemas.microsoft.com/office/word/2010/wordprocessingInk" xmlns:wne="http://schemas.microsoft.com/office/word/2006/wordml" xmlns:wps="http://schemas.microsoft.com/office/word/2010/wordprocessingShape" mc:Ignorable="w14 w15 w16se w16cid w16 w16cex w16sdtdh w16sdtfl w16du wp14">
+<w:hdr xmlns:wpc="http://schemas.microsoft.com/office/word/2010/wordprocessingCanvas" xmlns:cx="http://schemas.microsoft.com/office/drawing/2014/chartex" xmlns:cx1="http://schemas.microsoft.com/office/drawing/2015/9/8/chartex" xmlns:cx2="http://schemas.microsoft.com/office/drawing/2015/10/21/chartex" xmlns:cx3="http://schemas.microsoft.com/office/drawing/2016/5/9/chartex" xmlns:cx4="http://schemas.microsoft.com/office/drawing/2016/5/10/chartex" xmlns:cx5="http://schemas.microsoft.com/office/drawing/2016/5/11/chartex" xmlns:cx6="http://schemas.microsoft.com/office/drawing/2016/5/12/chartex" xmlns:cx7="http://schemas.microsoft.com/office/drawing/2016/5/13/chartex" xmlns:cx8="http://schemas.microsoft.com/office/drawing/2016/5/14/chartex" xmlns:mc="http://schemas.openxmlformats.org/markup-compatibility/2006" xmlns:aink="http://schemas.microsoft.com/office/drawing/2016/ink" xmlns:am3d="http://schemas.microsoft.com/office/drawing/2017/model3d" xmlns:o="urn:schemas-microsoft-com:office:office" xmlns:oel="http://schemas.microsoft.com/office/2019/extlst" xmlns:r="http://schemas.openxmlformats.org/officeDocument/2006/relationships" xmlns:m="http://schemas.openxmlformats.org/officeDocument/2006/math" xmlns:v="urn:schemas-microsoft-com:vml" xmlns:wp14="http://schemas.microsoft.com/office/word/2010/wordprocessingDrawing" xmlns:wp="http://schemas.openxmlformats.org/drawingml/2006/wordprocessingDrawing" xmlns:w10="urn:schemas-microsoft-com:office:word" xmlns:w="http://schemas.openxmlformats.org/wordprocessingml/2006/main" xmlns:w14="http://schemas.microsoft.com/office/word/2010/wordml" xmlns:w15="http://schemas.microsoft.com/office/word/2012/wordml" xmlns:w16cei="http://schemas.microsoft.com/office/word/2026/wordml/cei" xmlns:w16cex="http://schemas.microsoft.com/office/word/2018/wordml/cex" xmlns:w16cid="http://schemas.microsoft.com/office/word/2016/wordml/cid" xmlns:w16="http://schemas.microsoft.com/office/word/2018/wordml" xmlns:w16du="http://schemas.microsoft.com/office/word/2023/wordml/word16du" xmlns:w16sdtdh="http://schemas.microsoft.com/office/word/2020/wordml/sdtdatahash" xmlns:w16sdtfl="http://schemas.microsoft.com/office/word/2024/wordml/sdtformatlock" xmlns:w16se="http://schemas.microsoft.com/office/word/2015/wordml/symex" xmlns:wpg="http://schemas.microsoft.com/office/word/2010/wordprocessingGroup" xmlns:wpi="http://schemas.microsoft.com/office/word/2010/wordprocessingInk" xmlns:wne="http://schemas.microsoft.com/office/word/2006/wordml" xmlns:wps="http://schemas.microsoft.com/office/word/2010/wordprocessingShape" mc:Ignorable="w14 w15 w16se w16cid w16 w16cex w16sdtdh w16sdtfl w16du wp14">
   <w:p>
     <w:pPr>
       <w:pStyle w:val="Nagwek"/>
@@ -3650,7 +4087,7 @@
         <w:sz w:val="18"/>
         <w:szCs w:val="18"/>
       </w:rPr>
-      <w:t>27.07.2026</w:t>
+      <w:t>12.08.2026</w:t>
     </w:r>
     <w:r>
       <w:rPr>
@@ -3667,7 +4104,7 @@
 </file>
 
 <file path=word/numbering.xml><?xml version="1.0" encoding="utf-8"?>
-<w:numbering xmlns:wpc="http://schemas.microsoft.com/office/word/2010/wordprocessingCanvas" xmlns:cx="http://schemas.microsoft.com/office/drawing/2014/chartex" xmlns:cx1="http://schemas.microsoft.com/office/drawing/2015/9/8/chartex" xmlns:cx2="http://schemas.microsoft.com/office/drawing/2015/10/21/chartex" xmlns:cx3="http://schemas.microsoft.com/office/drawing/2016/5/9/chartex" xmlns:cx4="http://schemas.microsoft.com/office/drawing/2016/5/10/chartex" xmlns:cx5="http://schemas.microsoft.com/office/drawing/2016/5/11/chartex" xmlns:cx6="http://schemas.microsoft.com/office/drawing/2016/5/12/chartex" xmlns:cx7="http://schemas.microsoft.com/office/drawing/2016/5/13/chartex" xmlns:cx8="http://schemas.microsoft.com/office/drawing/2016/5/14/chartex" xmlns:mc="http://schemas.openxmlformats.org/markup-compatibility/2006" xmlns:aink="http://schemas.microsoft.com/office/drawing/2016/ink" xmlns:am3d="http://schemas.microsoft.com/office/drawing/2017/model3d" xmlns:o="urn:schemas-microsoft-com:office:office" xmlns:oel="http://schemas.microsoft.com/office/2019/extlst" xmlns:r="http://schemas.openxmlformats.org/officeDocument/2006/relationships" xmlns:m="http://schemas.openxmlformats.org/officeDocument/2006/math" xmlns:v="urn:schemas-microsoft-com:vml" xmlns:wp14="http://schemas.microsoft.com/office/word/2010/wordprocessingDrawing" xmlns:wp="http://schemas.openxmlformats.org/drawingml/2006/wordprocessingDrawing" xmlns:w10="urn:schemas-microsoft-com:office:word" xmlns:w="http://schemas.openxmlformats.org/wordprocessingml/2006/main" xmlns:w14="http://schemas.microsoft.com/office/word/2010/wordml" xmlns:w15="http://schemas.microsoft.com/office/word/2012/wordml" xmlns:w16cex="http://schemas.microsoft.com/office/word/2018/wordml/cex" xmlns:w16cid="http://schemas.microsoft.com/office/word/2016/wordml/cid" xmlns:w16="http://schemas.microsoft.com/office/word/2018/wordml" xmlns:w16du="http://schemas.microsoft.com/office/word/2023/wordml/word16du" xmlns:w16sdtdh="http://schemas.microsoft.com/office/word/2020/wordml/sdtdatahash" xmlns:w16sdtfl="http://schemas.microsoft.com/office/word/2024/wordml/sdtformatlock" xmlns:w16se="http://schemas.microsoft.com/office/word/2015/wordml/symex" xmlns:wpg="http://schemas.microsoft.com/office/word/2010/wordprocessingGroup" xmlns:wpi="http://schemas.microsoft.com/office/word/2010/wordprocessingInk" xmlns:wne="http://schemas.microsoft.com/office/word/2006/wordml" xmlns:wps="http://schemas.microsoft.com/office/word/2010/wordprocessingShape" mc:Ignorable="w14 w15 w16se w16cid w16 w16cex w16sdtdh w16sdtfl w16du wp14">
+<w:numbering xmlns:wpc="http://schemas.microsoft.com/office/word/2010/wordprocessingCanvas" xmlns:cx="http://schemas.microsoft.com/office/drawing/2014/chartex" xmlns:cx1="http://schemas.microsoft.com/office/drawing/2015/9/8/chartex" xmlns:cx2="http://schemas.microsoft.com/office/drawing/2015/10/21/chartex" xmlns:cx3="http://schemas.microsoft.com/office/drawing/2016/5/9/chartex" xmlns:cx4="http://schemas.microsoft.com/office/drawing/2016/5/10/chartex" xmlns:cx5="http://schemas.microsoft.com/office/drawing/2016/5/11/chartex" xmlns:cx6="http://schemas.microsoft.com/office/drawing/2016/5/12/chartex" xmlns:cx7="http://schemas.microsoft.com/office/drawing/2016/5/13/chartex" xmlns:cx8="http://schemas.microsoft.com/office/drawing/2016/5/14/chartex" xmlns:mc="http://schemas.openxmlformats.org/markup-compatibility/2006" xmlns:aink="http://schemas.microsoft.com/office/drawing/2016/ink" xmlns:am3d="http://schemas.microsoft.com/office/drawing/2017/model3d" xmlns:o="urn:schemas-microsoft-com:office:office" xmlns:oel="http://schemas.microsoft.com/office/2019/extlst" xmlns:r="http://schemas.openxmlformats.org/officeDocument/2006/relationships" xmlns:m="http://schemas.openxmlformats.org/officeDocument/2006/math" xmlns:v="urn:schemas-microsoft-com:vml" xmlns:wp14="http://schemas.microsoft.com/office/word/2010/wordprocessingDrawing" xmlns:wp="http://schemas.openxmlformats.org/drawingml/2006/wordprocessingDrawing" xmlns:w10="urn:schemas-microsoft-com:office:word" xmlns:w="http://schemas.openxmlformats.org/wordprocessingml/2006/main" xmlns:w14="http://schemas.microsoft.com/office/word/2010/wordml" xmlns:w15="http://schemas.microsoft.com/office/word/2012/wordml" xmlns:w16cei="http://schemas.microsoft.com/office/word/2026/wordml/cei" xmlns:w16cex="http://schemas.microsoft.com/office/word/2018/wordml/cex" xmlns:w16cid="http://schemas.microsoft.com/office/word/2016/wordml/cid" xmlns:w16="http://schemas.microsoft.com/office/word/2018/wordml" xmlns:w16du="http://schemas.microsoft.com/office/word/2023/wordml/word16du" xmlns:w16sdtdh="http://schemas.microsoft.com/office/word/2020/wordml/sdtdatahash" xmlns:w16sdtfl="http://schemas.microsoft.com/office/word/2024/wordml/sdtformatlock" xmlns:w16se="http://schemas.microsoft.com/office/word/2015/wordml/symex" xmlns:wpg="http://schemas.microsoft.com/office/word/2010/wordprocessingGroup" xmlns:wpi="http://schemas.microsoft.com/office/word/2010/wordprocessingInk" xmlns:wne="http://schemas.microsoft.com/office/word/2006/wordml" xmlns:wps="http://schemas.microsoft.com/office/word/2010/wordprocessingShape" mc:Ignorable="w14 w15 w16se w16cid w16 w16cex w16sdtdh w16sdtfl w16du wp14">
   <w:abstractNum w:abstractNumId="0" w15:restartNumberingAfterBreak="0">
     <w:nsid w:val="1B316F14"/>
     <w:multiLevelType w:val="multilevel"/>
@@ -4974,7 +5411,7 @@
 </file>
 
 <file path=word/glossary/document.xml><?xml version="1.0" encoding="utf-8"?>
-<w:glossaryDocument xmlns:wpc="http://schemas.microsoft.com/office/word/2010/wordprocessingCanvas" xmlns:cx="http://schemas.microsoft.com/office/drawing/2014/chartex" xmlns:cx1="http://schemas.microsoft.com/office/drawing/2015/9/8/chartex" xmlns:cx2="http://schemas.microsoft.com/office/drawing/2015/10/21/chartex" xmlns:cx3="http://schemas.microsoft.com/office/drawing/2016/5/9/chartex" xmlns:cx4="http://schemas.microsoft.com/office/drawing/2016/5/10/chartex" xmlns:cx5="http://schemas.microsoft.com/office/drawing/2016/5/11/chartex" xmlns:cx6="http://schemas.microsoft.com/office/drawing/2016/5/12/chartex" xmlns:cx7="http://schemas.microsoft.com/office/drawing/2016/5/13/chartex" xmlns:cx8="http://schemas.microsoft.com/office/drawing/2016/5/14/chartex" xmlns:mc="http://schemas.openxmlformats.org/markup-compatibility/2006" xmlns:aink="http://schemas.microsoft.com/office/drawing/2016/ink" xmlns:am3d="http://schemas.microsoft.com/office/drawing/2017/model3d" xmlns:o="urn:schemas-microsoft-com:office:office" xmlns:oel="http://schemas.microsoft.com/office/2019/extlst" xmlns:r="http://schemas.openxmlformats.org/officeDocument/2006/relationships" xmlns:m="http://schemas.openxmlformats.org/officeDocument/2006/math" xmlns:v="urn:schemas-microsoft-com:vml" xmlns:wp14="http://schemas.microsoft.com/office/word/2010/wordprocessingDrawing" xmlns:wp="http://schemas.openxmlformats.org/drawingml/2006/wordprocessingDrawing" xmlns:w10="urn:schemas-microsoft-com:office:word" xmlns:w="http://schemas.openxmlformats.org/wordprocessingml/2006/main" xmlns:w14="http://schemas.microsoft.com/office/word/2010/wordml" xmlns:w15="http://schemas.microsoft.com/office/word/2012/wordml" xmlns:w16cex="http://schemas.microsoft.com/office/word/2018/wordml/cex" xmlns:w16cid="http://schemas.microsoft.com/office/word/2016/wordml/cid" xmlns:w16="http://schemas.microsoft.com/office/word/2018/wordml" xmlns:w16du="http://schemas.microsoft.com/office/word/2023/wordml/word16du" xmlns:w16sdtdh="http://schemas.microsoft.com/office/word/2020/wordml/sdtdatahash" xmlns:w16sdtfl="http://schemas.microsoft.com/office/word/2024/wordml/sdtformatlock" xmlns:w16se="http://schemas.microsoft.com/office/word/2015/wordml/symex" xmlns:wpg="http://schemas.microsoft.com/office/word/2010/wordprocessingGroup" xmlns:wpi="http://schemas.microsoft.com/office/word/2010/wordprocessingInk" xmlns:wne="http://schemas.microsoft.com/office/word/2006/wordml" xmlns:wps="http://schemas.microsoft.com/office/word/2010/wordprocessingShape" mc:Ignorable="w14 w15 w16se w16cid w16 w16cex w16sdtdh w16sdtfl w16du wp14">
+<w:glossaryDocument xmlns:wpc="http://schemas.microsoft.com/office/word/2010/wordprocessingCanvas" xmlns:cx="http://schemas.microsoft.com/office/drawing/2014/chartex" xmlns:cx1="http://schemas.microsoft.com/office/drawing/2015/9/8/chartex" xmlns:cx2="http://schemas.microsoft.com/office/drawing/2015/10/21/chartex" xmlns:cx3="http://schemas.microsoft.com/office/drawing/2016/5/9/chartex" xmlns:cx4="http://schemas.microsoft.com/office/drawing/2016/5/10/chartex" xmlns:cx5="http://schemas.microsoft.com/office/drawing/2016/5/11/chartex" xmlns:cx6="http://schemas.microsoft.com/office/drawing/2016/5/12/chartex" xmlns:cx7="http://schemas.microsoft.com/office/drawing/2016/5/13/chartex" xmlns:cx8="http://schemas.microsoft.com/office/drawing/2016/5/14/chartex" xmlns:mc="http://schemas.openxmlformats.org/markup-compatibility/2006" xmlns:aink="http://schemas.microsoft.com/office/drawing/2016/ink" xmlns:am3d="http://schemas.microsoft.com/office/drawing/2017/model3d" xmlns:o="urn:schemas-microsoft-com:office:office" xmlns:oel="http://schemas.microsoft.com/office/2019/extlst" xmlns:r="http://schemas.openxmlformats.org/officeDocument/2006/relationships" xmlns:m="http://schemas.openxmlformats.org/officeDocument/2006/math" xmlns:v="urn:schemas-microsoft-com:vml" xmlns:wp14="http://schemas.microsoft.com/office/word/2010/wordprocessingDrawing" xmlns:wp="http://schemas.openxmlformats.org/drawingml/2006/wordprocessingDrawing" xmlns:w10="urn:schemas-microsoft-com:office:word" xmlns:w="http://schemas.openxmlformats.org/wordprocessingml/2006/main" xmlns:w14="http://schemas.microsoft.com/office/word/2010/wordml" xmlns:w15="http://schemas.microsoft.com/office/word/2012/wordml" xmlns:w16cei="http://schemas.microsoft.com/office/word/2026/wordml/cei" xmlns:w16cex="http://schemas.microsoft.com/office/word/2018/wordml/cex" xmlns:w16cid="http://schemas.microsoft.com/office/word/2016/wordml/cid" xmlns:w16="http://schemas.microsoft.com/office/word/2018/wordml" xmlns:w16du="http://schemas.microsoft.com/office/word/2023/wordml/word16du" xmlns:w16sdtdh="http://schemas.microsoft.com/office/word/2020/wordml/sdtdatahash" xmlns:w16sdtfl="http://schemas.microsoft.com/office/word/2024/wordml/sdtformatlock" xmlns:w16se="http://schemas.microsoft.com/office/word/2015/wordml/symex" xmlns:wpg="http://schemas.microsoft.com/office/word/2010/wordprocessingGroup" xmlns:wpi="http://schemas.microsoft.com/office/word/2010/wordprocessingInk" xmlns:wne="http://schemas.microsoft.com/office/word/2006/wordml" xmlns:wps="http://schemas.microsoft.com/office/word/2010/wordprocessingShape" mc:Ignorable="w14 w15 w16se w16cid w16 w16cex w16sdtdh w16sdtfl w16du wp14">
   <w:docParts>
     <w:docPart>
       <w:docPartPr>
@@ -5268,8 +5705,10 @@
     <w:rsidRoot w:val="004B629E"/>
     <w:rsid w:val="000045D5"/>
     <w:rsid w:val="00005A40"/>
+    <w:rsid w:val="00026055"/>
     <w:rsid w:val="00046CD6"/>
     <w:rsid w:val="000868C9"/>
+    <w:rsid w:val="000916C0"/>
     <w:rsid w:val="000B36AD"/>
     <w:rsid w:val="000B7B2B"/>
     <w:rsid w:val="0011521F"/>
@@ -5336,6 +5775,7 @@
     <w:rsid w:val="00924ABD"/>
     <w:rsid w:val="0093601B"/>
     <w:rsid w:val="00964355"/>
+    <w:rsid w:val="00982C68"/>
     <w:rsid w:val="009B0A5C"/>
     <w:rsid w:val="009B1AFF"/>
     <w:rsid w:val="00A14182"/>
@@ -5379,6 +5819,7 @@
     <w:rsid w:val="00F04983"/>
     <w:rsid w:val="00F74FDD"/>
     <w:rsid w:val="00F82133"/>
+    <w:rsid w:val="00FA6521"/>
     <w:rsid w:val="00FD4CF4"/>
     <w:rsid w:val="00FE4E0F"/>
   </w:rsids>

</xml_diff>